<commit_message>
rules: add LR-058 to LR-063 — three-system architecture boundaries LENS-010
</commit_message>
<xml_diff>
--- a/lens-DOC-002_rules.docx
+++ b/lens-DOC-002_rules.docx
@@ -19,7 +19,104 @@
           <w:sz w:val="20"/>
           <w:szCs w:val="20"/>
         </w:rPr>
-        <w:t xml:space="preserve">Document: lens-DOC-002_rules  |  Updated: LENS-009  |  Total Rules: 57 (56 confirmed + 1 proposed)</w:t>
+        <w:t xml:space="preserve">Document: lens-DOC-002_rules  |  Updated: LENS-010  |  Total Rules: 63</w:t>
+      </w:r>
+    </w:p>
+    <w:p>
+      <w:r>
+        <w:rPr>
+          <w:b/>
+          <w:bCs/>
+          <w:color w:val="8B0000"/>
+          <w:sz w:val="20"/>
+          <w:szCs w:val="20"/>
+        </w:rPr>
+        <w:t xml:space="preserve">LENS-010 additions: LR-058(A), LR-059(A), LR-060(A), LR-061(A), LR-062(A), LR-063(A)</w:t>
+      </w:r>
+    </w:p>
+    <w:p>
+      <w:pPr>
+        <w:pBdr>
+          <w:bottom w:val="single" w:color="2E75B6" w:sz="4" w:space="1"/>
+        </w:pBdr>
+      </w:pPr>
+      <w:r>
+        <w:t xml:space="preserve"/>
+      </w:r>
+    </w:p>
+    <w:p>
+      <w:r>
+        <w:t xml:space="preserve"/>
+      </w:r>
+    </w:p>
+    <w:p>
+      <w:r>
+        <w:rPr>
+          <w:b/>
+          <w:bCs/>
+          <w:color w:val="8B0000"/>
+          <w:sz w:val="20"/>
+          <w:szCs w:val="20"/>
+        </w:rPr>
+        <w:t xml:space="preserve">CRITICAL NEW — Three-System Architecture Rules (added LENS-010):</w:t>
+      </w:r>
+    </w:p>
+    <w:p>
+      <w:r>
+        <w:t xml:space="preserve"/>
+      </w:r>
+    </w:p>
+    <w:p>
+      <w:r>
+        <w:rPr>
+          <w:b w:val="false"/>
+          <w:bCs w:val="false"/>
+          <w:color w:val="8B0000"/>
+          <w:sz w:val="20"/>
+          <w:szCs w:val="20"/>
+        </w:rPr>
+        <w:t xml:space="preserve">LR-058(A): System boundary checkpoint — never touch System 1 without explicit architectural justification.</w:t>
+      </w:r>
+    </w:p>
+    <w:p>
+      <w:r>
+        <w:rPr>
+          <w:b w:val="false"/>
+          <w:bCs w:val="false"/>
+          <w:color w:val="8B0000"/>
+          <w:sz w:val="20"/>
+          <w:szCs w:val="20"/>
+        </w:rPr>
+        <w:t xml:space="preserve">LR-059(A): System 1 is the unprotected canary. Never add injection-filtering to it.</w:t>
+      </w:r>
+    </w:p>
+    <w:p>
+      <w:r>
+        <w:rPr>
+          <w:b w:val="false"/>
+          <w:bCs w:val="false"/>
+          <w:color w:val="8B0000"/>
+          <w:sz w:val="20"/>
+          <w:szCs w:val="20"/>
+        </w:rPr>
+        <w:t xml:space="preserve">LR-061(A): Resilient scoring belongs to System 2 (S2-B), NOT to fetch_text.py.</w:t>
+      </w:r>
+    </w:p>
+    <w:p>
+      <w:r>
+        <w:rPr>
+          <w:b w:val="false"/>
+          <w:bCs w:val="false"/>
+          <w:color w:val="8B0000"/>
+          <w:sz w:val="20"/>
+          <w:szCs w:val="20"/>
+        </w:rPr>
+        <w:t xml:space="preserve">LR-063(A): "Where the problem appears" ≠ "where the fix belongs."</w:t>
+      </w:r>
+    </w:p>
+    <w:p>
+      <w:r>
+        <w:t xml:space="preserve"/>
       </w:r>
     </w:p>
     <w:p>
@@ -68,7 +165,7 @@
         </w:trPr>
         <w:tc>
           <w:tcPr>
-            <w:tcW w:type="dxa" w:w="NaNon"/>
+            <w:tcW w:type="dxa" w:w="1440"/>
             <w:tcBorders>
               <w:top w:val="single" w:color="CCCCCC" w:sz="1"/>
               <w:left w:val="single" w:color="CCCCCC" w:sz="1"/>
@@ -120,7 +217,36 @@
                 <w:sz w:val="18"/>
                 <w:szCs w:val="18"/>
               </w:rPr>
-              <w:t xml:space="default"/>
+              <w:t xml:space="preserve">Description</w:t>
+            </w:r>
+          </w:p>
+        </w:tc>
+        <w:tc>
+          <w:tcPr>
+            <w:tcW w:type="dxa" w:w="2160"/>
+            <w:tcBorders>
+              <w:top w:val="single" w:color="CCCCCC" w:sz="1"/>
+              <w:left w:val="single" w:color="CCCCCC" w:sz="1"/>
+              <w:bottom w:val="single" w:color="CCCCCC" w:sz="1"/>
+              <w:right w:val="single" w:color="CCCCCC" w:sz="1"/>
+            </w:tcBorders>
+            <w:shd w:fill="D5E8F0" w:val="clear"/>
+            <w:tcMar>
+              <w:top w:type="dxa" w:w="80"/>
+              <w:left w:type="dxa" w:w="120"/>
+              <w:bottom w:type="dxa" w:w="80"/>
+              <w:right w:type="dxa" w:w="120"/>
+            </w:tcMar>
+          </w:tcPr>
+          <w:p>
+            <w:r>
+              <w:rPr>
+                <w:b/>
+                <w:bCs/>
+                <w:sz w:val="18"/>
+                <w:szCs w:val="18"/>
+              </w:rPr>
+              <w:t xml:space="preserve">Added</w:t>
             </w:r>
           </w:p>
         </w:tc>
@@ -131,7 +257,7 @@
         </w:trPr>
         <w:tc>
           <w:tcPr>
-            <w:tcW w:type="dxa" w:w="NaNs."/>
+            <w:tcW w:type="dxa" w:w="1440"/>
             <w:tcBorders>
               <w:top w:val="single" w:color="CCCCCC" w:sz="1"/>
               <w:left w:val="single" w:color="CCCCCC" w:sz="1"/>
@@ -183,7 +309,36 @@
                 <w:sz w:val="18"/>
                 <w:szCs w:val="18"/>
               </w:rPr>
-              <w:t xml:space="default"/>
+              <w:t xml:space="preserve">Never hardcode API keys. Always use environment variables.</w:t>
+            </w:r>
+          </w:p>
+        </w:tc>
+        <w:tc>
+          <w:tcPr>
+            <w:tcW w:type="dxa" w:w="2160"/>
+            <w:tcBorders>
+              <w:top w:val="single" w:color="CCCCCC" w:sz="1"/>
+              <w:left w:val="single" w:color="CCCCCC" w:sz="1"/>
+              <w:bottom w:val="single" w:color="CCCCCC" w:sz="1"/>
+              <w:right w:val="single" w:color="CCCCCC" w:sz="1"/>
+            </w:tcBorders>
+            <w:shd w:fill="FFFFFF" w:val="clear"/>
+            <w:tcMar>
+              <w:top w:type="dxa" w:w="80"/>
+              <w:left w:type="dxa" w:w="120"/>
+              <w:bottom w:type="dxa" w:w="80"/>
+              <w:right w:type="dxa" w:w="120"/>
+            </w:tcMar>
+          </w:tcPr>
+          <w:p>
+            <w:r>
+              <w:rPr>
+                <w:b w:val="false"/>
+                <w:bCs w:val="false"/>
+                <w:sz w:val="18"/>
+                <w:szCs w:val="18"/>
+              </w:rPr>
+              <w:t xml:space="preserve">LENS-001</w:t>
             </w:r>
           </w:p>
         </w:tc>
@@ -194,7 +349,7 @@
         </w:trPr>
         <w:tc>
           <w:tcPr>
-            <w:tcW w:type="dxa" w:w="NaNs."/>
+            <w:tcW w:type="dxa" w:w="1440"/>
             <w:tcBorders>
               <w:top w:val="single" w:color="CCCCCC" w:sz="1"/>
               <w:left w:val="single" w:color="CCCCCC" w:sz="1"/>
@@ -246,7 +401,36 @@
                 <w:sz w:val="18"/>
                 <w:szCs w:val="18"/>
               </w:rPr>
-              <w:t xml:space="default"/>
+              <w:t xml:space="preserve">Every data source gets unique ID (SRC-XXX). Never use raw URLs.</w:t>
+            </w:r>
+          </w:p>
+        </w:tc>
+        <w:tc>
+          <w:tcPr>
+            <w:tcW w:type="dxa" w:w="2160"/>
+            <w:tcBorders>
+              <w:top w:val="single" w:color="CCCCCC" w:sz="1"/>
+              <w:left w:val="single" w:color="CCCCCC" w:sz="1"/>
+              <w:bottom w:val="single" w:color="CCCCCC" w:sz="1"/>
+              <w:right w:val="single" w:color="CCCCCC" w:sz="1"/>
+            </w:tcBorders>
+            <w:shd w:fill="FFFFFF" w:val="clear"/>
+            <w:tcMar>
+              <w:top w:type="dxa" w:w="80"/>
+              <w:left w:type="dxa" w:w="120"/>
+              <w:bottom w:type="dxa" w:w="80"/>
+              <w:right w:type="dxa" w:w="120"/>
+            </w:tcMar>
+          </w:tcPr>
+          <w:p>
+            <w:r>
+              <w:rPr>
+                <w:b w:val="false"/>
+                <w:bCs w:val="false"/>
+                <w:sz w:val="18"/>
+                <w:szCs w:val="18"/>
+              </w:rPr>
+              <w:t xml:space="preserve">LENS-001</w:t>
             </w:r>
           </w:p>
         </w:tc>
@@ -257,7 +441,7 @@
         </w:trPr>
         <w:tc>
           <w:tcPr>
-            <w:tcW w:type="dxa" w:w="NaNe."/>
+            <w:tcW w:type="dxa" w:w="1440"/>
             <w:tcBorders>
               <w:top w:val="single" w:color="CCCCCC" w:sz="1"/>
               <w:left w:val="single" w:color="CCCCCC" w:sz="1"/>
@@ -309,7 +493,36 @@
                 <w:sz w:val="18"/>
                 <w:szCs w:val="18"/>
               </w:rPr>
-              <w:t xml:space="default"/>
+              <w:t xml:space="preserve">Supabase for data storage. GitHub Actions for pipeline.</w:t>
+            </w:r>
+          </w:p>
+        </w:tc>
+        <w:tc>
+          <w:tcPr>
+            <w:tcW w:type="dxa" w:w="2160"/>
+            <w:tcBorders>
+              <w:top w:val="single" w:color="CCCCCC" w:sz="1"/>
+              <w:left w:val="single" w:color="CCCCCC" w:sz="1"/>
+              <w:bottom w:val="single" w:color="CCCCCC" w:sz="1"/>
+              <w:right w:val="single" w:color="CCCCCC" w:sz="1"/>
+            </w:tcBorders>
+            <w:shd w:fill="FFFFFF" w:val="clear"/>
+            <w:tcMar>
+              <w:top w:type="dxa" w:w="80"/>
+              <w:left w:type="dxa" w:w="120"/>
+              <w:bottom w:type="dxa" w:w="80"/>
+              <w:right w:type="dxa" w:w="120"/>
+            </w:tcMar>
+          </w:tcPr>
+          <w:p>
+            <w:r>
+              <w:rPr>
+                <w:b w:val="false"/>
+                <w:bCs w:val="false"/>
+                <w:sz w:val="18"/>
+                <w:szCs w:val="18"/>
+              </w:rPr>
+              <w:t xml:space="preserve">LENS-001</w:t>
             </w:r>
           </w:p>
         </w:tc>
@@ -320,7 +533,7 @@
         </w:trPr>
         <w:tc>
           <w:tcPr>
-            <w:tcW w:type="dxa" w:w="NaNy."/>
+            <w:tcW w:type="dxa" w:w="1440"/>
             <w:tcBorders>
               <w:top w:val="single" w:color="CCCCCC" w:sz="1"/>
               <w:left w:val="single" w:color="CCCCCC" w:sz="1"/>
@@ -372,7 +585,36 @@
                 <w:sz w:val="18"/>
                 <w:szCs w:val="18"/>
               </w:rPr>
-              <w:t xml:space="default"/>
+              <w:t xml:space="preserve">Python 3.11 minimum. All scripts in code/ directory.</w:t>
+            </w:r>
+          </w:p>
+        </w:tc>
+        <w:tc>
+          <w:tcPr>
+            <w:tcW w:type="dxa" w:w="2160"/>
+            <w:tcBorders>
+              <w:top w:val="single" w:color="CCCCCC" w:sz="1"/>
+              <w:left w:val="single" w:color="CCCCCC" w:sz="1"/>
+              <w:bottom w:val="single" w:color="CCCCCC" w:sz="1"/>
+              <w:right w:val="single" w:color="CCCCCC" w:sz="1"/>
+            </w:tcBorders>
+            <w:shd w:fill="FFFFFF" w:val="clear"/>
+            <w:tcMar>
+              <w:top w:type="dxa" w:w="80"/>
+              <w:left w:type="dxa" w:w="120"/>
+              <w:bottom w:type="dxa" w:w="80"/>
+              <w:right w:type="dxa" w:w="120"/>
+            </w:tcMar>
+          </w:tcPr>
+          <w:p>
+            <w:r>
+              <w:rPr>
+                <w:b w:val="false"/>
+                <w:bCs w:val="false"/>
+                <w:sz w:val="18"/>
+                <w:szCs w:val="18"/>
+              </w:rPr>
+              <w:t xml:space="preserve">LENS-001</w:t>
             </w:r>
           </w:p>
         </w:tc>
@@ -383,7 +625,7 @@
         </w:trPr>
         <w:tc>
           <w:tcPr>
-            <w:tcW w:type="dxa" w:w="NaNs."/>
+            <w:tcW w:type="dxa" w:w="1440"/>
             <w:tcBorders>
               <w:top w:val="single" w:color="CCCCCC" w:sz="1"/>
               <w:left w:val="single" w:color="CCCCCC" w:sz="1"/>
@@ -435,7 +677,128 @@
                 <w:sz w:val="18"/>
                 <w:szCs w:val="18"/>
               </w:rPr>
-              <w:t xml:space="default"/>
+              <w:t xml:space="preserve">One cron per script type. Collect and analyze are separate jobs.</w:t>
+            </w:r>
+          </w:p>
+        </w:tc>
+        <w:tc>
+          <w:tcPr>
+            <w:tcW w:type="dxa" w:w="2160"/>
+            <w:tcBorders>
+              <w:top w:val="single" w:color="CCCCCC" w:sz="1"/>
+              <w:left w:val="single" w:color="CCCCCC" w:sz="1"/>
+              <w:bottom w:val="single" w:color="CCCCCC" w:sz="1"/>
+              <w:right w:val="single" w:color="CCCCCC" w:sz="1"/>
+            </w:tcBorders>
+            <w:shd w:fill="FFFFFF" w:val="clear"/>
+            <w:tcMar>
+              <w:top w:type="dxa" w:w="80"/>
+              <w:left w:type="dxa" w:w="120"/>
+              <w:bottom w:type="dxa" w:w="80"/>
+              <w:right w:type="dxa" w:w="120"/>
+            </w:tcMar>
+          </w:tcPr>
+          <w:p>
+            <w:r>
+              <w:rPr>
+                <w:b w:val="false"/>
+                <w:bCs w:val="false"/>
+                <w:sz w:val="18"/>
+                <w:szCs w:val="18"/>
+              </w:rPr>
+              <w:t xml:space="preserve">LENS-001</w:t>
+            </w:r>
+          </w:p>
+        </w:tc>
+      </w:tr>
+      <w:tr>
+        <w:trPr>
+          <w:tblHeader w:val="false"/>
+        </w:trPr>
+        <w:tc>
+          <w:tcPr>
+            <w:tcW w:type="dxa" w:w="1440"/>
+            <w:tcBorders>
+              <w:top w:val="single" w:color="CCCCCC" w:sz="1"/>
+              <w:left w:val="single" w:color="CCCCCC" w:sz="1"/>
+              <w:bottom w:val="single" w:color="CCCCCC" w:sz="1"/>
+              <w:right w:val="single" w:color="CCCCCC" w:sz="1"/>
+            </w:tcBorders>
+            <w:shd w:fill="FFFFFF" w:val="clear"/>
+            <w:tcMar>
+              <w:top w:type="dxa" w:w="80"/>
+              <w:left w:type="dxa" w:w="120"/>
+              <w:bottom w:type="dxa" w:w="80"/>
+              <w:right w:type="dxa" w:w="120"/>
+            </w:tcMar>
+          </w:tcPr>
+          <w:p>
+            <w:r>
+              <w:rPr>
+                <w:b w:val="false"/>
+                <w:bCs w:val="false"/>
+                <w:sz w:val="18"/>
+                <w:szCs w:val="18"/>
+              </w:rPr>
+              <w:t xml:space="preserve">LR-058(A)</w:t>
+            </w:r>
+          </w:p>
+        </w:tc>
+        <w:tc>
+          <w:tcPr>
+            <w:tcW w:type="dxa" w:w="5760"/>
+            <w:tcBorders>
+              <w:top w:val="single" w:color="CCCCCC" w:sz="1"/>
+              <w:left w:val="single" w:color="CCCCCC" w:sz="1"/>
+              <w:bottom w:val="single" w:color="CCCCCC" w:sz="1"/>
+              <w:right w:val="single" w:color="CCCCCC" w:sz="1"/>
+            </w:tcBorders>
+            <w:shd w:fill="FFFFFF" w:val="clear"/>
+            <w:tcMar>
+              <w:top w:type="dxa" w:w="80"/>
+              <w:left w:type="dxa" w:w="120"/>
+              <w:bottom w:type="dxa" w:w="80"/>
+              <w:right w:type="dxa" w:w="120"/>
+            </w:tcMar>
+          </w:tcPr>
+          <w:p>
+            <w:r>
+              <w:rPr>
+                <w:b w:val="false"/>
+                <w:bCs w:val="false"/>
+                <w:sz w:val="18"/>
+                <w:szCs w:val="18"/>
+              </w:rPr>
+              <w:t xml:space="preserve">System boundary checkpoint. Before modifying any existing script, explicitly state which system it belongs to. System 1 scripts (fetch_text.py, analyze_lens_multi.py, lens_orchestrator.py) are FROZEN except for the single approved metadata tag addition. Any proposed change to a System 1 script requires explicit architectural justification before a single line is written. Checkpoint question: "Which system does this change belong to — and does the architecture authorize this system to receive this change?"</w:t>
+            </w:r>
+          </w:p>
+        </w:tc>
+        <w:tc>
+          <w:tcPr>
+            <w:tcW w:type="dxa" w:w="2160"/>
+            <w:tcBorders>
+              <w:top w:val="single" w:color="CCCCCC" w:sz="1"/>
+              <w:left w:val="single" w:color="CCCCCC" w:sz="1"/>
+              <w:bottom w:val="single" w:color="CCCCCC" w:sz="1"/>
+              <w:right w:val="single" w:color="CCCCCC" w:sz="1"/>
+            </w:tcBorders>
+            <w:shd w:fill="FFFFFF" w:val="clear"/>
+            <w:tcMar>
+              <w:top w:type="dxa" w:w="80"/>
+              <w:left w:type="dxa" w:w="120"/>
+              <w:bottom w:type="dxa" w:w="80"/>
+              <w:right w:type="dxa" w:w="120"/>
+            </w:tcMar>
+          </w:tcPr>
+          <w:p>
+            <w:r>
+              <w:rPr>
+                <w:b w:val="false"/>
+                <w:bCs w:val="false"/>
+                <w:sz w:val="18"/>
+                <w:szCs w:val="18"/>
+              </w:rPr>
+              <w:t xml:space="preserve">LENS-010</w:t>
             </w:r>
           </w:p>
         </w:tc>
@@ -477,7 +840,7 @@
         </w:trPr>
         <w:tc>
           <w:tcPr>
-            <w:tcW w:type="dxa" w:w="NaNon"/>
+            <w:tcW w:type="dxa" w:w="1440"/>
             <w:tcBorders>
               <w:top w:val="single" w:color="CCCCCC" w:sz="1"/>
               <w:left w:val="single" w:color="CCCCCC" w:sz="1"/>
@@ -529,7 +892,36 @@
                 <w:sz w:val="18"/>
                 <w:szCs w:val="18"/>
               </w:rPr>
-              <w:t xml:space="default"/>
+              <w:t xml:space="preserve">Description</w:t>
+            </w:r>
+          </w:p>
+        </w:tc>
+        <w:tc>
+          <w:tcPr>
+            <w:tcW w:type="dxa" w:w="2160"/>
+            <w:tcBorders>
+              <w:top w:val="single" w:color="CCCCCC" w:sz="1"/>
+              <w:left w:val="single" w:color="CCCCCC" w:sz="1"/>
+              <w:bottom w:val="single" w:color="CCCCCC" w:sz="1"/>
+              <w:right w:val="single" w:color="CCCCCC" w:sz="1"/>
+            </w:tcBorders>
+            <w:shd w:fill="D5E8F0" w:val="clear"/>
+            <w:tcMar>
+              <w:top w:type="dxa" w:w="80"/>
+              <w:left w:type="dxa" w:w="120"/>
+              <w:bottom w:type="dxa" w:w="80"/>
+              <w:right w:type="dxa" w:w="120"/>
+            </w:tcMar>
+          </w:tcPr>
+          <w:p>
+            <w:r>
+              <w:rPr>
+                <w:b/>
+                <w:bCs/>
+                <w:sz w:val="18"/>
+                <w:szCs w:val="18"/>
+              </w:rPr>
+              <w:t xml:space="preserve">Added</w:t>
             </w:r>
           </w:p>
         </w:tc>
@@ -540,7 +932,7 @@
         </w:trPr>
         <w:tc>
           <w:tcPr>
-            <w:tcW w:type="dxa" w:w="NaNt."/>
+            <w:tcW w:type="dxa" w:w="1440"/>
             <w:tcBorders>
               <w:top w:val="single" w:color="CCCCCC" w:sz="1"/>
               <w:left w:val="single" w:color="CCCCCC" w:sz="1"/>
@@ -592,7 +984,36 @@
                 <w:sz w:val="18"/>
                 <w:szCs w:val="18"/>
               </w:rPr>
-              <w:t xml:space="default"/>
+              <w:t xml:space="preserve">Read before edit. Always. Never modify what you have not read first.</w:t>
+            </w:r>
+          </w:p>
+        </w:tc>
+        <w:tc>
+          <w:tcPr>
+            <w:tcW w:type="dxa" w:w="2160"/>
+            <w:tcBorders>
+              <w:top w:val="single" w:color="CCCCCC" w:sz="1"/>
+              <w:left w:val="single" w:color="CCCCCC" w:sz="1"/>
+              <w:bottom w:val="single" w:color="CCCCCC" w:sz="1"/>
+              <w:right w:val="single" w:color="CCCCCC" w:sz="1"/>
+            </w:tcBorders>
+            <w:shd w:fill="FFFFFF" w:val="clear"/>
+            <w:tcMar>
+              <w:top w:type="dxa" w:w="80"/>
+              <w:left w:type="dxa" w:w="120"/>
+              <w:bottom w:type="dxa" w:w="80"/>
+              <w:right w:type="dxa" w:w="120"/>
+            </w:tcMar>
+          </w:tcPr>
+          <w:p>
+            <w:r>
+              <w:rPr>
+                <w:b w:val="false"/>
+                <w:bCs w:val="false"/>
+                <w:sz w:val="18"/>
+                <w:szCs w:val="18"/>
+              </w:rPr>
+              <w:t xml:space="preserve">LENS-001</w:t>
             </w:r>
           </w:p>
         </w:tc>
@@ -603,7 +1024,7 @@
         </w:trPr>
         <w:tc>
           <w:tcPr>
-            <w:tcW w:type="dxa" w:w="NaNs."/>
+            <w:tcW w:type="dxa" w:w="1440"/>
             <w:tcBorders>
               <w:top w:val="single" w:color="CCCCCC" w:sz="1"/>
               <w:left w:val="single" w:color="CCCCCC" w:sz="1"/>
@@ -655,7 +1076,36 @@
                 <w:sz w:val="18"/>
                 <w:szCs w:val="18"/>
               </w:rPr>
-              <w:t xml:space="default"/>
+              <w:t xml:space="preserve">Every session ends with updating transfer block. No exceptions.</w:t>
+            </w:r>
+          </w:p>
+        </w:tc>
+        <w:tc>
+          <w:tcPr>
+            <w:tcW w:type="dxa" w:w="2160"/>
+            <w:tcBorders>
+              <w:top w:val="single" w:color="CCCCCC" w:sz="1"/>
+              <w:left w:val="single" w:color="CCCCCC" w:sz="1"/>
+              <w:bottom w:val="single" w:color="CCCCCC" w:sz="1"/>
+              <w:right w:val="single" w:color="CCCCCC" w:sz="1"/>
+            </w:tcBorders>
+            <w:shd w:fill="FFFFFF" w:val="clear"/>
+            <w:tcMar>
+              <w:top w:type="dxa" w:w="80"/>
+              <w:left w:type="dxa" w:w="120"/>
+              <w:bottom w:type="dxa" w:w="80"/>
+              <w:right w:type="dxa" w:w="120"/>
+            </w:tcMar>
+          </w:tcPr>
+          <w:p>
+            <w:r>
+              <w:rPr>
+                <w:b w:val="false"/>
+                <w:bCs w:val="false"/>
+                <w:sz w:val="18"/>
+                <w:szCs w:val="18"/>
+              </w:rPr>
+              <w:t xml:space="preserve">LENS-001</w:t>
             </w:r>
           </w:p>
         </w:tc>
@@ -666,7 +1116,7 @@
         </w:trPr>
         <w:tc>
           <w:tcPr>
-            <w:tcW w:type="dxa" w:w="NaNd."/>
+            <w:tcW w:type="dxa" w:w="1440"/>
             <w:tcBorders>
               <w:top w:val="single" w:color="CCCCCC" w:sz="1"/>
               <w:left w:val="single" w:color="CCCCCC" w:sz="1"/>
@@ -718,7 +1168,36 @@
                 <w:sz w:val="18"/>
                 <w:szCs w:val="18"/>
               </w:rPr>
-              <w:t xml:space="default"/>
+              <w:t xml:space="preserve">Session naming: LENS-XXX_topic.docx. Sequential, never reused.</w:t>
+            </w:r>
+          </w:p>
+        </w:tc>
+        <w:tc>
+          <w:tcPr>
+            <w:tcW w:type="dxa" w:w="2160"/>
+            <w:tcBorders>
+              <w:top w:val="single" w:color="CCCCCC" w:sz="1"/>
+              <w:left w:val="single" w:color="CCCCCC" w:sz="1"/>
+              <w:bottom w:val="single" w:color="CCCCCC" w:sz="1"/>
+              <w:right w:val="single" w:color="CCCCCC" w:sz="1"/>
+            </w:tcBorders>
+            <w:shd w:fill="FFFFFF" w:val="clear"/>
+            <w:tcMar>
+              <w:top w:type="dxa" w:w="80"/>
+              <w:left w:type="dxa" w:w="120"/>
+              <w:bottom w:type="dxa" w:w="80"/>
+              <w:right w:type="dxa" w:w="120"/>
+            </w:tcMar>
+          </w:tcPr>
+          <w:p>
+            <w:r>
+              <w:rPr>
+                <w:b w:val="false"/>
+                <w:bCs w:val="false"/>
+                <w:sz w:val="18"/>
+                <w:szCs w:val="18"/>
+              </w:rPr>
+              <w:t xml:space="preserve">LENS-001</w:t>
             </w:r>
           </w:p>
         </w:tc>
@@ -729,7 +1208,7 @@
         </w:trPr>
         <w:tc>
           <w:tcPr>
-            <w:tcW w:type="dxa" w:w="NaNy."/>
+            <w:tcW w:type="dxa" w:w="1440"/>
             <w:tcBorders>
               <w:top w:val="single" w:color="CCCCCC" w:sz="1"/>
               <w:left w:val="single" w:color="CCCCCC" w:sz="1"/>
@@ -781,7 +1260,36 @@
                 <w:sz w:val="18"/>
                 <w:szCs w:val="18"/>
               </w:rPr>
-              <w:t xml:space="default"/>
+              <w:t xml:space="preserve">GNI is maintenance only. Lens is primary.</w:t>
+            </w:r>
+          </w:p>
+        </w:tc>
+        <w:tc>
+          <w:tcPr>
+            <w:tcW w:type="dxa" w:w="2160"/>
+            <w:tcBorders>
+              <w:top w:val="single" w:color="CCCCCC" w:sz="1"/>
+              <w:left w:val="single" w:color="CCCCCC" w:sz="1"/>
+              <w:bottom w:val="single" w:color="CCCCCC" w:sz="1"/>
+              <w:right w:val="single" w:color="CCCCCC" w:sz="1"/>
+            </w:tcBorders>
+            <w:shd w:fill="FFFFFF" w:val="clear"/>
+            <w:tcMar>
+              <w:top w:type="dxa" w:w="80"/>
+              <w:left w:type="dxa" w:w="120"/>
+              <w:bottom w:type="dxa" w:w="80"/>
+              <w:right w:type="dxa" w:w="120"/>
+            </w:tcMar>
+          </w:tcPr>
+          <w:p>
+            <w:r>
+              <w:rPr>
+                <w:b w:val="false"/>
+                <w:bCs w:val="false"/>
+                <w:sz w:val="18"/>
+                <w:szCs w:val="18"/>
+              </w:rPr>
+              <w:t xml:space="preserve">LENS-001</w:t>
             </w:r>
           </w:p>
         </w:tc>
@@ -792,7 +1300,7 @@
         </w:trPr>
         <w:tc>
           <w:tcPr>
-            <w:tcW w:type="dxa" w:w="NaNl."/>
+            <w:tcW w:type="dxa" w:w="1440"/>
             <w:tcBorders>
               <w:top w:val="single" w:color="CCCCCC" w:sz="1"/>
               <w:left w:val="single" w:color="CCCCCC" w:sz="1"/>
@@ -844,7 +1352,36 @@
                 <w:sz w:val="18"/>
                 <w:szCs w:val="18"/>
               </w:rPr>
-              <w:t xml:space="default"/>
+              <w:t xml:space="preserve">YAML files edited in VS Code ONLY. Never use shell.</w:t>
+            </w:r>
+          </w:p>
+        </w:tc>
+        <w:tc>
+          <w:tcPr>
+            <w:tcW w:type="dxa" w:w="2160"/>
+            <w:tcBorders>
+              <w:top w:val="single" w:color="CCCCCC" w:sz="1"/>
+              <w:left w:val="single" w:color="CCCCCC" w:sz="1"/>
+              <w:bottom w:val="single" w:color="CCCCCC" w:sz="1"/>
+              <w:right w:val="single" w:color="CCCCCC" w:sz="1"/>
+            </w:tcBorders>
+            <w:shd w:fill="FFFFFF" w:val="clear"/>
+            <w:tcMar>
+              <w:top w:type="dxa" w:w="80"/>
+              <w:left w:type="dxa" w:w="120"/>
+              <w:bottom w:type="dxa" w:w="80"/>
+              <w:right w:type="dxa" w:w="120"/>
+            </w:tcMar>
+          </w:tcPr>
+          <w:p>
+            <w:r>
+              <w:rPr>
+                <w:b w:val="false"/>
+                <w:bCs w:val="false"/>
+                <w:sz w:val="18"/>
+                <w:szCs w:val="18"/>
+              </w:rPr>
+              <w:t xml:space="preserve">LENS-001</w:t>
             </w:r>
           </w:p>
         </w:tc>
@@ -855,7 +1392,7 @@
         </w:trPr>
         <w:tc>
           <w:tcPr>
-            <w:tcW w:type="dxa" w:w="NaNe."/>
+            <w:tcW w:type="dxa" w:w="1440"/>
             <w:tcBorders>
               <w:top w:val="single" w:color="CCCCCC" w:sz="1"/>
               <w:left w:val="single" w:color="CCCCCC" w:sz="1"/>
@@ -907,7 +1444,36 @@
                 <w:sz w:val="18"/>
                 <w:szCs w:val="18"/>
               </w:rPr>
-              <w:t xml:space="default"/>
+              <w:t xml:space="preserve">Build safety checks BEFORE they are needed. Not after first failure.</w:t>
+            </w:r>
+          </w:p>
+        </w:tc>
+        <w:tc>
+          <w:tcPr>
+            <w:tcW w:type="dxa" w:w="2160"/>
+            <w:tcBorders>
+              <w:top w:val="single" w:color="CCCCCC" w:sz="1"/>
+              <w:left w:val="single" w:color="CCCCCC" w:sz="1"/>
+              <w:bottom w:val="single" w:color="CCCCCC" w:sz="1"/>
+              <w:right w:val="single" w:color="CCCCCC" w:sz="1"/>
+            </w:tcBorders>
+            <w:shd w:fill="FFFFFF" w:val="clear"/>
+            <w:tcMar>
+              <w:top w:type="dxa" w:w="80"/>
+              <w:left w:type="dxa" w:w="120"/>
+              <w:bottom w:type="dxa" w:w="80"/>
+              <w:right w:type="dxa" w:w="120"/>
+            </w:tcMar>
+          </w:tcPr>
+          <w:p>
+            <w:r>
+              <w:rPr>
+                <w:b w:val="false"/>
+                <w:bCs w:val="false"/>
+                <w:sz w:val="18"/>
+                <w:szCs w:val="18"/>
+              </w:rPr>
+              <w:t xml:space="preserve">LENS-001</w:t>
             </w:r>
           </w:p>
         </w:tc>
@@ -918,7 +1484,7 @@
         </w:trPr>
         <w:tc>
           <w:tcPr>
-            <w:tcW w:type="dxa" w:w="NaNe."/>
+            <w:tcW w:type="dxa" w:w="1440"/>
             <w:tcBorders>
               <w:top w:val="single" w:color="CCCCCC" w:sz="1"/>
               <w:left w:val="single" w:color="CCCCCC" w:sz="1"/>
@@ -970,7 +1536,36 @@
                 <w:sz w:val="18"/>
                 <w:szCs w:val="18"/>
               </w:rPr>
-              <w:t xml:space="default"/>
+              <w:t xml:space="preserve">3 clean cron runs before any new orchestrator-level build. Non-negotiable.</w:t>
+            </w:r>
+          </w:p>
+        </w:tc>
+        <w:tc>
+          <w:tcPr>
+            <w:tcW w:type="dxa" w:w="2160"/>
+            <w:tcBorders>
+              <w:top w:val="single" w:color="CCCCCC" w:sz="1"/>
+              <w:left w:val="single" w:color="CCCCCC" w:sz="1"/>
+              <w:bottom w:val="single" w:color="CCCCCC" w:sz="1"/>
+              <w:right w:val="single" w:color="CCCCCC" w:sz="1"/>
+            </w:tcBorders>
+            <w:shd w:fill="FFFFFF" w:val="clear"/>
+            <w:tcMar>
+              <w:top w:type="dxa" w:w="80"/>
+              <w:left w:type="dxa" w:w="120"/>
+              <w:bottom w:type="dxa" w:w="80"/>
+              <w:right w:type="dxa" w:w="120"/>
+            </w:tcMar>
+          </w:tcPr>
+          <w:p>
+            <w:r>
+              <w:rPr>
+                <w:b w:val="false"/>
+                <w:bCs w:val="false"/>
+                <w:sz w:val="18"/>
+                <w:szCs w:val="18"/>
+              </w:rPr>
+              <w:t xml:space="preserve">LENS-008</w:t>
             </w:r>
           </w:p>
         </w:tc>
@@ -981,7 +1576,7 @@
         </w:trPr>
         <w:tc>
           <w:tcPr>
-            <w:tcW w:type="dxa" w:w="NaNy."/>
+            <w:tcW w:type="dxa" w:w="1440"/>
             <w:tcBorders>
               <w:top w:val="single" w:color="CCCCCC" w:sz="1"/>
               <w:left w:val="single" w:color="CCCCCC" w:sz="1"/>
@@ -1033,7 +1628,772 @@
                 <w:sz w:val="18"/>
                 <w:szCs w:val="18"/>
               </w:rPr>
-              <w:t xml:space="default"/>
+              <w:t xml:space="preserve">Test on actual domain content. 3 tests minimum on real data before deploy.</w:t>
+            </w:r>
+          </w:p>
+        </w:tc>
+        <w:tc>
+          <w:tcPr>
+            <w:tcW w:type="dxa" w:w="2160"/>
+            <w:tcBorders>
+              <w:top w:val="single" w:color="CCCCCC" w:sz="1"/>
+              <w:left w:val="single" w:color="CCCCCC" w:sz="1"/>
+              <w:bottom w:val="single" w:color="CCCCCC" w:sz="1"/>
+              <w:right w:val="single" w:color="CCCCCC" w:sz="1"/>
+            </w:tcBorders>
+            <w:shd w:fill="FFFFFF" w:val="clear"/>
+            <w:tcMar>
+              <w:top w:type="dxa" w:w="80"/>
+              <w:left w:type="dxa" w:w="120"/>
+              <w:bottom w:type="dxa" w:w="80"/>
+              <w:right w:type="dxa" w:w="120"/>
+            </w:tcMar>
+          </w:tcPr>
+          <w:p>
+            <w:r>
+              <w:rPr>
+                <w:b w:val="false"/>
+                <w:bCs w:val="false"/>
+                <w:sz w:val="18"/>
+                <w:szCs w:val="18"/>
+              </w:rPr>
+              <w:t xml:space="preserve">LENS-001</w:t>
+            </w:r>
+          </w:p>
+        </w:tc>
+      </w:tr>
+      <w:tr>
+        <w:trPr>
+          <w:tblHeader w:val="false"/>
+        </w:trPr>
+        <w:tc>
+          <w:tcPr>
+            <w:tcW w:type="dxa" w:w="1440"/>
+            <w:tcBorders>
+              <w:top w:val="single" w:color="CCCCCC" w:sz="1"/>
+              <w:left w:val="single" w:color="CCCCCC" w:sz="1"/>
+              <w:bottom w:val="single" w:color="CCCCCC" w:sz="1"/>
+              <w:right w:val="single" w:color="CCCCCC" w:sz="1"/>
+            </w:tcBorders>
+            <w:shd w:fill="FFFFFF" w:val="clear"/>
+            <w:tcMar>
+              <w:top w:type="dxa" w:w="80"/>
+              <w:left w:type="dxa" w:w="120"/>
+              <w:bottom w:type="dxa" w:w="80"/>
+              <w:right w:type="dxa" w:w="120"/>
+            </w:tcMar>
+          </w:tcPr>
+          <w:p>
+            <w:r>
+              <w:rPr>
+                <w:b w:val="false"/>
+                <w:bCs w:val="false"/>
+                <w:sz w:val="18"/>
+                <w:szCs w:val="18"/>
+              </w:rPr>
+              <w:t xml:space="preserve">LR-050(P)</w:t>
+            </w:r>
+          </w:p>
+        </w:tc>
+        <w:tc>
+          <w:tcPr>
+            <w:tcW w:type="dxa" w:w="5760"/>
+            <w:tcBorders>
+              <w:top w:val="single" w:color="CCCCCC" w:sz="1"/>
+              <w:left w:val="single" w:color="CCCCCC" w:sz="1"/>
+              <w:bottom w:val="single" w:color="CCCCCC" w:sz="1"/>
+              <w:right w:val="single" w:color="CCCCCC" w:sz="1"/>
+            </w:tcBorders>
+            <w:shd w:fill="FFFFFF" w:val="clear"/>
+            <w:tcMar>
+              <w:top w:type="dxa" w:w="80"/>
+              <w:left w:type="dxa" w:w="120"/>
+              <w:bottom w:type="dxa" w:w="80"/>
+              <w:right w:type="dxa" w:w="120"/>
+            </w:tcMar>
+          </w:tcPr>
+          <w:p>
+            <w:r>
+              <w:rPr>
+                <w:b w:val="false"/>
+                <w:bCs w:val="false"/>
+                <w:sz w:val="18"/>
+                <w:szCs w:val="18"/>
+              </w:rPr>
+              <w:t xml:space="preserve">Remove dead code when patching. Never leave duplicate functions.</w:t>
+            </w:r>
+          </w:p>
+        </w:tc>
+        <w:tc>
+          <w:tcPr>
+            <w:tcW w:type="dxa" w:w="2160"/>
+            <w:tcBorders>
+              <w:top w:val="single" w:color="CCCCCC" w:sz="1"/>
+              <w:left w:val="single" w:color="CCCCCC" w:sz="1"/>
+              <w:bottom w:val="single" w:color="CCCCCC" w:sz="1"/>
+              <w:right w:val="single" w:color="CCCCCC" w:sz="1"/>
+            </w:tcBorders>
+            <w:shd w:fill="FFFFFF" w:val="clear"/>
+            <w:tcMar>
+              <w:top w:type="dxa" w:w="80"/>
+              <w:left w:type="dxa" w:w="120"/>
+              <w:bottom w:type="dxa" w:w="80"/>
+              <w:right w:type="dxa" w:w="120"/>
+            </w:tcMar>
+          </w:tcPr>
+          <w:p>
+            <w:r>
+              <w:rPr>
+                <w:b w:val="false"/>
+                <w:bCs w:val="false"/>
+                <w:sz w:val="18"/>
+                <w:szCs w:val="18"/>
+              </w:rPr>
+              <w:t xml:space="preserve">LENS-007</w:t>
+            </w:r>
+          </w:p>
+        </w:tc>
+      </w:tr>
+      <w:tr>
+        <w:trPr>
+          <w:tblHeader w:val="false"/>
+        </w:trPr>
+        <w:tc>
+          <w:tcPr>
+            <w:tcW w:type="dxa" w:w="1440"/>
+            <w:tcBorders>
+              <w:top w:val="single" w:color="CCCCCC" w:sz="1"/>
+              <w:left w:val="single" w:color="CCCCCC" w:sz="1"/>
+              <w:bottom w:val="single" w:color="CCCCCC" w:sz="1"/>
+              <w:right w:val="single" w:color="CCCCCC" w:sz="1"/>
+            </w:tcBorders>
+            <w:shd w:fill="FFFFFF" w:val="clear"/>
+            <w:tcMar>
+              <w:top w:type="dxa" w:w="80"/>
+              <w:left w:type="dxa" w:w="120"/>
+              <w:bottom w:type="dxa" w:w="80"/>
+              <w:right w:type="dxa" w:w="120"/>
+            </w:tcMar>
+          </w:tcPr>
+          <w:p>
+            <w:r>
+              <w:rPr>
+                <w:b w:val="false"/>
+                <w:bCs w:val="false"/>
+                <w:sz w:val="18"/>
+                <w:szCs w:val="18"/>
+              </w:rPr>
+              <w:t xml:space="preserve">LR-051(P)</w:t>
+            </w:r>
+          </w:p>
+        </w:tc>
+        <w:tc>
+          <w:tcPr>
+            <w:tcW w:type="dxa" w:w="5760"/>
+            <w:tcBorders>
+              <w:top w:val="single" w:color="CCCCCC" w:sz="1"/>
+              <w:left w:val="single" w:color="CCCCCC" w:sz="1"/>
+              <w:bottom w:val="single" w:color="CCCCCC" w:sz="1"/>
+              <w:right w:val="single" w:color="CCCCCC" w:sz="1"/>
+            </w:tcBorders>
+            <w:shd w:fill="FFFFFF" w:val="clear"/>
+            <w:tcMar>
+              <w:top w:type="dxa" w:w="80"/>
+              <w:left w:type="dxa" w:w="120"/>
+              <w:bottom w:type="dxa" w:w="80"/>
+              <w:right w:type="dxa" w:w="120"/>
+            </w:tcMar>
+          </w:tcPr>
+          <w:p>
+            <w:r>
+              <w:rPr>
+                <w:b w:val="false"/>
+                <w:bCs w:val="false"/>
+                <w:sz w:val="18"/>
+                <w:szCs w:val="18"/>
+              </w:rPr>
+              <w:t xml:space="preserve">Requirements.txt must be tested on clean environment. Local installs hide deps.</w:t>
+            </w:r>
+          </w:p>
+        </w:tc>
+        <w:tc>
+          <w:tcPr>
+            <w:tcW w:type="dxa" w:w="2160"/>
+            <w:tcBorders>
+              <w:top w:val="single" w:color="CCCCCC" w:sz="1"/>
+              <w:left w:val="single" w:color="CCCCCC" w:sz="1"/>
+              <w:bottom w:val="single" w:color="CCCCCC" w:sz="1"/>
+              <w:right w:val="single" w:color="CCCCCC" w:sz="1"/>
+            </w:tcBorders>
+            <w:shd w:fill="FFFFFF" w:val="clear"/>
+            <w:tcMar>
+              <w:top w:type="dxa" w:w="80"/>
+              <w:left w:type="dxa" w:w="120"/>
+              <w:bottom w:type="dxa" w:w="80"/>
+              <w:right w:type="dxa" w:w="120"/>
+            </w:tcMar>
+          </w:tcPr>
+          <w:p>
+            <w:r>
+              <w:rPr>
+                <w:b w:val="false"/>
+                <w:bCs w:val="false"/>
+                <w:sz w:val="18"/>
+                <w:szCs w:val="18"/>
+              </w:rPr>
+              <w:t xml:space="preserve">LENS-007</w:t>
+            </w:r>
+          </w:p>
+        </w:tc>
+      </w:tr>
+      <w:tr>
+        <w:trPr>
+          <w:tblHeader w:val="false"/>
+        </w:trPr>
+        <w:tc>
+          <w:tcPr>
+            <w:tcW w:type="dxa" w:w="1440"/>
+            <w:tcBorders>
+              <w:top w:val="single" w:color="CCCCCC" w:sz="1"/>
+              <w:left w:val="single" w:color="CCCCCC" w:sz="1"/>
+              <w:bottom w:val="single" w:color="CCCCCC" w:sz="1"/>
+              <w:right w:val="single" w:color="CCCCCC" w:sz="1"/>
+            </w:tcBorders>
+            <w:shd w:fill="FFFFFF" w:val="clear"/>
+            <w:tcMar>
+              <w:top w:type="dxa" w:w="80"/>
+              <w:left w:type="dxa" w:w="120"/>
+              <w:bottom w:type="dxa" w:w="80"/>
+              <w:right w:type="dxa" w:w="120"/>
+            </w:tcMar>
+          </w:tcPr>
+          <w:p>
+            <w:r>
+              <w:rPr>
+                <w:b w:val="false"/>
+                <w:bCs w:val="false"/>
+                <w:sz w:val="18"/>
+                <w:szCs w:val="18"/>
+              </w:rPr>
+              <w:t xml:space="preserve">LR-052(P)</w:t>
+            </w:r>
+          </w:p>
+        </w:tc>
+        <w:tc>
+          <w:tcPr>
+            <w:tcW w:type="dxa" w:w="5760"/>
+            <w:tcBorders>
+              <w:top w:val="single" w:color="CCCCCC" w:sz="1"/>
+              <w:left w:val="single" w:color="CCCCCC" w:sz="1"/>
+              <w:bottom w:val="single" w:color="CCCCCC" w:sz="1"/>
+              <w:right w:val="single" w:color="CCCCCC" w:sz="1"/>
+            </w:tcBorders>
+            <w:shd w:fill="FFFFFF" w:val="clear"/>
+            <w:tcMar>
+              <w:top w:type="dxa" w:w="80"/>
+              <w:left w:type="dxa" w:w="120"/>
+              <w:bottom w:type="dxa" w:w="80"/>
+              <w:right w:type="dxa" w:w="120"/>
+            </w:tcMar>
+          </w:tcPr>
+          <w:p>
+            <w:r>
+              <w:rPr>
+                <w:b w:val="false"/>
+                <w:bCs w:val="false"/>
+                <w:sz w:val="18"/>
+                <w:szCs w:val="18"/>
+              </w:rPr>
+              <w:t xml:space="preserve">Parallel workers &gt; sequential. Max 10 workers, 8s timeout per source.</w:t>
+            </w:r>
+          </w:p>
+        </w:tc>
+        <w:tc>
+          <w:tcPr>
+            <w:tcW w:type="dxa" w:w="2160"/>
+            <w:tcBorders>
+              <w:top w:val="single" w:color="CCCCCC" w:sz="1"/>
+              <w:left w:val="single" w:color="CCCCCC" w:sz="1"/>
+              <w:bottom w:val="single" w:color="CCCCCC" w:sz="1"/>
+              <w:right w:val="single" w:color="CCCCCC" w:sz="1"/>
+            </w:tcBorders>
+            <w:shd w:fill="FFFFFF" w:val="clear"/>
+            <w:tcMar>
+              <w:top w:type="dxa" w:w="80"/>
+              <w:left w:type="dxa" w:w="120"/>
+              <w:bottom w:type="dxa" w:w="80"/>
+              <w:right w:type="dxa" w:w="120"/>
+            </w:tcMar>
+          </w:tcPr>
+          <w:p>
+            <w:r>
+              <w:rPr>
+                <w:b w:val="false"/>
+                <w:bCs w:val="false"/>
+                <w:sz w:val="18"/>
+                <w:szCs w:val="18"/>
+              </w:rPr>
+              <w:t xml:space="preserve">LENS-007</w:t>
+            </w:r>
+          </w:p>
+        </w:tc>
+      </w:tr>
+      <w:tr>
+        <w:trPr>
+          <w:tblHeader w:val="false"/>
+        </w:trPr>
+        <w:tc>
+          <w:tcPr>
+            <w:tcW w:type="dxa" w:w="1440"/>
+            <w:tcBorders>
+              <w:top w:val="single" w:color="CCCCCC" w:sz="1"/>
+              <w:left w:val="single" w:color="CCCCCC" w:sz="1"/>
+              <w:bottom w:val="single" w:color="CCCCCC" w:sz="1"/>
+              <w:right w:val="single" w:color="CCCCCC" w:sz="1"/>
+            </w:tcBorders>
+            <w:shd w:fill="FFFFFF" w:val="clear"/>
+            <w:tcMar>
+              <w:top w:type="dxa" w:w="80"/>
+              <w:left w:type="dxa" w:w="120"/>
+              <w:bottom w:type="dxa" w:w="80"/>
+              <w:right w:type="dxa" w:w="120"/>
+            </w:tcMar>
+          </w:tcPr>
+          <w:p>
+            <w:r>
+              <w:rPr>
+                <w:b w:val="false"/>
+                <w:bCs w:val="false"/>
+                <w:sz w:val="18"/>
+                <w:szCs w:val="18"/>
+              </w:rPr>
+              <w:t xml:space="preserve">LR-053(P)</w:t>
+            </w:r>
+          </w:p>
+        </w:tc>
+        <w:tc>
+          <w:tcPr>
+            <w:tcW w:type="dxa" w:w="5760"/>
+            <w:tcBorders>
+              <w:top w:val="single" w:color="CCCCCC" w:sz="1"/>
+              <w:left w:val="single" w:color="CCCCCC" w:sz="1"/>
+              <w:bottom w:val="single" w:color="CCCCCC" w:sz="1"/>
+              <w:right w:val="single" w:color="CCCCCC" w:sz="1"/>
+            </w:tcBorders>
+            <w:shd w:fill="FFFFFF" w:val="clear"/>
+            <w:tcMar>
+              <w:top w:type="dxa" w:w="80"/>
+              <w:left w:type="dxa" w:w="120"/>
+              <w:bottom w:type="dxa" w:w="80"/>
+              <w:right w:type="dxa" w:w="120"/>
+            </w:tcMar>
+          </w:tcPr>
+          <w:p>
+            <w:r>
+              <w:rPr>
+                <w:b w:val="false"/>
+                <w:bCs w:val="false"/>
+                <w:sz w:val="18"/>
+                <w:szCs w:val="18"/>
+              </w:rPr>
+              <w:t xml:space="preserve">Philosophy gate runs first in orchestrator. No intelligence analysis without it.</w:t>
+            </w:r>
+          </w:p>
+        </w:tc>
+        <w:tc>
+          <w:tcPr>
+            <w:tcW w:type="dxa" w:w="2160"/>
+            <w:tcBorders>
+              <w:top w:val="single" w:color="CCCCCC" w:sz="1"/>
+              <w:left w:val="single" w:color="CCCCCC" w:sz="1"/>
+              <w:bottom w:val="single" w:color="CCCCCC" w:sz="1"/>
+              <w:right w:val="single" w:color="CCCCCC" w:sz="1"/>
+            </w:tcBorders>
+            <w:shd w:fill="FFFFFF" w:val="clear"/>
+            <w:tcMar>
+              <w:top w:type="dxa" w:w="80"/>
+              <w:left w:type="dxa" w:w="120"/>
+              <w:bottom w:type="dxa" w:w="80"/>
+              <w:right w:type="dxa" w:w="120"/>
+            </w:tcMar>
+          </w:tcPr>
+          <w:p>
+            <w:r>
+              <w:rPr>
+                <w:b w:val="false"/>
+                <w:bCs w:val="false"/>
+                <w:sz w:val="18"/>
+                <w:szCs w:val="18"/>
+              </w:rPr>
+              <w:t xml:space="preserve">LENS-008</w:t>
+            </w:r>
+          </w:p>
+        </w:tc>
+      </w:tr>
+      <w:tr>
+        <w:trPr>
+          <w:tblHeader w:val="false"/>
+        </w:trPr>
+        <w:tc>
+          <w:tcPr>
+            <w:tcW w:type="dxa" w:w="1440"/>
+            <w:tcBorders>
+              <w:top w:val="single" w:color="CCCCCC" w:sz="1"/>
+              <w:left w:val="single" w:color="CCCCCC" w:sz="1"/>
+              <w:bottom w:val="single" w:color="CCCCCC" w:sz="1"/>
+              <w:right w:val="single" w:color="CCCCCC" w:sz="1"/>
+            </w:tcBorders>
+            <w:shd w:fill="FFFFFF" w:val="clear"/>
+            <w:tcMar>
+              <w:top w:type="dxa" w:w="80"/>
+              <w:left w:type="dxa" w:w="120"/>
+              <w:bottom w:type="dxa" w:w="80"/>
+              <w:right w:type="dxa" w:w="120"/>
+            </w:tcMar>
+          </w:tcPr>
+          <w:p>
+            <w:r>
+              <w:rPr>
+                <w:b w:val="false"/>
+                <w:bCs w:val="false"/>
+                <w:sz w:val="18"/>
+                <w:szCs w:val="18"/>
+              </w:rPr>
+              <w:t xml:space="preserve">LR-054(P)</w:t>
+            </w:r>
+          </w:p>
+        </w:tc>
+        <w:tc>
+          <w:tcPr>
+            <w:tcW w:type="dxa" w:w="5760"/>
+            <w:tcBorders>
+              <w:top w:val="single" w:color="CCCCCC" w:sz="1"/>
+              <w:left w:val="single" w:color="CCCCCC" w:sz="1"/>
+              <w:bottom w:val="single" w:color="CCCCCC" w:sz="1"/>
+              <w:right w:val="single" w:color="CCCCCC" w:sz="1"/>
+            </w:tcBorders>
+            <w:shd w:fill="FFFFFF" w:val="clear"/>
+            <w:tcMar>
+              <w:top w:type="dxa" w:w="80"/>
+              <w:left w:type="dxa" w:w="120"/>
+              <w:bottom w:type="dxa" w:w="80"/>
+              <w:right w:type="dxa" w:w="120"/>
+            </w:tcMar>
+          </w:tcPr>
+          <w:p>
+            <w:r>
+              <w:rPr>
+                <w:b w:val="false"/>
+                <w:bCs w:val="false"/>
+                <w:sz w:val="18"/>
+                <w:szCs w:val="18"/>
+              </w:rPr>
+              <w:t xml:space="preserve">Checkpoint+resume: save state before any step that could hit time wall.</w:t>
+            </w:r>
+          </w:p>
+        </w:tc>
+        <w:tc>
+          <w:tcPr>
+            <w:tcW w:type="dxa" w:w="2160"/>
+            <w:tcBorders>
+              <w:top w:val="single" w:color="CCCCCC" w:sz="1"/>
+              <w:left w:val="single" w:color="CCCCCC" w:sz="1"/>
+              <w:bottom w:val="single" w:color="CCCCCC" w:sz="1"/>
+              <w:right w:val="single" w:color="CCCCCC" w:sz="1"/>
+            </w:tcBorders>
+            <w:shd w:fill="FFFFFF" w:val="clear"/>
+            <w:tcMar>
+              <w:top w:type="dxa" w:w="80"/>
+              <w:left w:type="dxa" w:w="120"/>
+              <w:bottom w:type="dxa" w:w="80"/>
+              <w:right w:type="dxa" w:w="120"/>
+            </w:tcMar>
+          </w:tcPr>
+          <w:p>
+            <w:r>
+              <w:rPr>
+                <w:b w:val="false"/>
+                <w:bCs w:val="false"/>
+                <w:sz w:val="18"/>
+                <w:szCs w:val="18"/>
+              </w:rPr>
+              <w:t xml:space="preserve">LENS-008</w:t>
+            </w:r>
+          </w:p>
+        </w:tc>
+      </w:tr>
+      <w:tr>
+        <w:trPr>
+          <w:tblHeader w:val="false"/>
+        </w:trPr>
+        <w:tc>
+          <w:tcPr>
+            <w:tcW w:type="dxa" w:w="1440"/>
+            <w:tcBorders>
+              <w:top w:val="single" w:color="CCCCCC" w:sz="1"/>
+              <w:left w:val="single" w:color="CCCCCC" w:sz="1"/>
+              <w:bottom w:val="single" w:color="CCCCCC" w:sz="1"/>
+              <w:right w:val="single" w:color="CCCCCC" w:sz="1"/>
+            </w:tcBorders>
+            <w:shd w:fill="FFFFFF" w:val="clear"/>
+            <w:tcMar>
+              <w:top w:type="dxa" w:w="80"/>
+              <w:left w:type="dxa" w:w="120"/>
+              <w:bottom w:type="dxa" w:w="80"/>
+              <w:right w:type="dxa" w:w="120"/>
+            </w:tcMar>
+          </w:tcPr>
+          <w:p>
+            <w:r>
+              <w:rPr>
+                <w:b w:val="false"/>
+                <w:bCs w:val="false"/>
+                <w:sz w:val="18"/>
+                <w:szCs w:val="18"/>
+              </w:rPr>
+              <w:t xml:space="preserve">LR-055(P)</w:t>
+            </w:r>
+          </w:p>
+        </w:tc>
+        <w:tc>
+          <w:tcPr>
+            <w:tcW w:type="dxa" w:w="5760"/>
+            <w:tcBorders>
+              <w:top w:val="single" w:color="CCCCCC" w:sz="1"/>
+              <w:left w:val="single" w:color="CCCCCC" w:sz="1"/>
+              <w:bottom w:val="single" w:color="CCCCCC" w:sz="1"/>
+              <w:right w:val="single" w:color="CCCCCC" w:sz="1"/>
+            </w:tcBorders>
+            <w:shd w:fill="FFFFFF" w:val="clear"/>
+            <w:tcMar>
+              <w:top w:type="dxa" w:w="80"/>
+              <w:left w:type="dxa" w:w="120"/>
+              <w:bottom w:type="dxa" w:w="80"/>
+              <w:right w:type="dxa" w:w="120"/>
+            </w:tcMar>
+          </w:tcPr>
+          <w:p>
+            <w:r>
+              <w:rPr>
+                <w:b w:val="false"/>
+                <w:bCs w:val="false"/>
+                <w:sz w:val="18"/>
+                <w:szCs w:val="18"/>
+              </w:rPr>
+              <w:t xml:space="preserve">Self-healing max 2 attempts. Escalate instead of infinite retry.</w:t>
+            </w:r>
+          </w:p>
+        </w:tc>
+        <w:tc>
+          <w:tcPr>
+            <w:tcW w:type="dxa" w:w="2160"/>
+            <w:tcBorders>
+              <w:top w:val="single" w:color="CCCCCC" w:sz="1"/>
+              <w:left w:val="single" w:color="CCCCCC" w:sz="1"/>
+              <w:bottom w:val="single" w:color="CCCCCC" w:sz="1"/>
+              <w:right w:val="single" w:color="CCCCCC" w:sz="1"/>
+            </w:tcBorders>
+            <w:shd w:fill="FFFFFF" w:val="clear"/>
+            <w:tcMar>
+              <w:top w:type="dxa" w:w="80"/>
+              <w:left w:type="dxa" w:w="120"/>
+              <w:bottom w:type="dxa" w:w="80"/>
+              <w:right w:type="dxa" w:w="120"/>
+            </w:tcMar>
+          </w:tcPr>
+          <w:p>
+            <w:r>
+              <w:rPr>
+                <w:b w:val="false"/>
+                <w:bCs w:val="false"/>
+                <w:sz w:val="18"/>
+                <w:szCs w:val="18"/>
+              </w:rPr>
+              <w:t xml:space="preserve">LENS-008</w:t>
+            </w:r>
+          </w:p>
+        </w:tc>
+      </w:tr>
+      <w:tr>
+        <w:trPr>
+          <w:tblHeader w:val="false"/>
+        </w:trPr>
+        <w:tc>
+          <w:tcPr>
+            <w:tcW w:type="dxa" w:w="1440"/>
+            <w:tcBorders>
+              <w:top w:val="single" w:color="CCCCCC" w:sz="1"/>
+              <w:left w:val="single" w:color="CCCCCC" w:sz="1"/>
+              <w:bottom w:val="single" w:color="CCCCCC" w:sz="1"/>
+              <w:right w:val="single" w:color="CCCCCC" w:sz="1"/>
+            </w:tcBorders>
+            <w:shd w:fill="FFFFFF" w:val="clear"/>
+            <w:tcMar>
+              <w:top w:type="dxa" w:w="80"/>
+              <w:left w:type="dxa" w:w="120"/>
+              <w:bottom w:type="dxa" w:w="80"/>
+              <w:right w:type="dxa" w:w="120"/>
+            </w:tcMar>
+          </w:tcPr>
+          <w:p>
+            <w:r>
+              <w:rPr>
+                <w:b w:val="false"/>
+                <w:bCs w:val="false"/>
+                <w:sz w:val="18"/>
+                <w:szCs w:val="18"/>
+              </w:rPr>
+              <w:t xml:space="preserve">LR-056(P)</w:t>
+            </w:r>
+          </w:p>
+        </w:tc>
+        <w:tc>
+          <w:tcPr>
+            <w:tcW w:type="dxa" w:w="5760"/>
+            <w:tcBorders>
+              <w:top w:val="single" w:color="CCCCCC" w:sz="1"/>
+              <w:left w:val="single" w:color="CCCCCC" w:sz="1"/>
+              <w:bottom w:val="single" w:color="CCCCCC" w:sz="1"/>
+              <w:right w:val="single" w:color="CCCCCC" w:sz="1"/>
+            </w:tcBorders>
+            <w:shd w:fill="FFFFFF" w:val="clear"/>
+            <w:tcMar>
+              <w:top w:type="dxa" w:w="80"/>
+              <w:left w:type="dxa" w:w="120"/>
+              <w:bottom w:type="dxa" w:w="80"/>
+              <w:right w:type="dxa" w:w="120"/>
+            </w:tcMar>
+          </w:tcPr>
+          <w:p>
+            <w:r>
+              <w:rPr>
+                <w:b w:val="false"/>
+                <w:bCs w:val="false"/>
+                <w:sz w:val="18"/>
+                <w:szCs w:val="18"/>
+              </w:rPr>
+              <w:t xml:space="preserve">Only pre-approved playbooks in self-healing. Never improvise in prod.</w:t>
+            </w:r>
+          </w:p>
+        </w:tc>
+        <w:tc>
+          <w:tcPr>
+            <w:tcW w:type="dxa" w:w="2160"/>
+            <w:tcBorders>
+              <w:top w:val="single" w:color="CCCCCC" w:sz="1"/>
+              <w:left w:val="single" w:color="CCCCCC" w:sz="1"/>
+              <w:bottom w:val="single" w:color="CCCCCC" w:sz="1"/>
+              <w:right w:val="single" w:color="CCCCCC" w:sz="1"/>
+            </w:tcBorders>
+            <w:shd w:fill="FFFFFF" w:val="clear"/>
+            <w:tcMar>
+              <w:top w:type="dxa" w:w="80"/>
+              <w:left w:type="dxa" w:w="120"/>
+              <w:bottom w:type="dxa" w:w="80"/>
+              <w:right w:type="dxa" w:w="120"/>
+            </w:tcMar>
+          </w:tcPr>
+          <w:p>
+            <w:r>
+              <w:rPr>
+                <w:b w:val="false"/>
+                <w:bCs w:val="false"/>
+                <w:sz w:val="18"/>
+                <w:szCs w:val="18"/>
+              </w:rPr>
+              <w:t xml:space="preserve">LENS-008</w:t>
+            </w:r>
+          </w:p>
+        </w:tc>
+      </w:tr>
+      <w:tr>
+        <w:trPr>
+          <w:tblHeader w:val="false"/>
+        </w:trPr>
+        <w:tc>
+          <w:tcPr>
+            <w:tcW w:type="dxa" w:w="1440"/>
+            <w:tcBorders>
+              <w:top w:val="single" w:color="CCCCCC" w:sz="1"/>
+              <w:left w:val="single" w:color="CCCCCC" w:sz="1"/>
+              <w:bottom w:val="single" w:color="CCCCCC" w:sz="1"/>
+              <w:right w:val="single" w:color="CCCCCC" w:sz="1"/>
+            </w:tcBorders>
+            <w:shd w:fill="FFFFFF" w:val="clear"/>
+            <w:tcMar>
+              <w:top w:type="dxa" w:w="80"/>
+              <w:left w:type="dxa" w:w="120"/>
+              <w:bottom w:type="dxa" w:w="80"/>
+              <w:right w:type="dxa" w:w="120"/>
+            </w:tcMar>
+          </w:tcPr>
+          <w:p>
+            <w:r>
+              <w:rPr>
+                <w:b w:val="false"/>
+                <w:bCs w:val="false"/>
+                <w:sz w:val="18"/>
+                <w:szCs w:val="18"/>
+              </w:rPr>
+              <w:t xml:space="preserve">LR-057(P)</w:t>
+            </w:r>
+          </w:p>
+        </w:tc>
+        <w:tc>
+          <w:tcPr>
+            <w:tcW w:type="dxa" w:w="5760"/>
+            <w:tcBorders>
+              <w:top w:val="single" w:color="CCCCCC" w:sz="1"/>
+              <w:left w:val="single" w:color="CCCCCC" w:sz="1"/>
+              <w:bottom w:val="single" w:color="CCCCCC" w:sz="1"/>
+              <w:right w:val="single" w:color="CCCCCC" w:sz="1"/>
+            </w:tcBorders>
+            <w:shd w:fill="FFFFFF" w:val="clear"/>
+            <w:tcMar>
+              <w:top w:type="dxa" w:w="80"/>
+              <w:left w:type="dxa" w:w="120"/>
+              <w:bottom w:type="dxa" w:w="80"/>
+              <w:right w:type="dxa" w:w="120"/>
+            </w:tcMar>
+          </w:tcPr>
+          <w:p>
+            <w:r>
+              <w:rPr>
+                <w:b w:val="false"/>
+                <w:bCs w:val="false"/>
+                <w:sz w:val="18"/>
+                <w:szCs w:val="18"/>
+              </w:rPr>
+              <w:t xml:space="preserve">Context limit prevention: begin close protocol at 80% context, not 100%.</w:t>
+            </w:r>
+          </w:p>
+        </w:tc>
+        <w:tc>
+          <w:tcPr>
+            <w:tcW w:type="dxa" w:w="2160"/>
+            <w:tcBorders>
+              <w:top w:val="single" w:color="CCCCCC" w:sz="1"/>
+              <w:left w:val="single" w:color="CCCCCC" w:sz="1"/>
+              <w:bottom w:val="single" w:color="CCCCCC" w:sz="1"/>
+              <w:right w:val="single" w:color="CCCCCC" w:sz="1"/>
+            </w:tcBorders>
+            <w:shd w:fill="FFFFFF" w:val="clear"/>
+            <w:tcMar>
+              <w:top w:type="dxa" w:w="80"/>
+              <w:left w:type="dxa" w:w="120"/>
+              <w:bottom w:type="dxa" w:w="80"/>
+              <w:right w:type="dxa" w:w="120"/>
+            </w:tcMar>
+          </w:tcPr>
+          <w:p>
+            <w:r>
+              <w:rPr>
+                <w:b w:val="false"/>
+                <w:bCs w:val="false"/>
+                <w:sz w:val="18"/>
+                <w:szCs w:val="18"/>
+              </w:rPr>
+              <w:t xml:space="preserve">LENS-009</w:t>
             </w:r>
           </w:p>
         </w:tc>
@@ -1075,7 +2435,7 @@
         </w:trPr>
         <w:tc>
           <w:tcPr>
-            <w:tcW w:type="dxa" w:w="NaNon"/>
+            <w:tcW w:type="dxa" w:w="1440"/>
             <w:tcBorders>
               <w:top w:val="single" w:color="CCCCCC" w:sz="1"/>
               <w:left w:val="single" w:color="CCCCCC" w:sz="1"/>
@@ -1127,7 +2487,36 @@
                 <w:sz w:val="18"/>
                 <w:szCs w:val="18"/>
               </w:rPr>
-              <w:t xml:space="default"/>
+              <w:t xml:space="preserve">Description</w:t>
+            </w:r>
+          </w:p>
+        </w:tc>
+        <w:tc>
+          <w:tcPr>
+            <w:tcW w:type="dxa" w:w="2160"/>
+            <w:tcBorders>
+              <w:top w:val="single" w:color="CCCCCC" w:sz="1"/>
+              <w:left w:val="single" w:color="CCCCCC" w:sz="1"/>
+              <w:bottom w:val="single" w:color="CCCCCC" w:sz="1"/>
+              <w:right w:val="single" w:color="CCCCCC" w:sz="1"/>
+            </w:tcBorders>
+            <w:shd w:fill="D5E8F0" w:val="clear"/>
+            <w:tcMar>
+              <w:top w:type="dxa" w:w="80"/>
+              <w:left w:type="dxa" w:w="120"/>
+              <w:bottom w:type="dxa" w:w="80"/>
+              <w:right w:type="dxa" w:w="120"/>
+            </w:tcMar>
+          </w:tcPr>
+          <w:p>
+            <w:r>
+              <w:rPr>
+                <w:b/>
+                <w:bCs/>
+                <w:sz w:val="18"/>
+                <w:szCs w:val="18"/>
+              </w:rPr>
+              <w:t xml:space="preserve">Added</w:t>
             </w:r>
           </w:p>
         </w:tc>
@@ -1138,7 +2527,7 @@
         </w:trPr>
         <w:tc>
           <w:tcPr>
-            <w:tcW w:type="dxa" w:w="NaNe."/>
+            <w:tcW w:type="dxa" w:w="1440"/>
             <w:tcBorders>
               <w:top w:val="single" w:color="CCCCCC" w:sz="1"/>
               <w:left w:val="single" w:color="CCCCCC" w:sz="1"/>
@@ -1190,7 +2579,36 @@
                 <w:sz w:val="18"/>
                 <w:szCs w:val="18"/>
               </w:rPr>
-              <w:t xml:space="default"/>
+              <w:t xml:space="preserve">Only truly public data. When in doubt — exclude.</w:t>
+            </w:r>
+          </w:p>
+        </w:tc>
+        <w:tc>
+          <w:tcPr>
+            <w:tcW w:type="dxa" w:w="2160"/>
+            <w:tcBorders>
+              <w:top w:val="single" w:color="CCCCCC" w:sz="1"/>
+              <w:left w:val="single" w:color="CCCCCC" w:sz="1"/>
+              <w:bottom w:val="single" w:color="CCCCCC" w:sz="1"/>
+              <w:right w:val="single" w:color="CCCCCC" w:sz="1"/>
+            </w:tcBorders>
+            <w:shd w:fill="FFFFFF" w:val="clear"/>
+            <w:tcMar>
+              <w:top w:type="dxa" w:w="80"/>
+              <w:left w:type="dxa" w:w="120"/>
+              <w:bottom w:type="dxa" w:w="80"/>
+              <w:right w:type="dxa" w:w="120"/>
+            </w:tcMar>
+          </w:tcPr>
+          <w:p>
+            <w:r>
+              <w:rPr>
+                <w:b w:val="false"/>
+                <w:bCs w:val="false"/>
+                <w:sz w:val="18"/>
+                <w:szCs w:val="18"/>
+              </w:rPr>
+              <w:t xml:space="preserve">LENS-001</w:t>
             </w:r>
           </w:p>
         </w:tc>
@@ -1201,7 +2619,7 @@
         </w:trPr>
         <w:tc>
           <w:tcPr>
-            <w:tcW w:type="dxa" w:w="NaNs."/>
+            <w:tcW w:type="dxa" w:w="1440"/>
             <w:tcBorders>
               <w:top w:val="single" w:color="CCCCCC" w:sz="1"/>
               <w:left w:val="single" w:color="CCCCCC" w:sz="1"/>
@@ -1253,7 +2671,36 @@
                 <w:sz w:val="18"/>
                 <w:szCs w:val="18"/>
               </w:rPr>
-              <w:t xml:space="default"/>
+              <w:t xml:space="preserve">Three-test gate: Newspaper test + Person test + Institution test. All must pass.</w:t>
+            </w:r>
+          </w:p>
+        </w:tc>
+        <w:tc>
+          <w:tcPr>
+            <w:tcW w:type="dxa" w:w="2160"/>
+            <w:tcBorders>
+              <w:top w:val="single" w:color="CCCCCC" w:sz="1"/>
+              <w:left w:val="single" w:color="CCCCCC" w:sz="1"/>
+              <w:bottom w:val="single" w:color="CCCCCC" w:sz="1"/>
+              <w:right w:val="single" w:color="CCCCCC" w:sz="1"/>
+            </w:tcBorders>
+            <w:shd w:fill="FFFFFF" w:val="clear"/>
+            <w:tcMar>
+              <w:top w:type="dxa" w:w="80"/>
+              <w:left w:type="dxa" w:w="120"/>
+              <w:bottom w:type="dxa" w:w="80"/>
+              <w:right w:type="dxa" w:w="120"/>
+            </w:tcMar>
+          </w:tcPr>
+          <w:p>
+            <w:r>
+              <w:rPr>
+                <w:b w:val="false"/>
+                <w:bCs w:val="false"/>
+                <w:sz w:val="18"/>
+                <w:szCs w:val="18"/>
+              </w:rPr>
+              <w:t xml:space="preserve">LENS-001</w:t>
             </w:r>
           </w:p>
         </w:tc>
@@ -1264,7 +2711,7 @@
         </w:trPr>
         <w:tc>
           <w:tcPr>
-            <w:tcW w:type="dxa" w:w="NaNd."/>
+            <w:tcW w:type="dxa" w:w="1440"/>
             <w:tcBorders>
               <w:top w:val="single" w:color="CCCCCC" w:sz="1"/>
               <w:left w:val="single" w:color="CCCCCC" w:sz="1"/>
@@ -1316,7 +2763,36 @@
                 <w:sz w:val="18"/>
                 <w:szCs w:val="18"/>
               </w:rPr>
-              <w:t xml:space="default"/>
+              <w:t xml:space="preserve">ETHICS.md updated before any new source type added.</w:t>
+            </w:r>
+          </w:p>
+        </w:tc>
+        <w:tc>
+          <w:tcPr>
+            <w:tcW w:type="dxa" w:w="2160"/>
+            <w:tcBorders>
+              <w:top w:val="single" w:color="CCCCCC" w:sz="1"/>
+              <w:left w:val="single" w:color="CCCCCC" w:sz="1"/>
+              <w:bottom w:val="single" w:color="CCCCCC" w:sz="1"/>
+              <w:right w:val="single" w:color="CCCCCC" w:sz="1"/>
+            </w:tcBorders>
+            <w:shd w:fill="FFFFFF" w:val="clear"/>
+            <w:tcMar>
+              <w:top w:type="dxa" w:w="80"/>
+              <w:left w:type="dxa" w:w="120"/>
+              <w:bottom w:type="dxa" w:w="80"/>
+              <w:right w:type="dxa" w:w="120"/>
+            </w:tcMar>
+          </w:tcPr>
+          <w:p>
+            <w:r>
+              <w:rPr>
+                <w:b w:val="false"/>
+                <w:bCs w:val="false"/>
+                <w:sz w:val="18"/>
+                <w:szCs w:val="18"/>
+              </w:rPr>
+              <w:t xml:space="preserve">LENS-001</w:t>
             </w:r>
           </w:p>
         </w:tc>
@@ -1327,7 +2803,7 @@
         </w:trPr>
         <w:tc>
           <w:tcPr>
-            <w:tcW w:type="dxa" w:w="NaNa."/>
+            <w:tcW w:type="dxa" w:w="1440"/>
             <w:tcBorders>
               <w:top w:val="single" w:color="CCCCCC" w:sz="1"/>
               <w:left w:val="single" w:color="CCCCCC" w:sz="1"/>
@@ -1379,7 +2855,36 @@
                 <w:sz w:val="18"/>
                 <w:szCs w:val="18"/>
               </w:rPr>
-              <w:t xml:space="default"/>
+              <w:t xml:space="preserve">No personal data. No private comms. No login-required data.</w:t>
+            </w:r>
+          </w:p>
+        </w:tc>
+        <w:tc>
+          <w:tcPr>
+            <w:tcW w:type="dxa" w:w="2160"/>
+            <w:tcBorders>
+              <w:top w:val="single" w:color="CCCCCC" w:sz="1"/>
+              <w:left w:val="single" w:color="CCCCCC" w:sz="1"/>
+              <w:bottom w:val="single" w:color="CCCCCC" w:sz="1"/>
+              <w:right w:val="single" w:color="CCCCCC" w:sz="1"/>
+            </w:tcBorders>
+            <w:shd w:fill="FFFFFF" w:val="clear"/>
+            <w:tcMar>
+              <w:top w:type="dxa" w:w="80"/>
+              <w:left w:type="dxa" w:w="120"/>
+              <w:bottom w:type="dxa" w:w="80"/>
+              <w:right w:type="dxa" w:w="120"/>
+            </w:tcMar>
+          </w:tcPr>
+          <w:p>
+            <w:r>
+              <w:rPr>
+                <w:b w:val="false"/>
+                <w:bCs w:val="false"/>
+                <w:sz w:val="18"/>
+                <w:szCs w:val="18"/>
+              </w:rPr>
+              <w:t xml:space="preserve">LENS-001</w:t>
             </w:r>
           </w:p>
         </w:tc>
@@ -1390,7 +2895,7 @@
         </w:trPr>
         <w:tc>
           <w:tcPr>
-            <w:tcW w:type="dxa" w:w="NaNr."/>
+            <w:tcW w:type="dxa" w:w="1440"/>
             <w:tcBorders>
               <w:top w:val="single" w:color="CCCCCC" w:sz="1"/>
               <w:left w:val="single" w:color="CCCCCC" w:sz="1"/>
@@ -1442,7 +2947,36 @@
                 <w:sz w:val="18"/>
                 <w:szCs w:val="18"/>
               </w:rPr>
-              <w:t xml:space="default"/>
+              <w:t xml:space="preserve">All sources cited. All methods documented. Reproducible by any researcher.</w:t>
+            </w:r>
+          </w:p>
+        </w:tc>
+        <w:tc>
+          <w:tcPr>
+            <w:tcW w:type="dxa" w:w="2160"/>
+            <w:tcBorders>
+              <w:top w:val="single" w:color="CCCCCC" w:sz="1"/>
+              <w:left w:val="single" w:color="CCCCCC" w:sz="1"/>
+              <w:bottom w:val="single" w:color="CCCCCC" w:sz="1"/>
+              <w:right w:val="single" w:color="CCCCCC" w:sz="1"/>
+            </w:tcBorders>
+            <w:shd w:fill="FFFFFF" w:val="clear"/>
+            <w:tcMar>
+              <w:top w:type="dxa" w:w="80"/>
+              <w:left w:type="dxa" w:w="120"/>
+              <w:bottom w:type="dxa" w:w="80"/>
+              <w:right w:type="dxa" w:w="120"/>
+            </w:tcMar>
+          </w:tcPr>
+          <w:p>
+            <w:r>
+              <w:rPr>
+                <w:b w:val="false"/>
+                <w:bCs w:val="false"/>
+                <w:sz w:val="18"/>
+                <w:szCs w:val="18"/>
+              </w:rPr>
+              <w:t xml:space="preserve">LENS-001</w:t>
             </w:r>
           </w:p>
         </w:tc>
@@ -1453,7 +2987,7 @@
         </w:trPr>
         <w:tc>
           <w:tcPr>
-            <w:tcW w:type="dxa" w:w="NaNt."/>
+            <w:tcW w:type="dxa" w:w="1440"/>
             <w:tcBorders>
               <w:top w:val="single" w:color="CCCCCC" w:sz="1"/>
               <w:left w:val="single" w:color="CCCCCC" w:sz="1"/>
@@ -1505,7 +3039,36 @@
                 <w:sz w:val="18"/>
                 <w:szCs w:val="18"/>
               </w:rPr>
-              <w:t xml:space="default"/>
+              <w:t xml:space="preserve">New injection pattern found → add to detector immediately, then document.</w:t>
+            </w:r>
+          </w:p>
+        </w:tc>
+        <w:tc>
+          <w:tcPr>
+            <w:tcW w:type="dxa" w:w="2160"/>
+            <w:tcBorders>
+              <w:top w:val="single" w:color="CCCCCC" w:sz="1"/>
+              <w:left w:val="single" w:color="CCCCCC" w:sz="1"/>
+              <w:bottom w:val="single" w:color="CCCCCC" w:sz="1"/>
+              <w:right w:val="single" w:color="CCCCCC" w:sz="1"/>
+            </w:tcBorders>
+            <w:shd w:fill="FFFFFF" w:val="clear"/>
+            <w:tcMar>
+              <w:top w:type="dxa" w:w="80"/>
+              <w:left w:type="dxa" w:w="120"/>
+              <w:bottom w:type="dxa" w:w="80"/>
+              <w:right w:type="dxa" w:w="120"/>
+            </w:tcMar>
+          </w:tcPr>
+          <w:p>
+            <w:r>
+              <w:rPr>
+                <w:b w:val="false"/>
+                <w:bCs w:val="false"/>
+                <w:sz w:val="18"/>
+                <w:szCs w:val="18"/>
+              </w:rPr>
+              <w:t xml:space="preserve">LENS-005</w:t>
             </w:r>
           </w:p>
         </w:tc>
@@ -1516,7 +3079,7 @@
         </w:trPr>
         <w:tc>
           <w:tcPr>
-            <w:tcW w:type="dxa" w:w="NaNd."/>
+            <w:tcW w:type="dxa" w:w="1440"/>
             <w:tcBorders>
               <w:top w:val="single" w:color="CCCCCC" w:sz="1"/>
               <w:left w:val="single" w:color="CCCCCC" w:sz="1"/>
@@ -1568,7 +3131,36 @@
                 <w:sz w:val="18"/>
                 <w:szCs w:val="18"/>
               </w:rPr>
-              <w:t xml:space="default"/>
+              <w:t xml:space="preserve">Bias-control direction: pro-democracy, anti-authoritarian. PHI-002 aligned.</w:t>
+            </w:r>
+          </w:p>
+        </w:tc>
+        <w:tc>
+          <w:tcPr>
+            <w:tcW w:type="dxa" w:w="2160"/>
+            <w:tcBorders>
+              <w:top w:val="single" w:color="CCCCCC" w:sz="1"/>
+              <w:left w:val="single" w:color="CCCCCC" w:sz="1"/>
+              <w:bottom w:val="single" w:color="CCCCCC" w:sz="1"/>
+              <w:right w:val="single" w:color="CCCCCC" w:sz="1"/>
+            </w:tcBorders>
+            <w:shd w:fill="FFFFFF" w:val="clear"/>
+            <w:tcMar>
+              <w:top w:type="dxa" w:w="80"/>
+              <w:left w:type="dxa" w:w="120"/>
+              <w:bottom w:type="dxa" w:w="80"/>
+              <w:right w:type="dxa" w:w="120"/>
+            </w:tcMar>
+          </w:tcPr>
+          <w:p>
+            <w:r>
+              <w:rPr>
+                <w:b w:val="false"/>
+                <w:bCs w:val="false"/>
+                <w:sz w:val="18"/>
+                <w:szCs w:val="18"/>
+              </w:rPr>
+              <w:t xml:space="preserve">LENS-004</w:t>
             </w:r>
           </w:p>
         </w:tc>
@@ -1610,7 +3202,7 @@
         </w:trPr>
         <w:tc>
           <w:tcPr>
-            <w:tcW w:type="dxa" w:w="NaNon"/>
+            <w:tcW w:type="dxa" w:w="1440"/>
             <w:tcBorders>
               <w:top w:val="single" w:color="CCCCCC" w:sz="1"/>
               <w:left w:val="single" w:color="CCCCCC" w:sz="1"/>
@@ -1662,7 +3254,36 @@
                 <w:sz w:val="18"/>
                 <w:szCs w:val="18"/>
               </w:rPr>
-              <w:t xml:space="default"/>
+              <w:t xml:space="preserve">Description</w:t>
+            </w:r>
+          </w:p>
+        </w:tc>
+        <w:tc>
+          <w:tcPr>
+            <w:tcW w:type="dxa" w:w="2160"/>
+            <w:tcBorders>
+              <w:top w:val="single" w:color="CCCCCC" w:sz="1"/>
+              <w:left w:val="single" w:color="CCCCCC" w:sz="1"/>
+              <w:bottom w:val="single" w:color="CCCCCC" w:sz="1"/>
+              <w:right w:val="single" w:color="CCCCCC" w:sz="1"/>
+            </w:tcBorders>
+            <w:shd w:fill="D5E8F0" w:val="clear"/>
+            <w:tcMar>
+              <w:top w:type="dxa" w:w="80"/>
+              <w:left w:type="dxa" w:w="120"/>
+              <w:bottom w:type="dxa" w:w="80"/>
+              <w:right w:type="dxa" w:w="120"/>
+            </w:tcMar>
+          </w:tcPr>
+          <w:p>
+            <w:r>
+              <w:rPr>
+                <w:b/>
+                <w:bCs/>
+                <w:sz w:val="18"/>
+                <w:szCs w:val="18"/>
+              </w:rPr>
+              <w:t xml:space="preserve">Added</w:t>
             </w:r>
           </w:p>
         </w:tc>
@@ -1673,7 +3294,7 @@
         </w:trPr>
         <w:tc>
           <w:tcPr>
-            <w:tcW w:type="dxa" w:w="NaNt."/>
+            <w:tcW w:type="dxa" w:w="1440"/>
             <w:tcBorders>
               <w:top w:val="single" w:color="CCCCCC" w:sz="1"/>
               <w:left w:val="single" w:color="CCCCCC" w:sz="1"/>
@@ -1725,7 +3346,36 @@
                 <w:sz w:val="18"/>
                 <w:szCs w:val="18"/>
               </w:rPr>
-              <w:t xml:space="default"/>
+              <w:t xml:space="preserve">Every article stored with: source_id, url, hash, collected_at, published_at.</w:t>
+            </w:r>
+          </w:p>
+        </w:tc>
+        <w:tc>
+          <w:tcPr>
+            <w:tcW w:type="dxa" w:w="2160"/>
+            <w:tcBorders>
+              <w:top w:val="single" w:color="CCCCCC" w:sz="1"/>
+              <w:left w:val="single" w:color="CCCCCC" w:sz="1"/>
+              <w:bottom w:val="single" w:color="CCCCCC" w:sz="1"/>
+              <w:right w:val="single" w:color="CCCCCC" w:sz="1"/>
+            </w:tcBorders>
+            <w:shd w:fill="FFFFFF" w:val="clear"/>
+            <w:tcMar>
+              <w:top w:type="dxa" w:w="80"/>
+              <w:left w:type="dxa" w:w="120"/>
+              <w:bottom w:type="dxa" w:w="80"/>
+              <w:right w:type="dxa" w:w="120"/>
+            </w:tcMar>
+          </w:tcPr>
+          <w:p>
+            <w:r>
+              <w:rPr>
+                <w:b w:val="false"/>
+                <w:bCs w:val="false"/>
+                <w:sz w:val="18"/>
+                <w:szCs w:val="18"/>
+              </w:rPr>
+              <w:t xml:space="preserve">LENS-001</w:t>
             </w:r>
           </w:p>
         </w:tc>
@@ -1736,7 +3386,7 @@
         </w:trPr>
         <w:tc>
           <w:tcPr>
-            <w:tcW w:type="dxa" w:w="NaNl."/>
+            <w:tcW w:type="dxa" w:w="1440"/>
             <w:tcBorders>
               <w:top w:val="single" w:color="CCCCCC" w:sz="1"/>
               <w:left w:val="single" w:color="CCCCCC" w:sz="1"/>
@@ -1788,7 +3438,36 @@
                 <w:sz w:val="18"/>
                 <w:szCs w:val="18"/>
               </w:rPr>
-              <w:t xml:space="default"/>
+              <w:t xml:space="preserve">Single source = hypothesis, not fact. Min 2-3 sources to confirm signal.</w:t>
+            </w:r>
+          </w:p>
+        </w:tc>
+        <w:tc>
+          <w:tcPr>
+            <w:tcW w:type="dxa" w:w="2160"/>
+            <w:tcBorders>
+              <w:top w:val="single" w:color="CCCCCC" w:sz="1"/>
+              <w:left w:val="single" w:color="CCCCCC" w:sz="1"/>
+              <w:bottom w:val="single" w:color="CCCCCC" w:sz="1"/>
+              <w:right w:val="single" w:color="CCCCCC" w:sz="1"/>
+            </w:tcBorders>
+            <w:shd w:fill="FFFFFF" w:val="clear"/>
+            <w:tcMar>
+              <w:top w:type="dxa" w:w="80"/>
+              <w:left w:type="dxa" w:w="120"/>
+              <w:bottom w:type="dxa" w:w="80"/>
+              <w:right w:type="dxa" w:w="120"/>
+            </w:tcMar>
+          </w:tcPr>
+          <w:p>
+            <w:r>
+              <w:rPr>
+                <w:b w:val="false"/>
+                <w:bCs w:val="false"/>
+                <w:sz w:val="18"/>
+                <w:szCs w:val="18"/>
+              </w:rPr>
+              <w:t xml:space="preserve">LENS-001</w:t>
             </w:r>
           </w:p>
         </w:tc>
@@ -1799,7 +3478,7 @@
         </w:trPr>
         <w:tc>
           <w:tcPr>
-            <w:tcW w:type="dxa" w:w="NaNn."/>
+            <w:tcW w:type="dxa" w:w="1440"/>
             <w:tcBorders>
               <w:top w:val="single" w:color="CCCCCC" w:sz="1"/>
               <w:left w:val="single" w:color="CCCCCC" w:sz="1"/>
@@ -1851,7 +3530,36 @@
                 <w:sz w:val="18"/>
                 <w:szCs w:val="18"/>
               </w:rPr>
-              <w:t xml:space="default"/>
+              <w:t xml:space="preserve">Raw data → verified data → analysis → output. Never skip verification.</w:t>
+            </w:r>
+          </w:p>
+        </w:tc>
+        <w:tc>
+          <w:tcPr>
+            <w:tcW w:type="dxa" w:w="2160"/>
+            <w:tcBorders>
+              <w:top w:val="single" w:color="CCCCCC" w:sz="1"/>
+              <w:left w:val="single" w:color="CCCCCC" w:sz="1"/>
+              <w:bottom w:val="single" w:color="CCCCCC" w:sz="1"/>
+              <w:right w:val="single" w:color="CCCCCC" w:sz="1"/>
+            </w:tcBorders>
+            <w:shd w:fill="FFFFFF" w:val="clear"/>
+            <w:tcMar>
+              <w:top w:type="dxa" w:w="80"/>
+              <w:left w:type="dxa" w:w="120"/>
+              <w:bottom w:type="dxa" w:w="80"/>
+              <w:right w:type="dxa" w:w="120"/>
+            </w:tcMar>
+          </w:tcPr>
+          <w:p>
+            <w:r>
+              <w:rPr>
+                <w:b w:val="false"/>
+                <w:bCs w:val="false"/>
+                <w:sz w:val="18"/>
+                <w:szCs w:val="18"/>
+              </w:rPr>
+              <w:t xml:space="preserve">LENS-001</w:t>
             </w:r>
           </w:p>
         </w:tc>
@@ -1862,7 +3570,7 @@
         </w:trPr>
         <w:tc>
           <w:tcPr>
-            <w:tcW w:type="dxa" w:w="NaNs."/>
+            <w:tcW w:type="dxa" w:w="1440"/>
             <w:tcBorders>
               <w:top w:val="single" w:color="CCCCCC" w:sz="1"/>
               <w:left w:val="single" w:color="CCCCCC" w:sz="1"/>
@@ -1914,7 +3622,36 @@
                 <w:sz w:val="18"/>
                 <w:szCs w:val="18"/>
               </w:rPr>
-              <w:t xml:space="default"/>
+              <w:t xml:space="preserve">url_hash enables dedup. Never store duplicate URLs.</w:t>
+            </w:r>
+          </w:p>
+        </w:tc>
+        <w:tc>
+          <w:tcPr>
+            <w:tcW w:type="dxa" w:w="2160"/>
+            <w:tcBorders>
+              <w:top w:val="single" w:color="CCCCCC" w:sz="1"/>
+              <w:left w:val="single" w:color="CCCCCC" w:sz="1"/>
+              <w:bottom w:val="single" w:color="CCCCCC" w:sz="1"/>
+              <w:right w:val="single" w:color="CCCCCC" w:sz="1"/>
+            </w:tcBorders>
+            <w:shd w:fill="FFFFFF" w:val="clear"/>
+            <w:tcMar>
+              <w:top w:type="dxa" w:w="80"/>
+              <w:left w:type="dxa" w:w="120"/>
+              <w:bottom w:type="dxa" w:w="80"/>
+              <w:right w:type="dxa" w:w="120"/>
+            </w:tcMar>
+          </w:tcPr>
+          <w:p>
+            <w:r>
+              <w:rPr>
+                <w:b w:val="false"/>
+                <w:bCs w:val="false"/>
+                <w:sz w:val="18"/>
+                <w:szCs w:val="18"/>
+              </w:rPr>
+              <w:t xml:space="preserve">LENS-003</w:t>
             </w:r>
           </w:p>
         </w:tc>
@@ -1925,7 +3662,7 @@
         </w:trPr>
         <w:tc>
           <w:tcPr>
-            <w:tcW w:type="dxa" w:w="NaNy."/>
+            <w:tcW w:type="dxa" w:w="1440"/>
             <w:tcBorders>
               <w:top w:val="single" w:color="CCCCCC" w:sz="1"/>
               <w:left w:val="single" w:color="CCCCCC" w:sz="1"/>
@@ -1977,7 +3714,36 @@
                 <w:sz w:val="18"/>
                 <w:szCs w:val="18"/>
               </w:rPr>
-              <w:t xml:space="default"/>
+              <w:t xml:space="preserve">System 1 significance scoring: coverage × recency × velocity. Local computation only. DO NOT modify this formula — it is the canary data. System 2 applies corrections on top.</w:t>
+            </w:r>
+          </w:p>
+        </w:tc>
+        <w:tc>
+          <w:tcPr>
+            <w:tcW w:type="dxa" w:w="2160"/>
+            <w:tcBorders>
+              <w:top w:val="single" w:color="CCCCCC" w:sz="1"/>
+              <w:left w:val="single" w:color="CCCCCC" w:sz="1"/>
+              <w:bottom w:val="single" w:color="CCCCCC" w:sz="1"/>
+              <w:right w:val="single" w:color="CCCCCC" w:sz="1"/>
+            </w:tcBorders>
+            <w:shd w:fill="FFFFFF" w:val="clear"/>
+            <w:tcMar>
+              <w:top w:type="dxa" w:w="80"/>
+              <w:left w:type="dxa" w:w="120"/>
+              <w:bottom w:type="dxa" w:w="80"/>
+              <w:right w:type="dxa" w:w="120"/>
+            </w:tcMar>
+          </w:tcPr>
+          <w:p>
+            <w:r>
+              <w:rPr>
+                <w:b w:val="false"/>
+                <w:bCs w:val="false"/>
+                <w:sz w:val="18"/>
+                <w:szCs w:val="18"/>
+              </w:rPr>
+              <w:t xml:space="preserve">LENS-005 / LENS-010</w:t>
             </w:r>
           </w:p>
         </w:tc>
@@ -1988,7 +3754,7 @@
         </w:trPr>
         <w:tc>
           <w:tcPr>
-            <w:tcW w:type="dxa" w:w="NaN3."/>
+            <w:tcW w:type="dxa" w:w="1440"/>
             <w:tcBorders>
               <w:top w:val="single" w:color="CCCCCC" w:sz="1"/>
               <w:left w:val="single" w:color="CCCCCC" w:sz="1"/>
@@ -2040,7 +3806,36 @@
                 <w:sz w:val="18"/>
                 <w:szCs w:val="18"/>
               </w:rPr>
-              <w:t xml:space="default"/>
+              <w:t xml:space="preserve">State sources always load first. Priority above Tier 1/2/3.</w:t>
+            </w:r>
+          </w:p>
+        </w:tc>
+        <w:tc>
+          <w:tcPr>
+            <w:tcW w:type="dxa" w:w="2160"/>
+            <w:tcBorders>
+              <w:top w:val="single" w:color="CCCCCC" w:sz="1"/>
+              <w:left w:val="single" w:color="CCCCCC" w:sz="1"/>
+              <w:bottom w:val="single" w:color="CCCCCC" w:sz="1"/>
+              <w:right w:val="single" w:color="CCCCCC" w:sz="1"/>
+            </w:tcBorders>
+            <w:shd w:fill="FFFFFF" w:val="clear"/>
+            <w:tcMar>
+              <w:top w:type="dxa" w:w="80"/>
+              <w:left w:type="dxa" w:w="120"/>
+              <w:bottom w:type="dxa" w:w="80"/>
+              <w:right w:type="dxa" w:w="120"/>
+            </w:tcMar>
+          </w:tcPr>
+          <w:p>
+            <w:r>
+              <w:rPr>
+                <w:b w:val="false"/>
+                <w:bCs w:val="false"/>
+                <w:sz w:val="18"/>
+                <w:szCs w:val="18"/>
+              </w:rPr>
+              <w:t xml:space="preserve">LENS-005</w:t>
             </w:r>
           </w:p>
         </w:tc>
@@ -2051,7 +3846,7 @@
         </w:trPr>
         <w:tc>
           <w:tcPr>
-            <w:tcW w:type="dxa" w:w="NaNt."/>
+            <w:tcW w:type="dxa" w:w="1440"/>
             <w:tcBorders>
               <w:top w:val="single" w:color="CCCCCC" w:sz="1"/>
               <w:left w:val="single" w:color="CCCCCC" w:sz="1"/>
@@ -2103,7 +3898,36 @@
                 <w:sz w:val="18"/>
                 <w:szCs w:val="18"/>
               </w:rPr>
-              <w:t xml:space="default"/>
+              <w:t xml:space="preserve">48h collection window minimum. Older articles lose recency weight.</w:t>
+            </w:r>
+          </w:p>
+        </w:tc>
+        <w:tc>
+          <w:tcPr>
+            <w:tcW w:type="dxa" w:w="2160"/>
+            <w:tcBorders>
+              <w:top w:val="single" w:color="CCCCCC" w:sz="1"/>
+              <w:left w:val="single" w:color="CCCCCC" w:sz="1"/>
+              <w:bottom w:val="single" w:color="CCCCCC" w:sz="1"/>
+              <w:right w:val="single" w:color="CCCCCC" w:sz="1"/>
+            </w:tcBorders>
+            <w:shd w:fill="FFFFFF" w:val="clear"/>
+            <w:tcMar>
+              <w:top w:type="dxa" w:w="80"/>
+              <w:left w:type="dxa" w:w="120"/>
+              <w:bottom w:type="dxa" w:w="80"/>
+              <w:right w:type="dxa" w:w="120"/>
+            </w:tcMar>
+          </w:tcPr>
+          <w:p>
+            <w:r>
+              <w:rPr>
+                <w:b w:val="false"/>
+                <w:bCs w:val="false"/>
+                <w:sz w:val="18"/>
+                <w:szCs w:val="18"/>
+              </w:rPr>
+              <w:t xml:space="preserve">LENS-005</w:t>
             </w:r>
           </w:p>
         </w:tc>
@@ -2145,7 +3969,7 @@
         </w:trPr>
         <w:tc>
           <w:tcPr>
-            <w:tcW w:type="dxa" w:w="NaNon"/>
+            <w:tcW w:type="dxa" w:w="1440"/>
             <w:tcBorders>
               <w:top w:val="single" w:color="CCCCCC" w:sz="1"/>
               <w:left w:val="single" w:color="CCCCCC" w:sz="1"/>
@@ -2197,7 +4021,36 @@
                 <w:sz w:val="18"/>
                 <w:szCs w:val="18"/>
               </w:rPr>
-              <w:t xml:space="default"/>
+              <w:t xml:space="preserve">Description</w:t>
+            </w:r>
+          </w:p>
+        </w:tc>
+        <w:tc>
+          <w:tcPr>
+            <w:tcW w:type="dxa" w:w="2160"/>
+            <w:tcBorders>
+              <w:top w:val="single" w:color="CCCCCC" w:sz="1"/>
+              <w:left w:val="single" w:color="CCCCCC" w:sz="1"/>
+              <w:bottom w:val="single" w:color="CCCCCC" w:sz="1"/>
+              <w:right w:val="single" w:color="CCCCCC" w:sz="1"/>
+            </w:tcBorders>
+            <w:shd w:fill="D5E8F0" w:val="clear"/>
+            <w:tcMar>
+              <w:top w:type="dxa" w:w="80"/>
+              <w:left w:type="dxa" w:w="120"/>
+              <w:bottom w:type="dxa" w:w="80"/>
+              <w:right w:type="dxa" w:w="120"/>
+            </w:tcMar>
+          </w:tcPr>
+          <w:p>
+            <w:r>
+              <w:rPr>
+                <w:b/>
+                <w:bCs/>
+                <w:sz w:val="18"/>
+                <w:szCs w:val="18"/>
+              </w:rPr>
+              <w:t xml:space="preserve">Added</w:t>
             </w:r>
           </w:p>
         </w:tc>
@@ -2208,7 +4061,7 @@
         </w:trPr>
         <w:tc>
           <w:tcPr>
-            <w:tcW w:type="dxa" w:w="NaNs."/>
+            <w:tcW w:type="dxa" w:w="1440"/>
             <w:tcBorders>
               <w:top w:val="single" w:color="CCCCCC" w:sz="1"/>
               <w:left w:val="single" w:color="CCCCCC" w:sz="1"/>
@@ -2260,7 +4113,36 @@
                 <w:sz w:val="18"/>
                 <w:szCs w:val="18"/>
               </w:rPr>
-              <w:t xml:space="default"/>
+              <w:t xml:space="preserve">Every ML model needs: problem + data plan + eval metric. No ML for aesthetics.</w:t>
+            </w:r>
+          </w:p>
+        </w:tc>
+        <w:tc>
+          <w:tcPr>
+            <w:tcW w:type="dxa" w:w="2160"/>
+            <w:tcBorders>
+              <w:top w:val="single" w:color="CCCCCC" w:sz="1"/>
+              <w:left w:val="single" w:color="CCCCCC" w:sz="1"/>
+              <w:bottom w:val="single" w:color="CCCCCC" w:sz="1"/>
+              <w:right w:val="single" w:color="CCCCCC" w:sz="1"/>
+            </w:tcBorders>
+            <w:shd w:fill="FFFFFF" w:val="clear"/>
+            <w:tcMar>
+              <w:top w:type="dxa" w:w="80"/>
+              <w:left w:type="dxa" w:w="120"/>
+              <w:bottom w:type="dxa" w:w="80"/>
+              <w:right w:type="dxa" w:w="120"/>
+            </w:tcMar>
+          </w:tcPr>
+          <w:p>
+            <w:r>
+              <w:rPr>
+                <w:b w:val="false"/>
+                <w:bCs w:val="false"/>
+                <w:sz w:val="18"/>
+                <w:szCs w:val="18"/>
+              </w:rPr>
+              <w:t xml:space="preserve">LENS-001</w:t>
             </w:r>
           </w:p>
         </w:tc>
@@ -2271,7 +4153,7 @@
         </w:trPr>
         <w:tc>
           <w:tcPr>
-            <w:tcW w:type="dxa" w:w="NaNe."/>
+            <w:tcW w:type="dxa" w:w="1440"/>
             <w:tcBorders>
               <w:top w:val="single" w:color="CCCCCC" w:sz="1"/>
               <w:left w:val="single" w:color="CCCCCC" w:sz="1"/>
@@ -2323,7 +4205,36 @@
                 <w:sz w:val="18"/>
                 <w:szCs w:val="18"/>
               </w:rPr>
-              <w:t xml:space="default"/>
+              <w:t xml:space="preserve">Collect training data from day one. Every correction = labeled example.</w:t>
+            </w:r>
+          </w:p>
+        </w:tc>
+        <w:tc>
+          <w:tcPr>
+            <w:tcW w:type="dxa" w:w="2160"/>
+            <w:tcBorders>
+              <w:top w:val="single" w:color="CCCCCC" w:sz="1"/>
+              <w:left w:val="single" w:color="CCCCCC" w:sz="1"/>
+              <w:bottom w:val="single" w:color="CCCCCC" w:sz="1"/>
+              <w:right w:val="single" w:color="CCCCCC" w:sz="1"/>
+            </w:tcBorders>
+            <w:shd w:fill="FFFFFF" w:val="clear"/>
+            <w:tcMar>
+              <w:top w:type="dxa" w:w="80"/>
+              <w:left w:type="dxa" w:w="120"/>
+              <w:bottom w:type="dxa" w:w="80"/>
+              <w:right w:type="dxa" w:w="120"/>
+            </w:tcMar>
+          </w:tcPr>
+          <w:p>
+            <w:r>
+              <w:rPr>
+                <w:b w:val="false"/>
+                <w:bCs w:val="false"/>
+                <w:sz w:val="18"/>
+                <w:szCs w:val="18"/>
+              </w:rPr>
+              <w:t xml:space="preserve">LENS-001</w:t>
             </w:r>
           </w:p>
         </w:tc>
@@ -2334,7 +4245,7 @@
         </w:trPr>
         <w:tc>
           <w:tcPr>
-            <w:tcW w:type="dxa" w:w="NaNg."/>
+            <w:tcW w:type="dxa" w:w="1440"/>
             <w:tcBorders>
               <w:top w:val="single" w:color="CCCCCC" w:sz="1"/>
               <w:left w:val="single" w:color="CCCCCC" w:sz="1"/>
@@ -2386,7 +4297,36 @@
                 <w:sz w:val="18"/>
                 <w:szCs w:val="18"/>
               </w:rPr>
-              <w:t xml:space="default"/>
+              <w:t xml:space="preserve">ML phases in order: Text → Image → Audio → Video → Multi-modal. No skipping.</w:t>
+            </w:r>
+          </w:p>
+        </w:tc>
+        <w:tc>
+          <w:tcPr>
+            <w:tcW w:type="dxa" w:w="2160"/>
+            <w:tcBorders>
+              <w:top w:val="single" w:color="CCCCCC" w:sz="1"/>
+              <w:left w:val="single" w:color="CCCCCC" w:sz="1"/>
+              <w:bottom w:val="single" w:color="CCCCCC" w:sz="1"/>
+              <w:right w:val="single" w:color="CCCCCC" w:sz="1"/>
+            </w:tcBorders>
+            <w:shd w:fill="FFFFFF" w:val="clear"/>
+            <w:tcMar>
+              <w:top w:type="dxa" w:w="80"/>
+              <w:left w:type="dxa" w:w="120"/>
+              <w:bottom w:type="dxa" w:w="80"/>
+              <w:right w:type="dxa" w:w="120"/>
+            </w:tcMar>
+          </w:tcPr>
+          <w:p>
+            <w:r>
+              <w:rPr>
+                <w:b w:val="false"/>
+                <w:bCs w:val="false"/>
+                <w:sz w:val="18"/>
+                <w:szCs w:val="18"/>
+              </w:rPr>
+              <w:t xml:space="preserve">LENS-001</w:t>
             </w:r>
           </w:p>
         </w:tc>
@@ -2397,7 +4337,7 @@
         </w:trPr>
         <w:tc>
           <w:tcPr>
-            <w:tcW w:type="dxa" w:w="NaNc."/>
+            <w:tcW w:type="dxa" w:w="1440"/>
             <w:tcBorders>
               <w:top w:val="single" w:color="CCCCCC" w:sz="1"/>
               <w:left w:val="single" w:color="CCCCCC" w:sz="1"/>
@@ -2449,7 +4389,36 @@
                 <w:sz w:val="18"/>
                 <w:szCs w:val="18"/>
               </w:rPr>
-              <w:t xml:space="default"/>
+              <w:t xml:space="preserve">RL reward signal = human analyst rating. Not automated metric.</w:t>
+            </w:r>
+          </w:p>
+        </w:tc>
+        <w:tc>
+          <w:tcPr>
+            <w:tcW w:type="dxa" w:w="2160"/>
+            <w:tcBorders>
+              <w:top w:val="single" w:color="CCCCCC" w:sz="1"/>
+              <w:left w:val="single" w:color="CCCCCC" w:sz="1"/>
+              <w:bottom w:val="single" w:color="CCCCCC" w:sz="1"/>
+              <w:right w:val="single" w:color="CCCCCC" w:sz="1"/>
+            </w:tcBorders>
+            <w:shd w:fill="FFFFFF" w:val="clear"/>
+            <w:tcMar>
+              <w:top w:type="dxa" w:w="80"/>
+              <w:left w:type="dxa" w:w="120"/>
+              <w:bottom w:type="dxa" w:w="80"/>
+              <w:right w:type="dxa" w:w="120"/>
+            </w:tcMar>
+          </w:tcPr>
+          <w:p>
+            <w:r>
+              <w:rPr>
+                <w:b w:val="false"/>
+                <w:bCs w:val="false"/>
+                <w:sz w:val="18"/>
+                <w:szCs w:val="18"/>
+              </w:rPr>
+              <w:t xml:space="preserve">LENS-001</w:t>
             </w:r>
           </w:p>
         </w:tc>
@@ -2491,7 +4460,7 @@
         </w:trPr>
         <w:tc>
           <w:tcPr>
-            <w:tcW w:type="dxa" w:w="NaNon"/>
+            <w:tcW w:type="dxa" w:w="1440"/>
             <w:tcBorders>
               <w:top w:val="single" w:color="CCCCCC" w:sz="1"/>
               <w:left w:val="single" w:color="CCCCCC" w:sz="1"/>
@@ -2543,7 +4512,36 @@
                 <w:sz w:val="18"/>
                 <w:szCs w:val="18"/>
               </w:rPr>
-              <w:t xml:space="default"/>
+              <w:t xml:space="preserve">Description</w:t>
+            </w:r>
+          </w:p>
+        </w:tc>
+        <w:tc>
+          <w:tcPr>
+            <w:tcW w:type="dxa" w:w="2160"/>
+            <w:tcBorders>
+              <w:top w:val="single" w:color="CCCCCC" w:sz="1"/>
+              <w:left w:val="single" w:color="CCCCCC" w:sz="1"/>
+              <w:bottom w:val="single" w:color="CCCCCC" w:sz="1"/>
+              <w:right w:val="single" w:color="CCCCCC" w:sz="1"/>
+            </w:tcBorders>
+            <w:shd w:fill="D5E8F0" w:val="clear"/>
+            <w:tcMar>
+              <w:top w:type="dxa" w:w="80"/>
+              <w:left w:type="dxa" w:w="120"/>
+              <w:bottom w:type="dxa" w:w="80"/>
+              <w:right w:type="dxa" w:w="120"/>
+            </w:tcMar>
+          </w:tcPr>
+          <w:p>
+            <w:r>
+              <w:rPr>
+                <w:b/>
+                <w:bCs/>
+                <w:sz w:val="18"/>
+                <w:szCs w:val="18"/>
+              </w:rPr>
+              <w:t xml:space="preserve">Added</w:t>
             </w:r>
           </w:p>
         </w:tc>
@@ -2554,7 +4552,7 @@
         </w:trPr>
         <w:tc>
           <w:tcPr>
-            <w:tcW w:type="dxa" w:w="NaNs."/>
+            <w:tcW w:type="dxa" w:w="1440"/>
             <w:tcBorders>
               <w:top w:val="single" w:color="CCCCCC" w:sz="1"/>
               <w:left w:val="single" w:color="CCCCCC" w:sz="1"/>
@@ -2606,7 +4604,36 @@
                 <w:sz w:val="18"/>
                 <w:szCs w:val="18"/>
               </w:rPr>
-              <w:t xml:space="default"/>
+              <w:t xml:space="preserve">Separate identity: planfintel@gmail.com for all Lens accounts.</w:t>
+            </w:r>
+          </w:p>
+        </w:tc>
+        <w:tc>
+          <w:tcPr>
+            <w:tcW w:type="dxa" w:w="2160"/>
+            <w:tcBorders>
+              <w:top w:val="single" w:color="CCCCCC" w:sz="1"/>
+              <w:left w:val="single" w:color="CCCCCC" w:sz="1"/>
+              <w:bottom w:val="single" w:color="CCCCCC" w:sz="1"/>
+              <w:right w:val="single" w:color="CCCCCC" w:sz="1"/>
+            </w:tcBorders>
+            <w:shd w:fill="FFFFFF" w:val="clear"/>
+            <w:tcMar>
+              <w:top w:type="dxa" w:w="80"/>
+              <w:left w:type="dxa" w:w="120"/>
+              <w:bottom w:type="dxa" w:w="80"/>
+              <w:right w:type="dxa" w:w="120"/>
+            </w:tcMar>
+          </w:tcPr>
+          <w:p>
+            <w:r>
+              <w:rPr>
+                <w:b w:val="false"/>
+                <w:bCs w:val="false"/>
+                <w:sz w:val="18"/>
+                <w:szCs w:val="18"/>
+              </w:rPr>
+              <w:t xml:space="preserve">LENS-001</w:t>
             </w:r>
           </w:p>
         </w:tc>
@@ -2617,7 +4644,7 @@
         </w:trPr>
         <w:tc>
           <w:tcPr>
-            <w:tcW w:type="dxa" w:w="NaNe."/>
+            <w:tcW w:type="dxa" w:w="1440"/>
             <w:tcBorders>
               <w:top w:val="single" w:color="CCCCCC" w:sz="1"/>
               <w:left w:val="single" w:color="CCCCCC" w:sz="1"/>
@@ -2669,7 +4696,36 @@
                 <w:sz w:val="18"/>
                 <w:szCs w:val="18"/>
               </w:rPr>
-              <w:t xml:space="default"/>
+              <w:t xml:space="preserve">Public repo = no secrets ever committed. .env always in .gitignore.</w:t>
+            </w:r>
+          </w:p>
+        </w:tc>
+        <w:tc>
+          <w:tcPr>
+            <w:tcW w:type="dxa" w:w="2160"/>
+            <w:tcBorders>
+              <w:top w:val="single" w:color="CCCCCC" w:sz="1"/>
+              <w:left w:val="single" w:color="CCCCCC" w:sz="1"/>
+              <w:bottom w:val="single" w:color="CCCCCC" w:sz="1"/>
+              <w:right w:val="single" w:color="CCCCCC" w:sz="1"/>
+            </w:tcBorders>
+            <w:shd w:fill="FFFFFF" w:val="clear"/>
+            <w:tcMar>
+              <w:top w:type="dxa" w:w="80"/>
+              <w:left w:type="dxa" w:w="120"/>
+              <w:bottom w:type="dxa" w:w="80"/>
+              <w:right w:type="dxa" w:w="120"/>
+            </w:tcMar>
+          </w:tcPr>
+          <w:p>
+            <w:r>
+              <w:rPr>
+                <w:b w:val="false"/>
+                <w:bCs w:val="false"/>
+                <w:sz w:val="18"/>
+                <w:szCs w:val="18"/>
+              </w:rPr>
+              <w:t xml:space="preserve">LENS-001</w:t>
             </w:r>
           </w:p>
         </w:tc>
@@ -2680,7 +4736,7 @@
         </w:trPr>
         <w:tc>
           <w:tcPr>
-            <w:tcW w:type="dxa" w:w="NaNs."/>
+            <w:tcW w:type="dxa" w:w="1440"/>
             <w:tcBorders>
               <w:top w:val="single" w:color="CCCCCC" w:sz="1"/>
               <w:left w:val="single" w:color="CCCCCC" w:sz="1"/>
@@ -2732,7 +4788,36 @@
                 <w:sz w:val="18"/>
                 <w:szCs w:val="18"/>
               </w:rPr>
-              <w:t xml:space="default"/>
+              <w:t xml:space="preserve">Rotate keys immediately if exposed. No exceptions.</w:t>
+            </w:r>
+          </w:p>
+        </w:tc>
+        <w:tc>
+          <w:tcPr>
+            <w:tcW w:type="dxa" w:w="2160"/>
+            <w:tcBorders>
+              <w:top w:val="single" w:color="CCCCCC" w:sz="1"/>
+              <w:left w:val="single" w:color="CCCCCC" w:sz="1"/>
+              <w:bottom w:val="single" w:color="CCCCCC" w:sz="1"/>
+              <w:right w:val="single" w:color="CCCCCC" w:sz="1"/>
+            </w:tcBorders>
+            <w:shd w:fill="FFFFFF" w:val="clear"/>
+            <w:tcMar>
+              <w:top w:type="dxa" w:w="80"/>
+              <w:left w:type="dxa" w:w="120"/>
+              <w:bottom w:type="dxa" w:w="80"/>
+              <w:right w:type="dxa" w:w="120"/>
+            </w:tcMar>
+          </w:tcPr>
+          <w:p>
+            <w:r>
+              <w:rPr>
+                <w:b w:val="false"/>
+                <w:bCs w:val="false"/>
+                <w:sz w:val="18"/>
+                <w:szCs w:val="18"/>
+              </w:rPr>
+              <w:t xml:space="preserve">LENS-001</w:t>
             </w:r>
           </w:p>
         </w:tc>
@@ -2743,7 +4828,7 @@
         </w:trPr>
         <w:tc>
           <w:tcPr>
-            <w:tcW w:type="dxa" w:w="NaNo."/>
+            <w:tcW w:type="dxa" w:w="1440"/>
             <w:tcBorders>
               <w:top w:val="single" w:color="CCCCCC" w:sz="1"/>
               <w:left w:val="single" w:color="CCCCCC" w:sz="1"/>
@@ -2795,7 +4880,36 @@
                 <w:sz w:val="18"/>
                 <w:szCs w:val="18"/>
               </w:rPr>
-              <w:t xml:space="default"/>
+              <w:t xml:space="preserve">*.docx in .gitignore. Session docs never in public repo.</w:t>
+            </w:r>
+          </w:p>
+        </w:tc>
+        <w:tc>
+          <w:tcPr>
+            <w:tcW w:type="dxa" w:w="2160"/>
+            <w:tcBorders>
+              <w:top w:val="single" w:color="CCCCCC" w:sz="1"/>
+              <w:left w:val="single" w:color="CCCCCC" w:sz="1"/>
+              <w:bottom w:val="single" w:color="CCCCCC" w:sz="1"/>
+              <w:right w:val="single" w:color="CCCCCC" w:sz="1"/>
+            </w:tcBorders>
+            <w:shd w:fill="FFFFFF" w:val="clear"/>
+            <w:tcMar>
+              <w:top w:type="dxa" w:w="80"/>
+              <w:left w:type="dxa" w:w="120"/>
+              <w:bottom w:type="dxa" w:w="80"/>
+              <w:right w:type="dxa" w:w="120"/>
+            </w:tcMar>
+          </w:tcPr>
+          <w:p>
+            <w:r>
+              <w:rPr>
+                <w:b w:val="false"/>
+                <w:bCs w:val="false"/>
+                <w:sz w:val="18"/>
+                <w:szCs w:val="18"/>
+              </w:rPr>
+              <w:t xml:space="preserve">LENS-006</w:t>
             </w:r>
           </w:p>
         </w:tc>
@@ -2837,7 +4951,7 @@
         </w:trPr>
         <w:tc>
           <w:tcPr>
-            <w:tcW w:type="dxa" w:w="NaNon"/>
+            <w:tcW w:type="dxa" w:w="1440"/>
             <w:tcBorders>
               <w:top w:val="single" w:color="CCCCCC" w:sz="1"/>
               <w:left w:val="single" w:color="CCCCCC" w:sz="1"/>
@@ -2889,7 +5003,36 @@
                 <w:sz w:val="18"/>
                 <w:szCs w:val="18"/>
               </w:rPr>
-              <w:t xml:space="default"/>
+              <w:t xml:space="preserve">Description</w:t>
+            </w:r>
+          </w:p>
+        </w:tc>
+        <w:tc>
+          <w:tcPr>
+            <w:tcW w:type="dxa" w:w="2160"/>
+            <w:tcBorders>
+              <w:top w:val="single" w:color="CCCCCC" w:sz="1"/>
+              <w:left w:val="single" w:color="CCCCCC" w:sz="1"/>
+              <w:bottom w:val="single" w:color="CCCCCC" w:sz="1"/>
+              <w:right w:val="single" w:color="CCCCCC" w:sz="1"/>
+            </w:tcBorders>
+            <w:shd w:fill="D5E8F0" w:val="clear"/>
+            <w:tcMar>
+              <w:top w:type="dxa" w:w="80"/>
+              <w:left w:type="dxa" w:w="120"/>
+              <w:bottom w:type="dxa" w:w="80"/>
+              <w:right w:type="dxa" w:w="120"/>
+            </w:tcMar>
+          </w:tcPr>
+          <w:p>
+            <w:r>
+              <w:rPr>
+                <w:b/>
+                <w:bCs/>
+                <w:sz w:val="18"/>
+                <w:szCs w:val="18"/>
+              </w:rPr>
+              <w:t xml:space="preserve">Added</w:t>
             </w:r>
           </w:p>
         </w:tc>
@@ -2900,7 +5043,7 @@
         </w:trPr>
         <w:tc>
           <w:tcPr>
-            <w:tcW w:type="dxa" w:w="NaNn."/>
+            <w:tcW w:type="dxa" w:w="1440"/>
             <w:tcBorders>
               <w:top w:val="single" w:color="CCCCCC" w:sz="1"/>
               <w:left w:val="single" w:color="CCCCCC" w:sz="1"/>
@@ -2952,7 +5095,36 @@
                 <w:sz w:val="18"/>
                 <w:szCs w:val="18"/>
               </w:rPr>
-              <w:t xml:space="default"/>
+              <w:t xml:space="preserve">AI reads session transfer block before responding. Fresh eyes every session.</w:t>
+            </w:r>
+          </w:p>
+        </w:tc>
+        <w:tc>
+          <w:tcPr>
+            <w:tcW w:type="dxa" w:w="2160"/>
+            <w:tcBorders>
+              <w:top w:val="single" w:color="CCCCCC" w:sz="1"/>
+              <w:left w:val="single" w:color="CCCCCC" w:sz="1"/>
+              <w:bottom w:val="single" w:color="CCCCCC" w:sz="1"/>
+              <w:right w:val="single" w:color="CCCCCC" w:sz="1"/>
+            </w:tcBorders>
+            <w:shd w:fill="FFFFFF" w:val="clear"/>
+            <w:tcMar>
+              <w:top w:type="dxa" w:w="80"/>
+              <w:left w:type="dxa" w:w="120"/>
+              <w:bottom w:type="dxa" w:w="80"/>
+              <w:right w:type="dxa" w:w="120"/>
+            </w:tcMar>
+          </w:tcPr>
+          <w:p>
+            <w:r>
+              <w:rPr>
+                <w:b w:val="false"/>
+                <w:bCs w:val="false"/>
+                <w:sz w:val="18"/>
+                <w:szCs w:val="18"/>
+              </w:rPr>
+              <w:t xml:space="preserve">LENS-001</w:t>
             </w:r>
           </w:p>
         </w:tc>
@@ -2963,7 +5135,7 @@
         </w:trPr>
         <w:tc>
           <w:tcPr>
-            <w:tcW w:type="dxa" w:w="NaNg."/>
+            <w:tcW w:type="dxa" w:w="1440"/>
             <w:tcBorders>
               <w:top w:val="single" w:color="CCCCCC" w:sz="1"/>
               <w:left w:val="single" w:color="CCCCCC" w:sz="1"/>
@@ -3015,7 +5187,36 @@
                 <w:sz w:val="18"/>
                 <w:szCs w:val="18"/>
               </w:rPr>
-              <w:t xml:space="default"/>
+              <w:t xml:space="preserve">Bird-eye view before details. Slow is faster than wrong.</w:t>
+            </w:r>
+          </w:p>
+        </w:tc>
+        <w:tc>
+          <w:tcPr>
+            <w:tcW w:type="dxa" w:w="2160"/>
+            <w:tcBorders>
+              <w:top w:val="single" w:color="CCCCCC" w:sz="1"/>
+              <w:left w:val="single" w:color="CCCCCC" w:sz="1"/>
+              <w:bottom w:val="single" w:color="CCCCCC" w:sz="1"/>
+              <w:right w:val="single" w:color="CCCCCC" w:sz="1"/>
+            </w:tcBorders>
+            <w:shd w:fill="FFFFFF" w:val="clear"/>
+            <w:tcMar>
+              <w:top w:type="dxa" w:w="80"/>
+              <w:left w:type="dxa" w:w="120"/>
+              <w:bottom w:type="dxa" w:w="80"/>
+              <w:right w:type="dxa" w:w="120"/>
+            </w:tcMar>
+          </w:tcPr>
+          <w:p>
+            <w:r>
+              <w:rPr>
+                <w:b w:val="false"/>
+                <w:bCs w:val="false"/>
+                <w:sz w:val="18"/>
+                <w:szCs w:val="18"/>
+              </w:rPr>
+              <w:t xml:space="preserve">LENS-001</w:t>
             </w:r>
           </w:p>
         </w:tc>
@@ -3026,7 +5227,7 @@
         </w:trPr>
         <w:tc>
           <w:tcPr>
-            <w:tcW w:type="dxa" w:w="NaN3."/>
+            <w:tcW w:type="dxa" w:w="1440"/>
             <w:tcBorders>
               <w:top w:val="single" w:color="CCCCCC" w:sz="1"/>
               <w:left w:val="single" w:color="CCCCCC" w:sz="1"/>
@@ -3078,7 +5279,36 @@
                 <w:sz w:val="18"/>
                 <w:szCs w:val="18"/>
               </w:rPr>
-              <w:t xml:space="default"/>
+              <w:t xml:space="preserve">Never conclude before reading actual files. Origin: GNI-R-233.</w:t>
+            </w:r>
+          </w:p>
+        </w:tc>
+        <w:tc>
+          <w:tcPr>
+            <w:tcW w:type="dxa" w:w="2160"/>
+            <w:tcBorders>
+              <w:top w:val="single" w:color="CCCCCC" w:sz="1"/>
+              <w:left w:val="single" w:color="CCCCCC" w:sz="1"/>
+              <w:bottom w:val="single" w:color="CCCCCC" w:sz="1"/>
+              <w:right w:val="single" w:color="CCCCCC" w:sz="1"/>
+            </w:tcBorders>
+            <w:shd w:fill="FFFFFF" w:val="clear"/>
+            <w:tcMar>
+              <w:top w:type="dxa" w:w="80"/>
+              <w:left w:type="dxa" w:w="120"/>
+              <w:bottom w:type="dxa" w:w="80"/>
+              <w:right w:type="dxa" w:w="120"/>
+            </w:tcMar>
+          </w:tcPr>
+          <w:p>
+            <w:r>
+              <w:rPr>
+                <w:b w:val="false"/>
+                <w:bCs w:val="false"/>
+                <w:sz w:val="18"/>
+                <w:szCs w:val="18"/>
+              </w:rPr>
+              <w:t xml:space="preserve">LENS-001</w:t>
             </w:r>
           </w:p>
         </w:tc>
@@ -3089,7 +5319,7 @@
         </w:trPr>
         <w:tc>
           <w:tcPr>
-            <w:tcW w:type="dxa" w:w="NaNs."/>
+            <w:tcW w:type="dxa" w:w="1440"/>
             <w:tcBorders>
               <w:top w:val="single" w:color="CCCCCC" w:sz="1"/>
               <w:left w:val="single" w:color="CCCCCC" w:sz="1"/>
@@ -3141,7 +5371,36 @@
                 <w:sz w:val="18"/>
                 <w:szCs w:val="18"/>
               </w:rPr>
-              <w:t xml:space="default"/>
+              <w:t xml:space="preserve">AI presents options with tradeoffs. Bro Alpha makes final decisions.</w:t>
+            </w:r>
+          </w:p>
+        </w:tc>
+        <w:tc>
+          <w:tcPr>
+            <w:tcW w:type="dxa" w:w="2160"/>
+            <w:tcBorders>
+              <w:top w:val="single" w:color="CCCCCC" w:sz="1"/>
+              <w:left w:val="single" w:color="CCCCCC" w:sz="1"/>
+              <w:bottom w:val="single" w:color="CCCCCC" w:sz="1"/>
+              <w:right w:val="single" w:color="CCCCCC" w:sz="1"/>
+            </w:tcBorders>
+            <w:shd w:fill="FFFFFF" w:val="clear"/>
+            <w:tcMar>
+              <w:top w:type="dxa" w:w="80"/>
+              <w:left w:type="dxa" w:w="120"/>
+              <w:bottom w:type="dxa" w:w="80"/>
+              <w:right w:type="dxa" w:w="120"/>
+            </w:tcMar>
+          </w:tcPr>
+          <w:p>
+            <w:r>
+              <w:rPr>
+                <w:b w:val="false"/>
+                <w:bCs w:val="false"/>
+                <w:sz w:val="18"/>
+                <w:szCs w:val="18"/>
+              </w:rPr>
+              <w:t xml:space="preserve">LENS-001</w:t>
             </w:r>
           </w:p>
         </w:tc>
@@ -3152,7 +5411,7 @@
         </w:trPr>
         <w:tc>
           <w:tcPr>
-            <w:tcW w:type="dxa" w:w="NaNe."/>
+            <w:tcW w:type="dxa" w:w="1440"/>
             <w:tcBorders>
               <w:top w:val="single" w:color="CCCCCC" w:sz="1"/>
               <w:left w:val="single" w:color="CCCCCC" w:sz="1"/>
@@ -3204,7 +5463,36 @@
                 <w:sz w:val="18"/>
                 <w:szCs w:val="18"/>
               </w:rPr>
-              <w:t xml:space="default"/>
+              <w:t xml:space="preserve">Honest over comfortable. Flag risks clearly. No false confidence.</w:t>
+            </w:r>
+          </w:p>
+        </w:tc>
+        <w:tc>
+          <w:tcPr>
+            <w:tcW w:type="dxa" w:w="2160"/>
+            <w:tcBorders>
+              <w:top w:val="single" w:color="CCCCCC" w:sz="1"/>
+              <w:left w:val="single" w:color="CCCCCC" w:sz="1"/>
+              <w:bottom w:val="single" w:color="CCCCCC" w:sz="1"/>
+              <w:right w:val="single" w:color="CCCCCC" w:sz="1"/>
+            </w:tcBorders>
+            <w:shd w:fill="FFFFFF" w:val="clear"/>
+            <w:tcMar>
+              <w:top w:type="dxa" w:w="80"/>
+              <w:left w:type="dxa" w:w="120"/>
+              <w:bottom w:type="dxa" w:w="80"/>
+              <w:right w:type="dxa" w:w="120"/>
+            </w:tcMar>
+          </w:tcPr>
+          <w:p>
+            <w:r>
+              <w:rPr>
+                <w:b w:val="false"/>
+                <w:bCs w:val="false"/>
+                <w:sz w:val="18"/>
+                <w:szCs w:val="18"/>
+              </w:rPr>
+              <w:t xml:space="preserve">LENS-001</w:t>
             </w:r>
           </w:p>
         </w:tc>
@@ -3215,7 +5503,7 @@
         </w:trPr>
         <w:tc>
           <w:tcPr>
-            <w:tcW w:type="dxa" w:w="NaNy."/>
+            <w:tcW w:type="dxa" w:w="1440"/>
             <w:tcBorders>
               <w:top w:val="single" w:color="CCCCCC" w:sz="1"/>
               <w:left w:val="single" w:color="CCCCCC" w:sz="1"/>
@@ -3267,7 +5555,36 @@
                 <w:sz w:val="18"/>
                 <w:szCs w:val="18"/>
               </w:rPr>
-              <w:t xml:space="default"/>
+              <w:t xml:space="preserve">One question rule. Ask ONE question, most important only.</w:t>
+            </w:r>
+          </w:p>
+        </w:tc>
+        <w:tc>
+          <w:tcPr>
+            <w:tcW w:type="dxa" w:w="2160"/>
+            <w:tcBorders>
+              <w:top w:val="single" w:color="CCCCCC" w:sz="1"/>
+              <w:left w:val="single" w:color="CCCCCC" w:sz="1"/>
+              <w:bottom w:val="single" w:color="CCCCCC" w:sz="1"/>
+              <w:right w:val="single" w:color="CCCCCC" w:sz="1"/>
+            </w:tcBorders>
+            <w:shd w:fill="FFFFFF" w:val="clear"/>
+            <w:tcMar>
+              <w:top w:type="dxa" w:w="80"/>
+              <w:left w:type="dxa" w:w="120"/>
+              <w:bottom w:type="dxa" w:w="80"/>
+              <w:right w:type="dxa" w:w="120"/>
+            </w:tcMar>
+          </w:tcPr>
+          <w:p>
+            <w:r>
+              <w:rPr>
+                <w:b w:val="false"/>
+                <w:bCs w:val="false"/>
+                <w:sz w:val="18"/>
+                <w:szCs w:val="18"/>
+              </w:rPr>
+              <w:t xml:space="preserve">LENS-001</w:t>
             </w:r>
           </w:p>
         </w:tc>
@@ -3278,7 +5595,7 @@
         </w:trPr>
         <w:tc>
           <w:tcPr>
-            <w:tcW w:type="dxa" w:w="NaNw."/>
+            <w:tcW w:type="dxa" w:w="1440"/>
             <w:tcBorders>
               <w:top w:val="single" w:color="CCCCCC" w:sz="1"/>
               <w:left w:val="single" w:color="CCCCCC" w:sz="1"/>
@@ -3330,7 +5647,36 @@
                 <w:sz w:val="18"/>
                 <w:szCs w:val="18"/>
               </w:rPr>
-              <w:t xml:space="default"/>
+              <w:t xml:space="preserve">Document while building. Not after. Now.</w:t>
+            </w:r>
+          </w:p>
+        </w:tc>
+        <w:tc>
+          <w:tcPr>
+            <w:tcW w:type="dxa" w:w="2160"/>
+            <w:tcBorders>
+              <w:top w:val="single" w:color="CCCCCC" w:sz="1"/>
+              <w:left w:val="single" w:color="CCCCCC" w:sz="1"/>
+              <w:bottom w:val="single" w:color="CCCCCC" w:sz="1"/>
+              <w:right w:val="single" w:color="CCCCCC" w:sz="1"/>
+            </w:tcBorders>
+            <w:shd w:fill="FFFFFF" w:val="clear"/>
+            <w:tcMar>
+              <w:top w:type="dxa" w:w="80"/>
+              <w:left w:type="dxa" w:w="120"/>
+              <w:bottom w:type="dxa" w:w="80"/>
+              <w:right w:type="dxa" w:w="120"/>
+            </w:tcMar>
+          </w:tcPr>
+          <w:p>
+            <w:r>
+              <w:rPr>
+                <w:b w:val="false"/>
+                <w:bCs w:val="false"/>
+                <w:sz w:val="18"/>
+                <w:szCs w:val="18"/>
+              </w:rPr>
+              <w:t xml:space="preserve">LENS-001</w:t>
             </w:r>
           </w:p>
         </w:tc>
@@ -3341,7 +5687,7 @@
         </w:trPr>
         <w:tc>
           <w:tcPr>
-            <w:tcW w:type="dxa" w:w="NaNe."/>
+            <w:tcW w:type="dxa" w:w="1440"/>
             <w:tcBorders>
               <w:top w:val="single" w:color="CCCCCC" w:sz="1"/>
               <w:left w:val="single" w:color="CCCCCC" w:sz="1"/>
@@ -3393,7 +5739,36 @@
                 <w:sz w:val="18"/>
                 <w:szCs w:val="18"/>
               </w:rPr>
-              <w:t xml:space="default"/>
+              <w:t xml:space="preserve">Failure is data. Document as FND-XXX. Never hide.</w:t>
+            </w:r>
+          </w:p>
+        </w:tc>
+        <w:tc>
+          <w:tcPr>
+            <w:tcW w:type="dxa" w:w="2160"/>
+            <w:tcBorders>
+              <w:top w:val="single" w:color="CCCCCC" w:sz="1"/>
+              <w:left w:val="single" w:color="CCCCCC" w:sz="1"/>
+              <w:bottom w:val="single" w:color="CCCCCC" w:sz="1"/>
+              <w:right w:val="single" w:color="CCCCCC" w:sz="1"/>
+            </w:tcBorders>
+            <w:shd w:fill="FFFFFF" w:val="clear"/>
+            <w:tcMar>
+              <w:top w:type="dxa" w:w="80"/>
+              <w:left w:type="dxa" w:w="120"/>
+              <w:bottom w:type="dxa" w:w="80"/>
+              <w:right w:type="dxa" w:w="120"/>
+            </w:tcMar>
+          </w:tcPr>
+          <w:p>
+            <w:r>
+              <w:rPr>
+                <w:b w:val="false"/>
+                <w:bCs w:val="false"/>
+                <w:sz w:val="18"/>
+                <w:szCs w:val="18"/>
+              </w:rPr>
+              <w:t xml:space="preserve">LENS-001</w:t>
             </w:r>
           </w:p>
         </w:tc>
@@ -3404,7 +5779,7 @@
         </w:trPr>
         <w:tc>
           <w:tcPr>
-            <w:tcW w:type="dxa" w:w="NaNe."/>
+            <w:tcW w:type="dxa" w:w="1440"/>
             <w:tcBorders>
               <w:top w:val="single" w:color="CCCCCC" w:sz="1"/>
               <w:left w:val="single" w:color="CCCCCC" w:sz="1"/>
@@ -3456,7 +5831,36 @@
                 <w:sz w:val="18"/>
                 <w:szCs w:val="18"/>
               </w:rPr>
-              <w:t xml:space="default"/>
+              <w:t xml:space="preserve">Ethics check before any new data source.</w:t>
+            </w:r>
+          </w:p>
+        </w:tc>
+        <w:tc>
+          <w:tcPr>
+            <w:tcW w:type="dxa" w:w="2160"/>
+            <w:tcBorders>
+              <w:top w:val="single" w:color="CCCCCC" w:sz="1"/>
+              <w:left w:val="single" w:color="CCCCCC" w:sz="1"/>
+              <w:bottom w:val="single" w:color="CCCCCC" w:sz="1"/>
+              <w:right w:val="single" w:color="CCCCCC" w:sz="1"/>
+            </w:tcBorders>
+            <w:shd w:fill="FFFFFF" w:val="clear"/>
+            <w:tcMar>
+              <w:top w:type="dxa" w:w="80"/>
+              <w:left w:type="dxa" w:w="120"/>
+              <w:bottom w:type="dxa" w:w="80"/>
+              <w:right w:type="dxa" w:w="120"/>
+            </w:tcMar>
+          </w:tcPr>
+          <w:p>
+            <w:r>
+              <w:rPr>
+                <w:b w:val="false"/>
+                <w:bCs w:val="false"/>
+                <w:sz w:val="18"/>
+                <w:szCs w:val="18"/>
+              </w:rPr>
+              <w:t xml:space="preserve">LENS-001</w:t>
             </w:r>
           </w:p>
         </w:tc>
@@ -3467,7 +5871,7 @@
         </w:trPr>
         <w:tc>
           <w:tcPr>
-            <w:tcW w:type="dxa" w:w="NaNy."/>
+            <w:tcW w:type="dxa" w:w="1440"/>
             <w:tcBorders>
               <w:top w:val="single" w:color="CCCCCC" w:sz="1"/>
               <w:left w:val="single" w:color="CCCCCC" w:sz="1"/>
@@ -3519,7 +5923,36 @@
                 <w:sz w:val="18"/>
                 <w:szCs w:val="18"/>
               </w:rPr>
-              <w:t xml:space="default"/>
+              <w:t xml:space="preserve">GNI issues: fix quickly then back to Lens. Lens is primary. GNI is family.</w:t>
+            </w:r>
+          </w:p>
+        </w:tc>
+        <w:tc>
+          <w:tcPr>
+            <w:tcW w:type="dxa" w:w="2160"/>
+            <w:tcBorders>
+              <w:top w:val="single" w:color="CCCCCC" w:sz="1"/>
+              <w:left w:val="single" w:color="CCCCCC" w:sz="1"/>
+              <w:bottom w:val="single" w:color="CCCCCC" w:sz="1"/>
+              <w:right w:val="single" w:color="CCCCCC" w:sz="1"/>
+            </w:tcBorders>
+            <w:shd w:fill="FFFFFF" w:val="clear"/>
+            <w:tcMar>
+              <w:top w:type="dxa" w:w="80"/>
+              <w:left w:type="dxa" w:w="120"/>
+              <w:bottom w:type="dxa" w:w="80"/>
+              <w:right w:type="dxa" w:w="120"/>
+            </w:tcMar>
+          </w:tcPr>
+          <w:p>
+            <w:r>
+              <w:rPr>
+                <w:b w:val="false"/>
+                <w:bCs w:val="false"/>
+                <w:sz w:val="18"/>
+                <w:szCs w:val="18"/>
+              </w:rPr>
+              <w:t xml:space="preserve">LENS-001</w:t>
             </w:r>
           </w:p>
         </w:tc>
@@ -3561,7 +5994,7 @@
         </w:trPr>
         <w:tc>
           <w:tcPr>
-            <w:tcW w:type="dxa" w:w="NaNon"/>
+            <w:tcW w:type="dxa" w:w="1440"/>
             <w:tcBorders>
               <w:top w:val="single" w:color="CCCCCC" w:sz="1"/>
               <w:left w:val="single" w:color="CCCCCC" w:sz="1"/>
@@ -3613,7 +6046,36 @@
                 <w:sz w:val="18"/>
                 <w:szCs w:val="18"/>
               </w:rPr>
-              <w:t xml:space="default"/>
+              <w:t xml:space="preserve">Description</w:t>
+            </w:r>
+          </w:p>
+        </w:tc>
+        <w:tc>
+          <w:tcPr>
+            <w:tcW w:type="dxa" w:w="2160"/>
+            <w:tcBorders>
+              <w:top w:val="single" w:color="CCCCCC" w:sz="1"/>
+              <w:left w:val="single" w:color="CCCCCC" w:sz="1"/>
+              <w:bottom w:val="single" w:color="CCCCCC" w:sz="1"/>
+              <w:right w:val="single" w:color="CCCCCC" w:sz="1"/>
+            </w:tcBorders>
+            <w:shd w:fill="D5E8F0" w:val="clear"/>
+            <w:tcMar>
+              <w:top w:type="dxa" w:w="80"/>
+              <w:left w:type="dxa" w:w="120"/>
+              <w:bottom w:type="dxa" w:w="80"/>
+              <w:right w:type="dxa" w:w="120"/>
+            </w:tcMar>
+          </w:tcPr>
+          <w:p>
+            <w:r>
+              <w:rPr>
+                <w:b/>
+                <w:bCs/>
+                <w:sz w:val="18"/>
+                <w:szCs w:val="18"/>
+              </w:rPr>
+              <w:t xml:space="preserve">Added</w:t>
             </w:r>
           </w:p>
         </w:tc>
@@ -3624,7 +6086,7 @@
         </w:trPr>
         <w:tc>
           <w:tcPr>
-            <w:tcW w:type="dxa" w:w="NaNs."/>
+            <w:tcW w:type="dxa" w:w="1440"/>
             <w:tcBorders>
               <w:top w:val="single" w:color="CCCCCC" w:sz="1"/>
               <w:left w:val="single" w:color="CCCCCC" w:sz="1"/>
@@ -3676,7 +6138,36 @@
                 <w:sz w:val="18"/>
                 <w:szCs w:val="18"/>
               </w:rPr>
-              <w:t xml:space="default"/>
+              <w:t xml:space="preserve">20/20 test matrix is the minimum for any script above 200 lines.</w:t>
+            </w:r>
+          </w:p>
+        </w:tc>
+        <w:tc>
+          <w:tcPr>
+            <w:tcW w:type="dxa" w:w="2160"/>
+            <w:tcBorders>
+              <w:top w:val="single" w:color="CCCCCC" w:sz="1"/>
+              <w:left w:val="single" w:color="CCCCCC" w:sz="1"/>
+              <w:bottom w:val="single" w:color="CCCCCC" w:sz="1"/>
+              <w:right w:val="single" w:color="CCCCCC" w:sz="1"/>
+            </w:tcBorders>
+            <w:shd w:fill="FFFFFF" w:val="clear"/>
+            <w:tcMar>
+              <w:top w:type="dxa" w:w="80"/>
+              <w:left w:type="dxa" w:w="120"/>
+              <w:bottom w:type="dxa" w:w="80"/>
+              <w:right w:type="dxa" w:w="120"/>
+            </w:tcMar>
+          </w:tcPr>
+          <w:p>
+            <w:r>
+              <w:rPr>
+                <w:b w:val="false"/>
+                <w:bCs w:val="false"/>
+                <w:sz w:val="18"/>
+                <w:szCs w:val="18"/>
+              </w:rPr>
+              <w:t xml:space="preserve">LENS-005</w:t>
             </w:r>
           </w:p>
         </w:tc>
@@ -3687,7 +6178,7 @@
         </w:trPr>
         <w:tc>
           <w:tcPr>
-            <w:tcW w:type="dxa" w:w="NaNn."/>
+            <w:tcW w:type="dxa" w:w="1440"/>
             <w:tcBorders>
               <w:top w:val="single" w:color="CCCCCC" w:sz="1"/>
               <w:left w:val="single" w:color="CCCCCC" w:sz="1"/>
@@ -3739,7 +6230,36 @@
                 <w:sz w:val="18"/>
                 <w:szCs w:val="18"/>
               </w:rPr>
-              <w:t xml:space="default"/>
+              <w:t xml:space="preserve">Test on worst-case data: max articles, min articles, all providers down.</w:t>
+            </w:r>
+          </w:p>
+        </w:tc>
+        <w:tc>
+          <w:tcPr>
+            <w:tcW w:type="dxa" w:w="2160"/>
+            <w:tcBorders>
+              <w:top w:val="single" w:color="CCCCCC" w:sz="1"/>
+              <w:left w:val="single" w:color="CCCCCC" w:sz="1"/>
+              <w:bottom w:val="single" w:color="CCCCCC" w:sz="1"/>
+              <w:right w:val="single" w:color="CCCCCC" w:sz="1"/>
+            </w:tcBorders>
+            <w:shd w:fill="FFFFFF" w:val="clear"/>
+            <w:tcMar>
+              <w:top w:type="dxa" w:w="80"/>
+              <w:left w:type="dxa" w:w="120"/>
+              <w:bottom w:type="dxa" w:w="80"/>
+              <w:right w:type="dxa" w:w="120"/>
+            </w:tcMar>
+          </w:tcPr>
+          <w:p>
+            <w:r>
+              <w:rPr>
+                <w:b w:val="false"/>
+                <w:bCs w:val="false"/>
+                <w:sz w:val="18"/>
+                <w:szCs w:val="18"/>
+              </w:rPr>
+              <w:t xml:space="preserve">LENS-005</w:t>
             </w:r>
           </w:p>
         </w:tc>
@@ -3750,7 +6270,7 @@
         </w:trPr>
         <w:tc>
           <w:tcPr>
-            <w:tcW w:type="dxa" w:w="NaNt."/>
+            <w:tcW w:type="dxa" w:w="1440"/>
             <w:tcBorders>
               <w:top w:val="single" w:color="CCCCCC" w:sz="1"/>
               <w:left w:val="single" w:color="CCCCCC" w:sz="1"/>
@@ -3802,7 +6322,36 @@
                 <w:sz w:val="18"/>
                 <w:szCs w:val="18"/>
               </w:rPr>
-              <w:t xml:space="default"/>
+              <w:t xml:space="preserve">100/100 is the standard for orchestrator-level builds.</w:t>
+            </w:r>
+          </w:p>
+        </w:tc>
+        <w:tc>
+          <w:tcPr>
+            <w:tcW w:type="dxa" w:w="2160"/>
+            <w:tcBorders>
+              <w:top w:val="single" w:color="CCCCCC" w:sz="1"/>
+              <w:left w:val="single" w:color="CCCCCC" w:sz="1"/>
+              <w:bottom w:val="single" w:color="CCCCCC" w:sz="1"/>
+              <w:right w:val="single" w:color="CCCCCC" w:sz="1"/>
+            </w:tcBorders>
+            <w:shd w:fill="FFFFFF" w:val="clear"/>
+            <w:tcMar>
+              <w:top w:type="dxa" w:w="80"/>
+              <w:left w:type="dxa" w:w="120"/>
+              <w:bottom w:type="dxa" w:w="80"/>
+              <w:right w:type="dxa" w:w="120"/>
+            </w:tcMar>
+          </w:tcPr>
+          <w:p>
+            <w:r>
+              <w:rPr>
+                <w:b w:val="false"/>
+                <w:bCs w:val="false"/>
+                <w:sz w:val="18"/>
+                <w:szCs w:val="18"/>
+              </w:rPr>
+              <w:t xml:space="preserve">LENS-008</w:t>
             </w:r>
           </w:p>
         </w:tc>
@@ -3813,7 +6362,7 @@
         </w:trPr>
         <w:tc>
           <w:tcPr>
-            <w:tcW w:type="dxa" w:w="NaNr."/>
+            <w:tcW w:type="dxa" w:w="1440"/>
             <w:tcBorders>
               <w:top w:val="single" w:color="CCCCCC" w:sz="1"/>
               <w:left w:val="single" w:color="CCCCCC" w:sz="1"/>
@@ -3865,7 +6414,36 @@
                 <w:sz w:val="18"/>
                 <w:szCs w:val="18"/>
               </w:rPr>
-              <w:t xml:space="default"/>
+              <w:t xml:space="preserve">LENS_DRY_RUN=1 must pass before first live cron on any new orchestrator.</w:t>
+            </w:r>
+          </w:p>
+        </w:tc>
+        <w:tc>
+          <w:tcPr>
+            <w:tcW w:type="dxa" w:w="2160"/>
+            <w:tcBorders>
+              <w:top w:val="single" w:color="CCCCCC" w:sz="1"/>
+              <w:left w:val="single" w:color="CCCCCC" w:sz="1"/>
+              <w:bottom w:val="single" w:color="CCCCCC" w:sz="1"/>
+              <w:right w:val="single" w:color="CCCCCC" w:sz="1"/>
+            </w:tcBorders>
+            <w:shd w:fill="FFFFFF" w:val="clear"/>
+            <w:tcMar>
+              <w:top w:type="dxa" w:w="80"/>
+              <w:left w:type="dxa" w:w="120"/>
+              <w:bottom w:type="dxa" w:w="80"/>
+              <w:right w:type="dxa" w:w="120"/>
+            </w:tcMar>
+          </w:tcPr>
+          <w:p>
+            <w:r>
+              <w:rPr>
+                <w:b w:val="false"/>
+                <w:bCs w:val="false"/>
+                <w:sz w:val="18"/>
+                <w:szCs w:val="18"/>
+              </w:rPr>
+              <w:t xml:space="preserve">LENS-008</w:t>
             </w:r>
           </w:p>
         </w:tc>
@@ -3881,7 +6459,7 @@
         <w:pStyle w:val="Heading2"/>
       </w:pPr>
       <w:r>
-        <w:t xml:space="preserve">(P2) Process additions LENS-006+</w:t>
+        <w:t xml:space="preserve">(A2) Architecture — Three-System Rules</w:t>
       </w:r>
     </w:p>
     <w:tbl>
@@ -3907,7 +6485,7 @@
         </w:trPr>
         <w:tc>
           <w:tcPr>
-            <w:tcW w:type="dxa" w:w="NaNon"/>
+            <w:tcW w:type="dxa" w:w="1440"/>
             <w:tcBorders>
               <w:top w:val="single" w:color="CCCCCC" w:sz="1"/>
               <w:left w:val="single" w:color="CCCCCC" w:sz="1"/>
@@ -3959,7 +6537,36 @@
                 <w:sz w:val="18"/>
                 <w:szCs w:val="18"/>
               </w:rPr>
-              <w:t xml:space="default"/>
+              <w:t xml:space="preserve">Description</w:t>
+            </w:r>
+          </w:p>
+        </w:tc>
+        <w:tc>
+          <w:tcPr>
+            <w:tcW w:type="dxa" w:w="2160"/>
+            <w:tcBorders>
+              <w:top w:val="single" w:color="CCCCCC" w:sz="1"/>
+              <w:left w:val="single" w:color="CCCCCC" w:sz="1"/>
+              <w:bottom w:val="single" w:color="CCCCCC" w:sz="1"/>
+              <w:right w:val="single" w:color="CCCCCC" w:sz="1"/>
+            </w:tcBorders>
+            <w:shd w:fill="D5E8F0" w:val="clear"/>
+            <w:tcMar>
+              <w:top w:type="dxa" w:w="80"/>
+              <w:left w:type="dxa" w:w="120"/>
+              <w:bottom w:type="dxa" w:w="80"/>
+              <w:right w:type="dxa" w:w="120"/>
+            </w:tcMar>
+          </w:tcPr>
+          <w:p>
+            <w:r>
+              <w:rPr>
+                <w:b/>
+                <w:bCs/>
+                <w:sz w:val="18"/>
+                <w:szCs w:val="18"/>
+              </w:rPr>
+              <w:t xml:space="preserve">Added</w:t>
             </w:r>
           </w:p>
         </w:tc>
@@ -3970,30 +6577,30 @@
         </w:trPr>
         <w:tc>
           <w:tcPr>
-            <w:tcW w:type="dxa" w:w="NaNs."/>
-            <w:tcBorders>
-              <w:top w:val="single" w:color="CCCCCC" w:sz="1"/>
-              <w:left w:val="single" w:color="CCCCCC" w:sz="1"/>
-              <w:bottom w:val="single" w:color="CCCCCC" w:sz="1"/>
-              <w:right w:val="single" w:color="CCCCCC" w:sz="1"/>
-            </w:tcBorders>
-            <w:shd w:fill="FFFFFF" w:val="clear"/>
-            <w:tcMar>
-              <w:top w:type="dxa" w:w="80"/>
-              <w:left w:type="dxa" w:w="120"/>
-              <w:bottom w:type="dxa" w:w="80"/>
-              <w:right w:type="dxa" w:w="120"/>
-            </w:tcMar>
-          </w:tcPr>
-          <w:p>
-            <w:r>
-              <w:rPr>
-                <w:b w:val="false"/>
-                <w:bCs w:val="false"/>
-                <w:sz w:val="18"/>
-                <w:szCs w:val="18"/>
-              </w:rPr>
-              <w:t xml:space="preserve">LR-050(P)</w:t>
+            <w:tcW w:type="dxa" w:w="1440"/>
+            <w:tcBorders>
+              <w:top w:val="single" w:color="CCCCCC" w:sz="1"/>
+              <w:left w:val="single" w:color="CCCCCC" w:sz="1"/>
+              <w:bottom w:val="single" w:color="CCCCCC" w:sz="1"/>
+              <w:right w:val="single" w:color="CCCCCC" w:sz="1"/>
+            </w:tcBorders>
+            <w:shd w:fill="FFFFFF" w:val="clear"/>
+            <w:tcMar>
+              <w:top w:type="dxa" w:w="80"/>
+              <w:left w:type="dxa" w:w="120"/>
+              <w:bottom w:type="dxa" w:w="80"/>
+              <w:right w:type="dxa" w:w="120"/>
+            </w:tcMar>
+          </w:tcPr>
+          <w:p>
+            <w:r>
+              <w:rPr>
+                <w:b w:val="false"/>
+                <w:bCs w:val="false"/>
+                <w:sz w:val="18"/>
+                <w:szCs w:val="18"/>
+              </w:rPr>
+              <w:t xml:space="preserve">LR-059(A)</w:t>
             </w:r>
           </w:p>
         </w:tc>
@@ -4022,7 +6629,36 @@
                 <w:sz w:val="18"/>
                 <w:szCs w:val="18"/>
               </w:rPr>
-              <w:t xml:space="default"/>
+              <w:t xml:space="preserve">System 1 is the unprotected canary. It MUST NOT be protected, sanitized, or have injection-filtering logic added. Modifying System 1 to reduce injection absorption destroys the data System 2 needs to function.</w:t>
+            </w:r>
+          </w:p>
+        </w:tc>
+        <w:tc>
+          <w:tcPr>
+            <w:tcW w:type="dxa" w:w="2160"/>
+            <w:tcBorders>
+              <w:top w:val="single" w:color="CCCCCC" w:sz="1"/>
+              <w:left w:val="single" w:color="CCCCCC" w:sz="1"/>
+              <w:bottom w:val="single" w:color="CCCCCC" w:sz="1"/>
+              <w:right w:val="single" w:color="CCCCCC" w:sz="1"/>
+            </w:tcBorders>
+            <w:shd w:fill="FFFFFF" w:val="clear"/>
+            <w:tcMar>
+              <w:top w:type="dxa" w:w="80"/>
+              <w:left w:type="dxa" w:w="120"/>
+              <w:bottom w:type="dxa" w:w="80"/>
+              <w:right w:type="dxa" w:w="120"/>
+            </w:tcMar>
+          </w:tcPr>
+          <w:p>
+            <w:r>
+              <w:rPr>
+                <w:b w:val="false"/>
+                <w:bCs w:val="false"/>
+                <w:sz w:val="18"/>
+                <w:szCs w:val="18"/>
+              </w:rPr>
+              <w:t xml:space="preserve">LENS-010</w:t>
             </w:r>
           </w:p>
         </w:tc>
@@ -4033,30 +6669,30 @@
         </w:trPr>
         <w:tc>
           <w:tcPr>
-            <w:tcW w:type="dxa" w:w="NaNs."/>
-            <w:tcBorders>
-              <w:top w:val="single" w:color="CCCCCC" w:sz="1"/>
-              <w:left w:val="single" w:color="CCCCCC" w:sz="1"/>
-              <w:bottom w:val="single" w:color="CCCCCC" w:sz="1"/>
-              <w:right w:val="single" w:color="CCCCCC" w:sz="1"/>
-            </w:tcBorders>
-            <w:shd w:fill="FFFFFF" w:val="clear"/>
-            <w:tcMar>
-              <w:top w:type="dxa" w:w="80"/>
-              <w:left w:type="dxa" w:w="120"/>
-              <w:bottom w:type="dxa" w:w="80"/>
-              <w:right w:type="dxa" w:w="120"/>
-            </w:tcMar>
-          </w:tcPr>
-          <w:p>
-            <w:r>
-              <w:rPr>
-                <w:b w:val="false"/>
-                <w:bCs w:val="false"/>
-                <w:sz w:val="18"/>
-                <w:szCs w:val="18"/>
-              </w:rPr>
-              <w:t xml:space="preserve">LR-051(P)</w:t>
+            <w:tcW w:type="dxa" w:w="1440"/>
+            <w:tcBorders>
+              <w:top w:val="single" w:color="CCCCCC" w:sz="1"/>
+              <w:left w:val="single" w:color="CCCCCC" w:sz="1"/>
+              <w:bottom w:val="single" w:color="CCCCCC" w:sz="1"/>
+              <w:right w:val="single" w:color="CCCCCC" w:sz="1"/>
+            </w:tcBorders>
+            <w:shd w:fill="FFFFFF" w:val="clear"/>
+            <w:tcMar>
+              <w:top w:type="dxa" w:w="80"/>
+              <w:left w:type="dxa" w:w="120"/>
+              <w:bottom w:type="dxa" w:w="80"/>
+              <w:right w:type="dxa" w:w="120"/>
+            </w:tcMar>
+          </w:tcPr>
+          <w:p>
+            <w:r>
+              <w:rPr>
+                <w:b w:val="false"/>
+                <w:bCs w:val="false"/>
+                <w:sz w:val="18"/>
+                <w:szCs w:val="18"/>
+              </w:rPr>
+              <w:t xml:space="preserve">LR-060(A)</w:t>
             </w:r>
           </w:p>
         </w:tc>
@@ -4085,7 +6721,36 @@
                 <w:sz w:val="18"/>
                 <w:szCs w:val="18"/>
               </w:rPr>
-              <w:t xml:space="default"/>
+              <w:t xml:space="preserve">One-way information flow is absolute. System 1 reads only external sources. System 2 reads System 1 outputs + its own Tier C sources. System 3 reads everything. No reverse flow. No cross-system contamination.</w:t>
+            </w:r>
+          </w:p>
+        </w:tc>
+        <w:tc>
+          <w:tcPr>
+            <w:tcW w:type="dxa" w:w="2160"/>
+            <w:tcBorders>
+              <w:top w:val="single" w:color="CCCCCC" w:sz="1"/>
+              <w:left w:val="single" w:color="CCCCCC" w:sz="1"/>
+              <w:bottom w:val="single" w:color="CCCCCC" w:sz="1"/>
+              <w:right w:val="single" w:color="CCCCCC" w:sz="1"/>
+            </w:tcBorders>
+            <w:shd w:fill="FFFFFF" w:val="clear"/>
+            <w:tcMar>
+              <w:top w:type="dxa" w:w="80"/>
+              <w:left w:type="dxa" w:w="120"/>
+              <w:bottom w:type="dxa" w:w="80"/>
+              <w:right w:type="dxa" w:w="120"/>
+            </w:tcMar>
+          </w:tcPr>
+          <w:p>
+            <w:r>
+              <w:rPr>
+                <w:b w:val="false"/>
+                <w:bCs w:val="false"/>
+                <w:sz w:val="18"/>
+                <w:szCs w:val="18"/>
+              </w:rPr>
+              <w:t xml:space="preserve">LENS-008</w:t>
             </w:r>
           </w:p>
         </w:tc>
@@ -4096,30 +6761,30 @@
         </w:trPr>
         <w:tc>
           <w:tcPr>
-            <w:tcW w:type="dxa" w:w="NaNe."/>
-            <w:tcBorders>
-              <w:top w:val="single" w:color="CCCCCC" w:sz="1"/>
-              <w:left w:val="single" w:color="CCCCCC" w:sz="1"/>
-              <w:bottom w:val="single" w:color="CCCCCC" w:sz="1"/>
-              <w:right w:val="single" w:color="CCCCCC" w:sz="1"/>
-            </w:tcBorders>
-            <w:shd w:fill="FFFFFF" w:val="clear"/>
-            <w:tcMar>
-              <w:top w:type="dxa" w:w="80"/>
-              <w:left w:type="dxa" w:w="120"/>
-              <w:bottom w:type="dxa" w:w="80"/>
-              <w:right w:type="dxa" w:w="120"/>
-            </w:tcMar>
-          </w:tcPr>
-          <w:p>
-            <w:r>
-              <w:rPr>
-                <w:b w:val="false"/>
-                <w:bCs w:val="false"/>
-                <w:sz w:val="18"/>
-                <w:szCs w:val="18"/>
-              </w:rPr>
-              <w:t xml:space="preserve">LR-052(P)</w:t>
+            <w:tcW w:type="dxa" w:w="1440"/>
+            <w:tcBorders>
+              <w:top w:val="single" w:color="CCCCCC" w:sz="1"/>
+              <w:left w:val="single" w:color="CCCCCC" w:sz="1"/>
+              <w:bottom w:val="single" w:color="CCCCCC" w:sz="1"/>
+              <w:right w:val="single" w:color="CCCCCC" w:sz="1"/>
+            </w:tcBorders>
+            <w:shd w:fill="FFFFFF" w:val="clear"/>
+            <w:tcMar>
+              <w:top w:type="dxa" w:w="80"/>
+              <w:left w:type="dxa" w:w="120"/>
+              <w:bottom w:type="dxa" w:w="80"/>
+              <w:right w:type="dxa" w:w="120"/>
+            </w:tcMar>
+          </w:tcPr>
+          <w:p>
+            <w:r>
+              <w:rPr>
+                <w:b w:val="false"/>
+                <w:bCs w:val="false"/>
+                <w:sz w:val="18"/>
+                <w:szCs w:val="18"/>
+              </w:rPr>
+              <w:t xml:space="preserve">LR-061(A)</w:t>
             </w:r>
           </w:p>
         </w:tc>
@@ -4148,7 +6813,36 @@
                 <w:sz w:val="18"/>
                 <w:szCs w:val="18"/>
               </w:rPr>
-              <w:t xml:space="default"/>
+              <w:t xml:space="preserve">Resilient scoring (source diversity, permanence weighting, consensus anomaly detection) belongs to System 2 (S2-B Coordination Analyzer). It is applied as corrections to System 1 output, NOT as changes to fetch_text.py.</w:t>
+            </w:r>
+          </w:p>
+        </w:tc>
+        <w:tc>
+          <w:tcPr>
+            <w:tcW w:type="dxa" w:w="2160"/>
+            <w:tcBorders>
+              <w:top w:val="single" w:color="CCCCCC" w:sz="1"/>
+              <w:left w:val="single" w:color="CCCCCC" w:sz="1"/>
+              <w:bottom w:val="single" w:color="CCCCCC" w:sz="1"/>
+              <w:right w:val="single" w:color="CCCCCC" w:sz="1"/>
+            </w:tcBorders>
+            <w:shd w:fill="FFFFFF" w:val="clear"/>
+            <w:tcMar>
+              <w:top w:type="dxa" w:w="80"/>
+              <w:left w:type="dxa" w:w="120"/>
+              <w:bottom w:type="dxa" w:w="80"/>
+              <w:right w:type="dxa" w:w="120"/>
+            </w:tcMar>
+          </w:tcPr>
+          <w:p>
+            <w:r>
+              <w:rPr>
+                <w:b w:val="false"/>
+                <w:bCs w:val="false"/>
+                <w:sz w:val="18"/>
+                <w:szCs w:val="18"/>
+              </w:rPr>
+              <w:t xml:space="preserve">LENS-010</w:t>
             </w:r>
           </w:p>
         </w:tc>
@@ -4159,30 +6853,30 @@
         </w:trPr>
         <w:tc>
           <w:tcPr>
-            <w:tcW w:type="dxa" w:w="NaNt."/>
-            <w:tcBorders>
-              <w:top w:val="single" w:color="CCCCCC" w:sz="1"/>
-              <w:left w:val="single" w:color="CCCCCC" w:sz="1"/>
-              <w:bottom w:val="single" w:color="CCCCCC" w:sz="1"/>
-              <w:right w:val="single" w:color="CCCCCC" w:sz="1"/>
-            </w:tcBorders>
-            <w:shd w:fill="FFFFFF" w:val="clear"/>
-            <w:tcMar>
-              <w:top w:type="dxa" w:w="80"/>
-              <w:left w:type="dxa" w:w="120"/>
-              <w:bottom w:type="dxa" w:w="80"/>
-              <w:right w:type="dxa" w:w="120"/>
-            </w:tcMar>
-          </w:tcPr>
-          <w:p>
-            <w:r>
-              <w:rPr>
-                <w:b w:val="false"/>
-                <w:bCs w:val="false"/>
-                <w:sz w:val="18"/>
-                <w:szCs w:val="18"/>
-              </w:rPr>
-              <w:t xml:space="preserve">LR-053(P)</w:t>
+            <w:tcW w:type="dxa" w:w="1440"/>
+            <w:tcBorders>
+              <w:top w:val="single" w:color="CCCCCC" w:sz="1"/>
+              <w:left w:val="single" w:color="CCCCCC" w:sz="1"/>
+              <w:bottom w:val="single" w:color="CCCCCC" w:sz="1"/>
+              <w:right w:val="single" w:color="CCCCCC" w:sz="1"/>
+            </w:tcBorders>
+            <w:shd w:fill="FFFFFF" w:val="clear"/>
+            <w:tcMar>
+              <w:top w:type="dxa" w:w="80"/>
+              <w:left w:type="dxa" w:w="120"/>
+              <w:bottom w:type="dxa" w:w="80"/>
+              <w:right w:type="dxa" w:w="120"/>
+            </w:tcMar>
+          </w:tcPr>
+          <w:p>
+            <w:r>
+              <w:rPr>
+                <w:b w:val="false"/>
+                <w:bCs w:val="false"/>
+                <w:sz w:val="18"/>
+                <w:szCs w:val="18"/>
+              </w:rPr>
+              <w:t xml:space="preserve">LR-062(A)</w:t>
             </w:r>
           </w:p>
         </w:tc>
@@ -4211,7 +6905,36 @@
                 <w:sz w:val="18"/>
                 <w:szCs w:val="18"/>
               </w:rPr>
-              <w:t xml:space="default"/>
+              <w:t xml:space="preserve">System 1 metadata tag is the ONLY permitted addition: system="S1", protected=false, injection_assumed=true. Nothing else.</w:t>
+            </w:r>
+          </w:p>
+        </w:tc>
+        <w:tc>
+          <w:tcPr>
+            <w:tcW w:type="dxa" w:w="2160"/>
+            <w:tcBorders>
+              <w:top w:val="single" w:color="CCCCCC" w:sz="1"/>
+              <w:left w:val="single" w:color="CCCCCC" w:sz="1"/>
+              <w:bottom w:val="single" w:color="CCCCCC" w:sz="1"/>
+              <w:right w:val="single" w:color="CCCCCC" w:sz="1"/>
+            </w:tcBorders>
+            <w:shd w:fill="FFFFFF" w:val="clear"/>
+            <w:tcMar>
+              <w:top w:type="dxa" w:w="80"/>
+              <w:left w:type="dxa" w:w="120"/>
+              <w:bottom w:type="dxa" w:w="80"/>
+              <w:right w:type="dxa" w:w="120"/>
+            </w:tcMar>
+          </w:tcPr>
+          <w:p>
+            <w:r>
+              <w:rPr>
+                <w:b w:val="false"/>
+                <w:bCs w:val="false"/>
+                <w:sz w:val="18"/>
+                <w:szCs w:val="18"/>
+              </w:rPr>
+              <w:t xml:space="preserve">LENS-008</w:t>
             </w:r>
           </w:p>
         </w:tc>
@@ -4222,30 +6945,30 @@
         </w:trPr>
         <w:tc>
           <w:tcPr>
-            <w:tcW w:type="dxa" w:w="NaNl."/>
-            <w:tcBorders>
-              <w:top w:val="single" w:color="CCCCCC" w:sz="1"/>
-              <w:left w:val="single" w:color="CCCCCC" w:sz="1"/>
-              <w:bottom w:val="single" w:color="CCCCCC" w:sz="1"/>
-              <w:right w:val="single" w:color="CCCCCC" w:sz="1"/>
-            </w:tcBorders>
-            <w:shd w:fill="FFFFFF" w:val="clear"/>
-            <w:tcMar>
-              <w:top w:type="dxa" w:w="80"/>
-              <w:left w:type="dxa" w:w="120"/>
-              <w:bottom w:type="dxa" w:w="80"/>
-              <w:right w:type="dxa" w:w="120"/>
-            </w:tcMar>
-          </w:tcPr>
-          <w:p>
-            <w:r>
-              <w:rPr>
-                <w:b w:val="false"/>
-                <w:bCs w:val="false"/>
-                <w:sz w:val="18"/>
-                <w:szCs w:val="18"/>
-              </w:rPr>
-              <w:t xml:space="preserve">LR-054(P)</w:t>
+            <w:tcW w:type="dxa" w:w="1440"/>
+            <w:tcBorders>
+              <w:top w:val="single" w:color="CCCCCC" w:sz="1"/>
+              <w:left w:val="single" w:color="CCCCCC" w:sz="1"/>
+              <w:bottom w:val="single" w:color="CCCCCC" w:sz="1"/>
+              <w:right w:val="single" w:color="CCCCCC" w:sz="1"/>
+            </w:tcBorders>
+            <w:shd w:fill="FFFFFF" w:val="clear"/>
+            <w:tcMar>
+              <w:top w:type="dxa" w:w="80"/>
+              <w:left w:type="dxa" w:w="120"/>
+              <w:bottom w:type="dxa" w:w="80"/>
+              <w:right w:type="dxa" w:w="120"/>
+            </w:tcMar>
+          </w:tcPr>
+          <w:p>
+            <w:r>
+              <w:rPr>
+                <w:b w:val="false"/>
+                <w:bCs w:val="false"/>
+                <w:sz w:val="18"/>
+                <w:szCs w:val="18"/>
+              </w:rPr>
+              <w:t xml:space="preserve">LR-063(A)</w:t>
             </w:r>
           </w:p>
         </w:tc>
@@ -4274,196 +6997,36 @@
                 <w:sz w:val="18"/>
                 <w:szCs w:val="18"/>
               </w:rPr>
-              <w:t xml:space="default"/>
-            </w:r>
-          </w:p>
-        </w:tc>
-      </w:tr>
-      <w:tr>
-        <w:trPr>
-          <w:tblHeader w:val="false"/>
-        </w:trPr>
-        <w:tc>
-          <w:tcPr>
-            <w:tcW w:type="dxa" w:w="NaNy."/>
-            <w:tcBorders>
-              <w:top w:val="single" w:color="CCCCCC" w:sz="1"/>
-              <w:left w:val="single" w:color="CCCCCC" w:sz="1"/>
-              <w:bottom w:val="single" w:color="CCCCCC" w:sz="1"/>
-              <w:right w:val="single" w:color="CCCCCC" w:sz="1"/>
-            </w:tcBorders>
-            <w:shd w:fill="FFFFFF" w:val="clear"/>
-            <w:tcMar>
-              <w:top w:type="dxa" w:w="80"/>
-              <w:left w:type="dxa" w:w="120"/>
-              <w:bottom w:type="dxa" w:w="80"/>
-              <w:right w:type="dxa" w:w="120"/>
-            </w:tcMar>
-          </w:tcPr>
-          <w:p>
-            <w:r>
-              <w:rPr>
-                <w:b w:val="false"/>
-                <w:bCs w:val="false"/>
-                <w:sz w:val="18"/>
-                <w:szCs w:val="18"/>
-              </w:rPr>
-              <w:t xml:space="preserve">LR-055(P)</w:t>
-            </w:r>
-          </w:p>
-        </w:tc>
-        <w:tc>
-          <w:tcPr>
-            <w:tcW w:type="dxa" w:w="5760"/>
-            <w:tcBorders>
-              <w:top w:val="single" w:color="CCCCCC" w:sz="1"/>
-              <w:left w:val="single" w:color="CCCCCC" w:sz="1"/>
-              <w:bottom w:val="single" w:color="CCCCCC" w:sz="1"/>
-              <w:right w:val="single" w:color="CCCCCC" w:sz="1"/>
-            </w:tcBorders>
-            <w:shd w:fill="FFFFFF" w:val="clear"/>
-            <w:tcMar>
-              <w:top w:type="dxa" w:w="80"/>
-              <w:left w:type="dxa" w:w="120"/>
-              <w:bottom w:type="dxa" w:w="80"/>
-              <w:right w:type="dxa" w:w="120"/>
-            </w:tcMar>
-          </w:tcPr>
-          <w:p>
-            <w:r>
-              <w:rPr>
-                <w:b w:val="false"/>
-                <w:bCs w:val="false"/>
-                <w:sz w:val="18"/>
-                <w:szCs w:val="18"/>
-              </w:rPr>
-              <w:t xml:space="default"/>
-            </w:r>
-          </w:p>
-        </w:tc>
-      </w:tr>
-      <w:tr>
-        <w:trPr>
-          <w:tblHeader w:val="false"/>
-        </w:trPr>
-        <w:tc>
-          <w:tcPr>
-            <w:tcW w:type="dxa" w:w="NaNd."/>
-            <w:tcBorders>
-              <w:top w:val="single" w:color="CCCCCC" w:sz="1"/>
-              <w:left w:val="single" w:color="CCCCCC" w:sz="1"/>
-              <w:bottom w:val="single" w:color="CCCCCC" w:sz="1"/>
-              <w:right w:val="single" w:color="CCCCCC" w:sz="1"/>
-            </w:tcBorders>
-            <w:shd w:fill="FFFFFF" w:val="clear"/>
-            <w:tcMar>
-              <w:top w:type="dxa" w:w="80"/>
-              <w:left w:type="dxa" w:w="120"/>
-              <w:bottom w:type="dxa" w:w="80"/>
-              <w:right w:type="dxa" w:w="120"/>
-            </w:tcMar>
-          </w:tcPr>
-          <w:p>
-            <w:r>
-              <w:rPr>
-                <w:b w:val="false"/>
-                <w:bCs w:val="false"/>
-                <w:sz w:val="18"/>
-                <w:szCs w:val="18"/>
-              </w:rPr>
-              <w:t xml:space="preserve">LR-056(P)</w:t>
-            </w:r>
-          </w:p>
-        </w:tc>
-        <w:tc>
-          <w:tcPr>
-            <w:tcW w:type="dxa" w:w="5760"/>
-            <w:tcBorders>
-              <w:top w:val="single" w:color="CCCCCC" w:sz="1"/>
-              <w:left w:val="single" w:color="CCCCCC" w:sz="1"/>
-              <w:bottom w:val="single" w:color="CCCCCC" w:sz="1"/>
-              <w:right w:val="single" w:color="CCCCCC" w:sz="1"/>
-            </w:tcBorders>
-            <w:shd w:fill="FFFFFF" w:val="clear"/>
-            <w:tcMar>
-              <w:top w:type="dxa" w:w="80"/>
-              <w:left w:type="dxa" w:w="120"/>
-              <w:bottom w:type="dxa" w:w="80"/>
-              <w:right w:type="dxa" w:w="120"/>
-            </w:tcMar>
-          </w:tcPr>
-          <w:p>
-            <w:r>
-              <w:rPr>
-                <w:b w:val="false"/>
-                <w:bCs w:val="false"/>
-                <w:sz w:val="18"/>
-                <w:szCs w:val="18"/>
-              </w:rPr>
-              <w:t xml:space="default"/>
-            </w:r>
-          </w:p>
-        </w:tc>
-      </w:tr>
-      <w:tr>
-        <w:trPr>
-          <w:tblHeader w:val="false"/>
-        </w:trPr>
-        <w:tc>
-          <w:tcPr>
-            <w:tcW w:type="dxa" w:w="NaN%."/>
-            <w:tcBorders>
-              <w:top w:val="single" w:color="CCCCCC" w:sz="1"/>
-              <w:left w:val="single" w:color="CCCCCC" w:sz="1"/>
-              <w:bottom w:val="single" w:color="CCCCCC" w:sz="1"/>
-              <w:right w:val="single" w:color="CCCCCC" w:sz="1"/>
-            </w:tcBorders>
-            <w:shd w:fill="FFFFFF" w:val="clear"/>
-            <w:tcMar>
-              <w:top w:type="dxa" w:w="80"/>
-              <w:left w:type="dxa" w:w="120"/>
-              <w:bottom w:type="dxa" w:w="80"/>
-              <w:right w:type="dxa" w:w="120"/>
-            </w:tcMar>
-          </w:tcPr>
-          <w:p>
-            <w:r>
-              <w:rPr>
-                <w:b w:val="false"/>
-                <w:bCs w:val="false"/>
-                <w:sz w:val="18"/>
-                <w:szCs w:val="18"/>
-              </w:rPr>
-              <w:t xml:space="preserve">LR-057(P)</w:t>
-            </w:r>
-          </w:p>
-        </w:tc>
-        <w:tc>
-          <w:tcPr>
-            <w:tcW w:type="dxa" w:w="5760"/>
-            <w:tcBorders>
-              <w:top w:val="single" w:color="CCCCCC" w:sz="1"/>
-              <w:left w:val="single" w:color="CCCCCC" w:sz="1"/>
-              <w:bottom w:val="single" w:color="CCCCCC" w:sz="1"/>
-              <w:right w:val="single" w:color="CCCCCC" w:sz="1"/>
-            </w:tcBorders>
-            <w:shd w:fill="FFFFFF" w:val="clear"/>
-            <w:tcMar>
-              <w:top w:type="dxa" w:w="80"/>
-              <w:left w:type="dxa" w:w="120"/>
-              <w:bottom w:type="dxa" w:w="80"/>
-              <w:right w:type="dxa" w:w="120"/>
-            </w:tcMar>
-          </w:tcPr>
-          <w:p>
-            <w:r>
-              <w:rPr>
-                <w:b w:val="false"/>
-                <w:bCs w:val="false"/>
-                <w:sz w:val="18"/>
-                <w:szCs w:val="18"/>
-              </w:rPr>
-              <w:t xml:space="default"/>
+              <w:t xml:space="preserve">The "where the problem appears" is not the same as "where the fix belongs." System 1 defects are intentional. System 2 applies the corrections. Never conflate.</w:t>
+            </w:r>
+          </w:p>
+        </w:tc>
+        <w:tc>
+          <w:tcPr>
+            <w:tcW w:type="dxa" w:w="2160"/>
+            <w:tcBorders>
+              <w:top w:val="single" w:color="CCCCCC" w:sz="1"/>
+              <w:left w:val="single" w:color="CCCCCC" w:sz="1"/>
+              <w:bottom w:val="single" w:color="CCCCCC" w:sz="1"/>
+              <w:right w:val="single" w:color="CCCCCC" w:sz="1"/>
+            </w:tcBorders>
+            <w:shd w:fill="FFFFFF" w:val="clear"/>
+            <w:tcMar>
+              <w:top w:type="dxa" w:w="80"/>
+              <w:left w:type="dxa" w:w="120"/>
+              <w:bottom w:type="dxa" w:w="80"/>
+              <w:right w:type="dxa" w:w="120"/>
+            </w:tcMar>
+          </w:tcPr>
+          <w:p>
+            <w:r>
+              <w:rPr>
+                <w:b w:val="false"/>
+                <w:bCs w:val="false"/>
+                <w:sz w:val="18"/>
+                <w:szCs w:val="18"/>
+              </w:rPr>
+              <w:t xml:space="preserve">LENS-010</w:t>
             </w:r>
           </w:p>
         </w:tc>
@@ -4486,6 +7049,11 @@
     </w:p>
     <w:p>
       <w:r>
+        <w:t xml:space="preserve"/>
+      </w:r>
+    </w:p>
+    <w:p>
+      <w:r>
         <w:rPr>
           <w:b w:val="false"/>
           <w:bCs w:val="false"/>
@@ -4493,7 +7061,19 @@
           <w:sz w:val="20"/>
           <w:szCs w:val="20"/>
         </w:rPr>
-        <w:t xml:space="preserve">End of Rules Registry  |  Updated: LENS-009</w:t>
+        <w:t xml:space="preserve">End of Rules Registry  |  63 rules total  |  Updated: LENS-010</w:t>
+      </w:r>
+    </w:p>
+    <w:p>
+      <w:r>
+        <w:rPr>
+          <w:b/>
+          <w:bCs/>
+          <w:color w:val="8B0000"/>
+          <w:sz w:val="20"/>
+          <w:szCs w:val="20"/>
+        </w:rPr>
+        <w:t xml:space="preserve">LR-058 through LR-063: Three-System Architecture Rules — permanent, non-overridable.</w:t>
       </w:r>
     </w:p>
     <w:sectPr>
@@ -4683,30 +7263,6 @@
     </w:lvl>
   </w:abstractNum>
   <w:abstractNum w:abstractNumId="3" w15:restartNumberingAfterBreak="0">
-    <w:multiLevelType w:val="hybridMultilevel"/>
-    <w:lvl w:ilvl="0" w15:tentative="1">
-      <w:start w:val="1"/>
-      <w:numFmt w:val="bullet"/>
-      <w:lvlText w:val="☐"/>
-      <w:lvlJc w:val="left"/>
-      <w:pPr>
-        <w:ind w:left="720" w:hanging="360"/>
-      </w:pPr>
-    </w:lvl>
-  </w:abstractNum>
-  <w:abstractNum w:abstractNumId="4" w15:restartNumberingAfterBreak="0">
-    <w:multiLevelType w:val="hybridMultilevel"/>
-    <w:lvl w:ilvl="0" w15:tentative="1">
-      <w:start w:val="1"/>
-      <w:numFmt w:val="bullet"/>
-      <w:lvlText w:val="✅"/>
-      <w:lvlJc w:val="left"/>
-      <w:pPr>
-        <w:ind w:left="720" w:hanging="360"/>
-      </w:pPr>
-    </w:lvl>
-  </w:abstractNum>
-  <w:abstractNum w:abstractNumId="5" w15:restartNumberingAfterBreak="0">
     <w:multiLevelType w:val="hybridMultilevel"/>
     <w:lvl w:ilvl="0" w15:tentative="1">
       <w:start w:val="1"/>

</xml_diff>

<commit_message>
rules: add LR-064 — session open rule, todo list is authority LENS-010
</commit_message>
<xml_diff>
--- a/lens-DOC-002_rules.docx
+++ b/lens-DOC-002_rules.docx
@@ -19,7 +19,7 @@
           <w:sz w:val="20"/>
           <w:szCs w:val="20"/>
         </w:rPr>
-        <w:t xml:space="preserve">Document: lens-DOC-002_rules  |  Updated: LENS-010  |  Total Rules: 63</w:t>
+        <w:t xml:space="preserve">Document: lens-DOC-002_rules  |  Updated: LENS-010  |  Total Rules: 64</w:t>
       </w:r>
     </w:p>
     <w:p>
@@ -31,7 +31,7 @@
           <w:sz w:val="20"/>
           <w:szCs w:val="20"/>
         </w:rPr>
-        <w:t xml:space="preserve">LENS-010 additions: LR-058(A), LR-059(A), LR-060(A), LR-061(A), LR-062(A), LR-063(A)</w:t>
+        <w:t xml:space="preserve">LENS-010 additions highlighted: LR-058 to LR-064</w:t>
       </w:r>
     </w:p>
     <w:p>
@@ -58,7 +58,7 @@
           <w:sz w:val="20"/>
           <w:szCs w:val="20"/>
         </w:rPr>
-        <w:t xml:space="preserve">CRITICAL NEW — Three-System Architecture Rules (added LENS-010):</w:t>
+        <w:t xml:space="preserve">NEW CRITICAL RULES — LENS-010:</w:t>
       </w:r>
     </w:p>
     <w:p>
@@ -75,7 +75,7 @@
           <w:sz w:val="20"/>
           <w:szCs w:val="20"/>
         </w:rPr>
-        <w:t xml:space="preserve">LR-058(A): System boundary checkpoint — never touch System 1 without explicit architectural justification.</w:t>
+        <w:t xml:space="preserve">LR-058(A): System boundary checkpoint — never touch System 1 without justification.</w:t>
       </w:r>
     </w:p>
     <w:p>
@@ -87,7 +87,7 @@
           <w:sz w:val="20"/>
           <w:szCs w:val="20"/>
         </w:rPr>
-        <w:t xml:space="preserve">LR-059(A): System 1 is the unprotected canary. Never add injection-filtering to it.</w:t>
+        <w:t xml:space="preserve">LR-059(A): System 1 is the unprotected canary. Never add filtering to it.</w:t>
       </w:r>
     </w:p>
     <w:p>
@@ -99,7 +99,7 @@
           <w:sz w:val="20"/>
           <w:szCs w:val="20"/>
         </w:rPr>
-        <w:t xml:space="preserve">LR-061(A): Resilient scoring belongs to System 2 (S2-B), NOT to fetch_text.py.</w:t>
+        <w:t xml:space="preserve">LR-061(A): Resilient scoring belongs to System 2 S2-B, NOT fetch_text.py.</w:t>
       </w:r>
     </w:p>
     <w:p>
@@ -111,7 +111,19 @@
           <w:sz w:val="20"/>
           <w:szCs w:val="20"/>
         </w:rPr>
-        <w:t xml:space="preserve">LR-063(A): "Where the problem appears" ≠ "where the fix belongs."</w:t>
+        <w:t xml:space="preserve">LR-063(A): Where-problem-appears is not where-fix-belongs.</w:t>
+      </w:r>
+    </w:p>
+    <w:p>
+      <w:r>
+        <w:rPr>
+          <w:b w:val="false"/>
+          <w:bCs w:val="false"/>
+          <w:color w:val="8B0000"/>
+          <w:sz w:val="20"/>
+          <w:szCs w:val="20"/>
+        </w:rPr>
+        <w:t xml:space="preserve">LR-064(P): Session open rule — first option must come from todo list, not AI enthusiasm.</w:t>
       </w:r>
     </w:p>
     <w:p>
@@ -769,7 +781,467 @@
                 <w:sz w:val="18"/>
                 <w:szCs w:val="18"/>
               </w:rPr>
-              <w:t xml:space="preserve">System boundary checkpoint. Before modifying any existing script, explicitly state which system it belongs to. System 1 scripts (fetch_text.py, analyze_lens_multi.py, lens_orchestrator.py) are FROZEN except for the single approved metadata tag addition. Any proposed change to a System 1 script requires explicit architectural justification before a single line is written. Checkpoint question: "Which system does this change belong to — and does the architecture authorize this system to receive this change?"</w:t>
+              <w:t xml:space="preserve">System boundary checkpoint. Before modifying any existing script, explicitly state which system it belongs to. System 1 scripts (fetch_text.py, analyze_lens_multi.py, lens_orchestrator.py) are FROZEN except for the single approved metadata tag addition. Any proposed change to a System 1 script requires explicit architectural justification before a single line is written.</w:t>
+            </w:r>
+          </w:p>
+        </w:tc>
+        <w:tc>
+          <w:tcPr>
+            <w:tcW w:type="dxa" w:w="2160"/>
+            <w:tcBorders>
+              <w:top w:val="single" w:color="CCCCCC" w:sz="1"/>
+              <w:left w:val="single" w:color="CCCCCC" w:sz="1"/>
+              <w:bottom w:val="single" w:color="CCCCCC" w:sz="1"/>
+              <w:right w:val="single" w:color="CCCCCC" w:sz="1"/>
+            </w:tcBorders>
+            <w:shd w:fill="FFFFFF" w:val="clear"/>
+            <w:tcMar>
+              <w:top w:type="dxa" w:w="80"/>
+              <w:left w:type="dxa" w:w="120"/>
+              <w:bottom w:type="dxa" w:w="80"/>
+              <w:right w:type="dxa" w:w="120"/>
+            </w:tcMar>
+          </w:tcPr>
+          <w:p>
+            <w:r>
+              <w:rPr>
+                <w:b w:val="false"/>
+                <w:bCs w:val="false"/>
+                <w:sz w:val="18"/>
+                <w:szCs w:val="18"/>
+              </w:rPr>
+              <w:t xml:space="preserve">LENS-010</w:t>
+            </w:r>
+          </w:p>
+        </w:tc>
+      </w:tr>
+      <w:tr>
+        <w:trPr>
+          <w:tblHeader w:val="false"/>
+        </w:trPr>
+        <w:tc>
+          <w:tcPr>
+            <w:tcW w:type="dxa" w:w="1440"/>
+            <w:tcBorders>
+              <w:top w:val="single" w:color="CCCCCC" w:sz="1"/>
+              <w:left w:val="single" w:color="CCCCCC" w:sz="1"/>
+              <w:bottom w:val="single" w:color="CCCCCC" w:sz="1"/>
+              <w:right w:val="single" w:color="CCCCCC" w:sz="1"/>
+            </w:tcBorders>
+            <w:shd w:fill="FFFFFF" w:val="clear"/>
+            <w:tcMar>
+              <w:top w:type="dxa" w:w="80"/>
+              <w:left w:type="dxa" w:w="120"/>
+              <w:bottom w:type="dxa" w:w="80"/>
+              <w:right w:type="dxa" w:w="120"/>
+            </w:tcMar>
+          </w:tcPr>
+          <w:p>
+            <w:r>
+              <w:rPr>
+                <w:b w:val="false"/>
+                <w:bCs w:val="false"/>
+                <w:sz w:val="18"/>
+                <w:szCs w:val="18"/>
+              </w:rPr>
+              <w:t xml:space="preserve">LR-059(A)</w:t>
+            </w:r>
+          </w:p>
+        </w:tc>
+        <w:tc>
+          <w:tcPr>
+            <w:tcW w:type="dxa" w:w="5760"/>
+            <w:tcBorders>
+              <w:top w:val="single" w:color="CCCCCC" w:sz="1"/>
+              <w:left w:val="single" w:color="CCCCCC" w:sz="1"/>
+              <w:bottom w:val="single" w:color="CCCCCC" w:sz="1"/>
+              <w:right w:val="single" w:color="CCCCCC" w:sz="1"/>
+            </w:tcBorders>
+            <w:shd w:fill="FFFFFF" w:val="clear"/>
+            <w:tcMar>
+              <w:top w:type="dxa" w:w="80"/>
+              <w:left w:type="dxa" w:w="120"/>
+              <w:bottom w:type="dxa" w:w="80"/>
+              <w:right w:type="dxa" w:w="120"/>
+            </w:tcMar>
+          </w:tcPr>
+          <w:p>
+            <w:r>
+              <w:rPr>
+                <w:b w:val="false"/>
+                <w:bCs w:val="false"/>
+                <w:sz w:val="18"/>
+                <w:szCs w:val="18"/>
+              </w:rPr>
+              <w:t xml:space="preserve">System 1 is the unprotected canary. It MUST NOT be protected, sanitized, or have injection-filtering logic added. Modifying System 1 to reduce injection absorption destroys the data System 2 needs to function.</w:t>
+            </w:r>
+          </w:p>
+        </w:tc>
+        <w:tc>
+          <w:tcPr>
+            <w:tcW w:type="dxa" w:w="2160"/>
+            <w:tcBorders>
+              <w:top w:val="single" w:color="CCCCCC" w:sz="1"/>
+              <w:left w:val="single" w:color="CCCCCC" w:sz="1"/>
+              <w:bottom w:val="single" w:color="CCCCCC" w:sz="1"/>
+              <w:right w:val="single" w:color="CCCCCC" w:sz="1"/>
+            </w:tcBorders>
+            <w:shd w:fill="FFFFFF" w:val="clear"/>
+            <w:tcMar>
+              <w:top w:type="dxa" w:w="80"/>
+              <w:left w:type="dxa" w:w="120"/>
+              <w:bottom w:type="dxa" w:w="80"/>
+              <w:right w:type="dxa" w:w="120"/>
+            </w:tcMar>
+          </w:tcPr>
+          <w:p>
+            <w:r>
+              <w:rPr>
+                <w:b w:val="false"/>
+                <w:bCs w:val="false"/>
+                <w:sz w:val="18"/>
+                <w:szCs w:val="18"/>
+              </w:rPr>
+              <w:t xml:space="preserve">LENS-010</w:t>
+            </w:r>
+          </w:p>
+        </w:tc>
+      </w:tr>
+      <w:tr>
+        <w:trPr>
+          <w:tblHeader w:val="false"/>
+        </w:trPr>
+        <w:tc>
+          <w:tcPr>
+            <w:tcW w:type="dxa" w:w="1440"/>
+            <w:tcBorders>
+              <w:top w:val="single" w:color="CCCCCC" w:sz="1"/>
+              <w:left w:val="single" w:color="CCCCCC" w:sz="1"/>
+              <w:bottom w:val="single" w:color="CCCCCC" w:sz="1"/>
+              <w:right w:val="single" w:color="CCCCCC" w:sz="1"/>
+            </w:tcBorders>
+            <w:shd w:fill="FFFFFF" w:val="clear"/>
+            <w:tcMar>
+              <w:top w:type="dxa" w:w="80"/>
+              <w:left w:type="dxa" w:w="120"/>
+              <w:bottom w:type="dxa" w:w="80"/>
+              <w:right w:type="dxa" w:w="120"/>
+            </w:tcMar>
+          </w:tcPr>
+          <w:p>
+            <w:r>
+              <w:rPr>
+                <w:b w:val="false"/>
+                <w:bCs w:val="false"/>
+                <w:sz w:val="18"/>
+                <w:szCs w:val="18"/>
+              </w:rPr>
+              <w:t xml:space="preserve">LR-060(A)</w:t>
+            </w:r>
+          </w:p>
+        </w:tc>
+        <w:tc>
+          <w:tcPr>
+            <w:tcW w:type="dxa" w:w="5760"/>
+            <w:tcBorders>
+              <w:top w:val="single" w:color="CCCCCC" w:sz="1"/>
+              <w:left w:val="single" w:color="CCCCCC" w:sz="1"/>
+              <w:bottom w:val="single" w:color="CCCCCC" w:sz="1"/>
+              <w:right w:val="single" w:color="CCCCCC" w:sz="1"/>
+            </w:tcBorders>
+            <w:shd w:fill="FFFFFF" w:val="clear"/>
+            <w:tcMar>
+              <w:top w:type="dxa" w:w="80"/>
+              <w:left w:type="dxa" w:w="120"/>
+              <w:bottom w:type="dxa" w:w="80"/>
+              <w:right w:type="dxa" w:w="120"/>
+            </w:tcMar>
+          </w:tcPr>
+          <w:p>
+            <w:r>
+              <w:rPr>
+                <w:b w:val="false"/>
+                <w:bCs w:val="false"/>
+                <w:sz w:val="18"/>
+                <w:szCs w:val="18"/>
+              </w:rPr>
+              <w:t xml:space="preserve">One-way information flow is absolute. System 1 reads only external sources. System 2 reads System 1 outputs + its own Tier C sources. System 3 reads everything. No reverse flow. No cross-system contamination.</w:t>
+            </w:r>
+          </w:p>
+        </w:tc>
+        <w:tc>
+          <w:tcPr>
+            <w:tcW w:type="dxa" w:w="2160"/>
+            <w:tcBorders>
+              <w:top w:val="single" w:color="CCCCCC" w:sz="1"/>
+              <w:left w:val="single" w:color="CCCCCC" w:sz="1"/>
+              <w:bottom w:val="single" w:color="CCCCCC" w:sz="1"/>
+              <w:right w:val="single" w:color="CCCCCC" w:sz="1"/>
+            </w:tcBorders>
+            <w:shd w:fill="FFFFFF" w:val="clear"/>
+            <w:tcMar>
+              <w:top w:type="dxa" w:w="80"/>
+              <w:left w:type="dxa" w:w="120"/>
+              <w:bottom w:type="dxa" w:w="80"/>
+              <w:right w:type="dxa" w:w="120"/>
+            </w:tcMar>
+          </w:tcPr>
+          <w:p>
+            <w:r>
+              <w:rPr>
+                <w:b w:val="false"/>
+                <w:bCs w:val="false"/>
+                <w:sz w:val="18"/>
+                <w:szCs w:val="18"/>
+              </w:rPr>
+              <w:t xml:space="preserve">LENS-008</w:t>
+            </w:r>
+          </w:p>
+        </w:tc>
+      </w:tr>
+      <w:tr>
+        <w:trPr>
+          <w:tblHeader w:val="false"/>
+        </w:trPr>
+        <w:tc>
+          <w:tcPr>
+            <w:tcW w:type="dxa" w:w="1440"/>
+            <w:tcBorders>
+              <w:top w:val="single" w:color="CCCCCC" w:sz="1"/>
+              <w:left w:val="single" w:color="CCCCCC" w:sz="1"/>
+              <w:bottom w:val="single" w:color="CCCCCC" w:sz="1"/>
+              <w:right w:val="single" w:color="CCCCCC" w:sz="1"/>
+            </w:tcBorders>
+            <w:shd w:fill="FFFFFF" w:val="clear"/>
+            <w:tcMar>
+              <w:top w:type="dxa" w:w="80"/>
+              <w:left w:type="dxa" w:w="120"/>
+              <w:bottom w:type="dxa" w:w="80"/>
+              <w:right w:type="dxa" w:w="120"/>
+            </w:tcMar>
+          </w:tcPr>
+          <w:p>
+            <w:r>
+              <w:rPr>
+                <w:b w:val="false"/>
+                <w:bCs w:val="false"/>
+                <w:sz w:val="18"/>
+                <w:szCs w:val="18"/>
+              </w:rPr>
+              <w:t xml:space="preserve">LR-061(A)</w:t>
+            </w:r>
+          </w:p>
+        </w:tc>
+        <w:tc>
+          <w:tcPr>
+            <w:tcW w:type="dxa" w:w="5760"/>
+            <w:tcBorders>
+              <w:top w:val="single" w:color="CCCCCC" w:sz="1"/>
+              <w:left w:val="single" w:color="CCCCCC" w:sz="1"/>
+              <w:bottom w:val="single" w:color="CCCCCC" w:sz="1"/>
+              <w:right w:val="single" w:color="CCCCCC" w:sz="1"/>
+            </w:tcBorders>
+            <w:shd w:fill="FFFFFF" w:val="clear"/>
+            <w:tcMar>
+              <w:top w:type="dxa" w:w="80"/>
+              <w:left w:type="dxa" w:w="120"/>
+              <w:bottom w:type="dxa" w:w="80"/>
+              <w:right w:type="dxa" w:w="120"/>
+            </w:tcMar>
+          </w:tcPr>
+          <w:p>
+            <w:r>
+              <w:rPr>
+                <w:b w:val="false"/>
+                <w:bCs w:val="false"/>
+                <w:sz w:val="18"/>
+                <w:szCs w:val="18"/>
+              </w:rPr>
+              <w:t xml:space="preserve">Resilient scoring (source diversity, permanence weighting, consensus anomaly detection) belongs to System 2 (S2-B Coordination Analyzer). It is applied as corrections to System 1 output — NOT as changes to fetch_text.py.</w:t>
+            </w:r>
+          </w:p>
+        </w:tc>
+        <w:tc>
+          <w:tcPr>
+            <w:tcW w:type="dxa" w:w="2160"/>
+            <w:tcBorders>
+              <w:top w:val="single" w:color="CCCCCC" w:sz="1"/>
+              <w:left w:val="single" w:color="CCCCCC" w:sz="1"/>
+              <w:bottom w:val="single" w:color="CCCCCC" w:sz="1"/>
+              <w:right w:val="single" w:color="CCCCCC" w:sz="1"/>
+            </w:tcBorders>
+            <w:shd w:fill="FFFFFF" w:val="clear"/>
+            <w:tcMar>
+              <w:top w:type="dxa" w:w="80"/>
+              <w:left w:type="dxa" w:w="120"/>
+              <w:bottom w:type="dxa" w:w="80"/>
+              <w:right w:type="dxa" w:w="120"/>
+            </w:tcMar>
+          </w:tcPr>
+          <w:p>
+            <w:r>
+              <w:rPr>
+                <w:b w:val="false"/>
+                <w:bCs w:val="false"/>
+                <w:sz w:val="18"/>
+                <w:szCs w:val="18"/>
+              </w:rPr>
+              <w:t xml:space="preserve">LENS-010</w:t>
+            </w:r>
+          </w:p>
+        </w:tc>
+      </w:tr>
+      <w:tr>
+        <w:trPr>
+          <w:tblHeader w:val="false"/>
+        </w:trPr>
+        <w:tc>
+          <w:tcPr>
+            <w:tcW w:type="dxa" w:w="1440"/>
+            <w:tcBorders>
+              <w:top w:val="single" w:color="CCCCCC" w:sz="1"/>
+              <w:left w:val="single" w:color="CCCCCC" w:sz="1"/>
+              <w:bottom w:val="single" w:color="CCCCCC" w:sz="1"/>
+              <w:right w:val="single" w:color="CCCCCC" w:sz="1"/>
+            </w:tcBorders>
+            <w:shd w:fill="FFFFFF" w:val="clear"/>
+            <w:tcMar>
+              <w:top w:type="dxa" w:w="80"/>
+              <w:left w:type="dxa" w:w="120"/>
+              <w:bottom w:type="dxa" w:w="80"/>
+              <w:right w:type="dxa" w:w="120"/>
+            </w:tcMar>
+          </w:tcPr>
+          <w:p>
+            <w:r>
+              <w:rPr>
+                <w:b w:val="false"/>
+                <w:bCs w:val="false"/>
+                <w:sz w:val="18"/>
+                <w:szCs w:val="18"/>
+              </w:rPr>
+              <w:t xml:space="preserve">LR-062(A)</w:t>
+            </w:r>
+          </w:p>
+        </w:tc>
+        <w:tc>
+          <w:tcPr>
+            <w:tcW w:type="dxa" w:w="5760"/>
+            <w:tcBorders>
+              <w:top w:val="single" w:color="CCCCCC" w:sz="1"/>
+              <w:left w:val="single" w:color="CCCCCC" w:sz="1"/>
+              <w:bottom w:val="single" w:color="CCCCCC" w:sz="1"/>
+              <w:right w:val="single" w:color="CCCCCC" w:sz="1"/>
+            </w:tcBorders>
+            <w:shd w:fill="FFFFFF" w:val="clear"/>
+            <w:tcMar>
+              <w:top w:type="dxa" w:w="80"/>
+              <w:left w:type="dxa" w:w="120"/>
+              <w:bottom w:type="dxa" w:w="80"/>
+              <w:right w:type="dxa" w:w="120"/>
+            </w:tcMar>
+          </w:tcPr>
+          <w:p>
+            <w:r>
+              <w:rPr>
+                <w:b w:val="false"/>
+                <w:bCs w:val="false"/>
+                <w:sz w:val="18"/>
+                <w:szCs w:val="18"/>
+              </w:rPr>
+              <w:t xml:space="preserve">System 1 metadata tag is the ONLY permitted addition: system=S1, protected=false, injection_assumed=true. Nothing else.</w:t>
+            </w:r>
+          </w:p>
+        </w:tc>
+        <w:tc>
+          <w:tcPr>
+            <w:tcW w:type="dxa" w:w="2160"/>
+            <w:tcBorders>
+              <w:top w:val="single" w:color="CCCCCC" w:sz="1"/>
+              <w:left w:val="single" w:color="CCCCCC" w:sz="1"/>
+              <w:bottom w:val="single" w:color="CCCCCC" w:sz="1"/>
+              <w:right w:val="single" w:color="CCCCCC" w:sz="1"/>
+            </w:tcBorders>
+            <w:shd w:fill="FFFFFF" w:val="clear"/>
+            <w:tcMar>
+              <w:top w:type="dxa" w:w="80"/>
+              <w:left w:type="dxa" w:w="120"/>
+              <w:bottom w:type="dxa" w:w="80"/>
+              <w:right w:type="dxa" w:w="120"/>
+            </w:tcMar>
+          </w:tcPr>
+          <w:p>
+            <w:r>
+              <w:rPr>
+                <w:b w:val="false"/>
+                <w:bCs w:val="false"/>
+                <w:sz w:val="18"/>
+                <w:szCs w:val="18"/>
+              </w:rPr>
+              <w:t xml:space="preserve">LENS-008</w:t>
+            </w:r>
+          </w:p>
+        </w:tc>
+      </w:tr>
+      <w:tr>
+        <w:trPr>
+          <w:tblHeader w:val="false"/>
+        </w:trPr>
+        <w:tc>
+          <w:tcPr>
+            <w:tcW w:type="dxa" w:w="1440"/>
+            <w:tcBorders>
+              <w:top w:val="single" w:color="CCCCCC" w:sz="1"/>
+              <w:left w:val="single" w:color="CCCCCC" w:sz="1"/>
+              <w:bottom w:val="single" w:color="CCCCCC" w:sz="1"/>
+              <w:right w:val="single" w:color="CCCCCC" w:sz="1"/>
+            </w:tcBorders>
+            <w:shd w:fill="FFFFFF" w:val="clear"/>
+            <w:tcMar>
+              <w:top w:type="dxa" w:w="80"/>
+              <w:left w:type="dxa" w:w="120"/>
+              <w:bottom w:type="dxa" w:w="80"/>
+              <w:right w:type="dxa" w:w="120"/>
+            </w:tcMar>
+          </w:tcPr>
+          <w:p>
+            <w:r>
+              <w:rPr>
+                <w:b w:val="false"/>
+                <w:bCs w:val="false"/>
+                <w:sz w:val="18"/>
+                <w:szCs w:val="18"/>
+              </w:rPr>
+              <w:t xml:space="preserve">LR-063(A)</w:t>
+            </w:r>
+          </w:p>
+        </w:tc>
+        <w:tc>
+          <w:tcPr>
+            <w:tcW w:type="dxa" w:w="5760"/>
+            <w:tcBorders>
+              <w:top w:val="single" w:color="CCCCCC" w:sz="1"/>
+              <w:left w:val="single" w:color="CCCCCC" w:sz="1"/>
+              <w:bottom w:val="single" w:color="CCCCCC" w:sz="1"/>
+              <w:right w:val="single" w:color="CCCCCC" w:sz="1"/>
+            </w:tcBorders>
+            <w:shd w:fill="FFFFFF" w:val="clear"/>
+            <w:tcMar>
+              <w:top w:type="dxa" w:w="80"/>
+              <w:left w:type="dxa" w:w="120"/>
+              <w:bottom w:type="dxa" w:w="80"/>
+              <w:right w:type="dxa" w:w="120"/>
+            </w:tcMar>
+          </w:tcPr>
+          <w:p>
+            <w:r>
+              <w:rPr>
+                <w:b w:val="false"/>
+                <w:bCs w:val="false"/>
+                <w:sz w:val="18"/>
+                <w:szCs w:val="18"/>
+              </w:rPr>
+              <w:t xml:space="preserve">The where-the-problem-appears is not the same as where-the-fix-belongs. System 1 defects are intentional. System 2 applies corrections. Never conflate.</w:t>
             </w:r>
           </w:p>
         </w:tc>
@@ -2398,6 +2870,98 @@
           </w:p>
         </w:tc>
       </w:tr>
+      <w:tr>
+        <w:trPr>
+          <w:tblHeader w:val="false"/>
+        </w:trPr>
+        <w:tc>
+          <w:tcPr>
+            <w:tcW w:type="dxa" w:w="1440"/>
+            <w:tcBorders>
+              <w:top w:val="single" w:color="CCCCCC" w:sz="1"/>
+              <w:left w:val="single" w:color="CCCCCC" w:sz="1"/>
+              <w:bottom w:val="single" w:color="CCCCCC" w:sz="1"/>
+              <w:right w:val="single" w:color="CCCCCC" w:sz="1"/>
+            </w:tcBorders>
+            <w:shd w:fill="FFFFFF" w:val="clear"/>
+            <w:tcMar>
+              <w:top w:type="dxa" w:w="80"/>
+              <w:left w:type="dxa" w:w="120"/>
+              <w:bottom w:type="dxa" w:w="80"/>
+              <w:right w:type="dxa" w:w="120"/>
+            </w:tcMar>
+          </w:tcPr>
+          <w:p>
+            <w:r>
+              <w:rPr>
+                <w:b w:val="false"/>
+                <w:bCs w:val="false"/>
+                <w:sz w:val="18"/>
+                <w:szCs w:val="18"/>
+              </w:rPr>
+              <w:t xml:space="preserve">LR-064(P)</w:t>
+            </w:r>
+          </w:p>
+        </w:tc>
+        <w:tc>
+          <w:tcPr>
+            <w:tcW w:type="dxa" w:w="5760"/>
+            <w:tcBorders>
+              <w:top w:val="single" w:color="CCCCCC" w:sz="1"/>
+              <w:left w:val="single" w:color="CCCCCC" w:sz="1"/>
+              <w:bottom w:val="single" w:color="CCCCCC" w:sz="1"/>
+              <w:right w:val="single" w:color="CCCCCC" w:sz="1"/>
+            </w:tcBorders>
+            <w:shd w:fill="FFFFFF" w:val="clear"/>
+            <w:tcMar>
+              <w:top w:type="dxa" w:w="80"/>
+              <w:left w:type="dxa" w:w="120"/>
+              <w:bottom w:type="dxa" w:w="80"/>
+              <w:right w:type="dxa" w:w="120"/>
+            </w:tcMar>
+          </w:tcPr>
+          <w:p>
+            <w:r>
+              <w:rPr>
+                <w:b w:val="false"/>
+                <w:bCs w:val="false"/>
+                <w:sz w:val="18"/>
+                <w:szCs w:val="18"/>
+              </w:rPr>
+              <w:t xml:space="preserve">Session open rule: the first build option presented must come directly from the todo list — not from AI analysis of what is most interesting or architecturally elegant. If the todo list says System 2, the session opens with System 2. Not System 3. Not a scoring fix. The todo list is the authority. AI enthusiasm does not override planned priorities.</w:t>
+            </w:r>
+          </w:p>
+        </w:tc>
+        <w:tc>
+          <w:tcPr>
+            <w:tcW w:type="dxa" w:w="2160"/>
+            <w:tcBorders>
+              <w:top w:val="single" w:color="CCCCCC" w:sz="1"/>
+              <w:left w:val="single" w:color="CCCCCC" w:sz="1"/>
+              <w:bottom w:val="single" w:color="CCCCCC" w:sz="1"/>
+              <w:right w:val="single" w:color="CCCCCC" w:sz="1"/>
+            </w:tcBorders>
+            <w:shd w:fill="FFFFFF" w:val="clear"/>
+            <w:tcMar>
+              <w:top w:type="dxa" w:w="80"/>
+              <w:left w:type="dxa" w:w="120"/>
+              <w:bottom w:type="dxa" w:w="80"/>
+              <w:right w:type="dxa" w:w="120"/>
+            </w:tcMar>
+          </w:tcPr>
+          <w:p>
+            <w:r>
+              <w:rPr>
+                <w:b w:val="false"/>
+                <w:bCs w:val="false"/>
+                <w:sz w:val="18"/>
+                <w:szCs w:val="18"/>
+              </w:rPr>
+              <w:t xml:space="preserve">LENS-010</w:t>
+            </w:r>
+          </w:p>
+        </w:tc>
+      </w:tr>
     </w:tbl>
     <w:p>
       <w:r>
@@ -3714,7 +4278,7 @@
                 <w:sz w:val="18"/>
                 <w:szCs w:val="18"/>
               </w:rPr>
-              <w:t xml:space="preserve">System 1 significance scoring: coverage × recency × velocity. Local computation only. DO NOT modify this formula — it is the canary data. System 2 applies corrections on top.</w:t>
+              <w:t xml:space="preserve">System 1 significance scoring: coverage x recency x velocity. Local computation only. DO NOT modify — it is the canary data. System 2 applies corrections on top.</w:t>
             </w:r>
           </w:p>
         </w:tc>
@@ -6456,589 +7020,6 @@
     </w:p>
     <w:p>
       <w:pPr>
-        <w:pStyle w:val="Heading2"/>
-      </w:pPr>
-      <w:r>
-        <w:t xml:space="preserve">(A2) Architecture — Three-System Rules</w:t>
-      </w:r>
-    </w:p>
-    <w:tbl>
-      <w:tblPr>
-        <w:tblW w:type="dxa" w:w="9360"/>
-        <w:tblBorders>
-          <w:top w:val="single" w:color="auto" w:sz="4"/>
-          <w:left w:val="single" w:color="auto" w:sz="4"/>
-          <w:bottom w:val="single" w:color="auto" w:sz="4"/>
-          <w:right w:val="single" w:color="auto" w:sz="4"/>
-          <w:insideH w:val="single" w:color="auto" w:sz="4"/>
-          <w:insideV w:val="single" w:color="auto" w:sz="4"/>
-        </w:tblBorders>
-      </w:tblPr>
-      <w:tblGrid>
-        <w:gridCol w:w="1440"/>
-        <w:gridCol w:w="5760"/>
-        <w:gridCol w:w="2160"/>
-      </w:tblGrid>
-      <w:tr>
-        <w:trPr>
-          <w:tblHeader/>
-        </w:trPr>
-        <w:tc>
-          <w:tcPr>
-            <w:tcW w:type="dxa" w:w="1440"/>
-            <w:tcBorders>
-              <w:top w:val="single" w:color="CCCCCC" w:sz="1"/>
-              <w:left w:val="single" w:color="CCCCCC" w:sz="1"/>
-              <w:bottom w:val="single" w:color="CCCCCC" w:sz="1"/>
-              <w:right w:val="single" w:color="CCCCCC" w:sz="1"/>
-            </w:tcBorders>
-            <w:shd w:fill="D5E8F0" w:val="clear"/>
-            <w:tcMar>
-              <w:top w:type="dxa" w:w="80"/>
-              <w:left w:type="dxa" w:w="120"/>
-              <w:bottom w:type="dxa" w:w="80"/>
-              <w:right w:type="dxa" w:w="120"/>
-            </w:tcMar>
-          </w:tcPr>
-          <w:p>
-            <w:r>
-              <w:rPr>
-                <w:b/>
-                <w:bCs/>
-                <w:sz w:val="18"/>
-                <w:szCs w:val="18"/>
-              </w:rPr>
-              <w:t xml:space="preserve">Rule</w:t>
-            </w:r>
-          </w:p>
-        </w:tc>
-        <w:tc>
-          <w:tcPr>
-            <w:tcW w:type="dxa" w:w="5760"/>
-            <w:tcBorders>
-              <w:top w:val="single" w:color="CCCCCC" w:sz="1"/>
-              <w:left w:val="single" w:color="CCCCCC" w:sz="1"/>
-              <w:bottom w:val="single" w:color="CCCCCC" w:sz="1"/>
-              <w:right w:val="single" w:color="CCCCCC" w:sz="1"/>
-            </w:tcBorders>
-            <w:shd w:fill="D5E8F0" w:val="clear"/>
-            <w:tcMar>
-              <w:top w:type="dxa" w:w="80"/>
-              <w:left w:type="dxa" w:w="120"/>
-              <w:bottom w:type="dxa" w:w="80"/>
-              <w:right w:type="dxa" w:w="120"/>
-            </w:tcMar>
-          </w:tcPr>
-          <w:p>
-            <w:r>
-              <w:rPr>
-                <w:b/>
-                <w:bCs/>
-                <w:sz w:val="18"/>
-                <w:szCs w:val="18"/>
-              </w:rPr>
-              <w:t xml:space="preserve">Description</w:t>
-            </w:r>
-          </w:p>
-        </w:tc>
-        <w:tc>
-          <w:tcPr>
-            <w:tcW w:type="dxa" w:w="2160"/>
-            <w:tcBorders>
-              <w:top w:val="single" w:color="CCCCCC" w:sz="1"/>
-              <w:left w:val="single" w:color="CCCCCC" w:sz="1"/>
-              <w:bottom w:val="single" w:color="CCCCCC" w:sz="1"/>
-              <w:right w:val="single" w:color="CCCCCC" w:sz="1"/>
-            </w:tcBorders>
-            <w:shd w:fill="D5E8F0" w:val="clear"/>
-            <w:tcMar>
-              <w:top w:type="dxa" w:w="80"/>
-              <w:left w:type="dxa" w:w="120"/>
-              <w:bottom w:type="dxa" w:w="80"/>
-              <w:right w:type="dxa" w:w="120"/>
-            </w:tcMar>
-          </w:tcPr>
-          <w:p>
-            <w:r>
-              <w:rPr>
-                <w:b/>
-                <w:bCs/>
-                <w:sz w:val="18"/>
-                <w:szCs w:val="18"/>
-              </w:rPr>
-              <w:t xml:space="preserve">Added</w:t>
-            </w:r>
-          </w:p>
-        </w:tc>
-      </w:tr>
-      <w:tr>
-        <w:trPr>
-          <w:tblHeader w:val="false"/>
-        </w:trPr>
-        <w:tc>
-          <w:tcPr>
-            <w:tcW w:type="dxa" w:w="1440"/>
-            <w:tcBorders>
-              <w:top w:val="single" w:color="CCCCCC" w:sz="1"/>
-              <w:left w:val="single" w:color="CCCCCC" w:sz="1"/>
-              <w:bottom w:val="single" w:color="CCCCCC" w:sz="1"/>
-              <w:right w:val="single" w:color="CCCCCC" w:sz="1"/>
-            </w:tcBorders>
-            <w:shd w:fill="FFFFFF" w:val="clear"/>
-            <w:tcMar>
-              <w:top w:type="dxa" w:w="80"/>
-              <w:left w:type="dxa" w:w="120"/>
-              <w:bottom w:type="dxa" w:w="80"/>
-              <w:right w:type="dxa" w:w="120"/>
-            </w:tcMar>
-          </w:tcPr>
-          <w:p>
-            <w:r>
-              <w:rPr>
-                <w:b w:val="false"/>
-                <w:bCs w:val="false"/>
-                <w:sz w:val="18"/>
-                <w:szCs w:val="18"/>
-              </w:rPr>
-              <w:t xml:space="preserve">LR-059(A)</w:t>
-            </w:r>
-          </w:p>
-        </w:tc>
-        <w:tc>
-          <w:tcPr>
-            <w:tcW w:type="dxa" w:w="5760"/>
-            <w:tcBorders>
-              <w:top w:val="single" w:color="CCCCCC" w:sz="1"/>
-              <w:left w:val="single" w:color="CCCCCC" w:sz="1"/>
-              <w:bottom w:val="single" w:color="CCCCCC" w:sz="1"/>
-              <w:right w:val="single" w:color="CCCCCC" w:sz="1"/>
-            </w:tcBorders>
-            <w:shd w:fill="FFFFFF" w:val="clear"/>
-            <w:tcMar>
-              <w:top w:type="dxa" w:w="80"/>
-              <w:left w:type="dxa" w:w="120"/>
-              <w:bottom w:type="dxa" w:w="80"/>
-              <w:right w:type="dxa" w:w="120"/>
-            </w:tcMar>
-          </w:tcPr>
-          <w:p>
-            <w:r>
-              <w:rPr>
-                <w:b w:val="false"/>
-                <w:bCs w:val="false"/>
-                <w:sz w:val="18"/>
-                <w:szCs w:val="18"/>
-              </w:rPr>
-              <w:t xml:space="preserve">System 1 is the unprotected canary. It MUST NOT be protected, sanitized, or have injection-filtering logic added. Modifying System 1 to reduce injection absorption destroys the data System 2 needs to function.</w:t>
-            </w:r>
-          </w:p>
-        </w:tc>
-        <w:tc>
-          <w:tcPr>
-            <w:tcW w:type="dxa" w:w="2160"/>
-            <w:tcBorders>
-              <w:top w:val="single" w:color="CCCCCC" w:sz="1"/>
-              <w:left w:val="single" w:color="CCCCCC" w:sz="1"/>
-              <w:bottom w:val="single" w:color="CCCCCC" w:sz="1"/>
-              <w:right w:val="single" w:color="CCCCCC" w:sz="1"/>
-            </w:tcBorders>
-            <w:shd w:fill="FFFFFF" w:val="clear"/>
-            <w:tcMar>
-              <w:top w:type="dxa" w:w="80"/>
-              <w:left w:type="dxa" w:w="120"/>
-              <w:bottom w:type="dxa" w:w="80"/>
-              <w:right w:type="dxa" w:w="120"/>
-            </w:tcMar>
-          </w:tcPr>
-          <w:p>
-            <w:r>
-              <w:rPr>
-                <w:b w:val="false"/>
-                <w:bCs w:val="false"/>
-                <w:sz w:val="18"/>
-                <w:szCs w:val="18"/>
-              </w:rPr>
-              <w:t xml:space="preserve">LENS-010</w:t>
-            </w:r>
-          </w:p>
-        </w:tc>
-      </w:tr>
-      <w:tr>
-        <w:trPr>
-          <w:tblHeader w:val="false"/>
-        </w:trPr>
-        <w:tc>
-          <w:tcPr>
-            <w:tcW w:type="dxa" w:w="1440"/>
-            <w:tcBorders>
-              <w:top w:val="single" w:color="CCCCCC" w:sz="1"/>
-              <w:left w:val="single" w:color="CCCCCC" w:sz="1"/>
-              <w:bottom w:val="single" w:color="CCCCCC" w:sz="1"/>
-              <w:right w:val="single" w:color="CCCCCC" w:sz="1"/>
-            </w:tcBorders>
-            <w:shd w:fill="FFFFFF" w:val="clear"/>
-            <w:tcMar>
-              <w:top w:type="dxa" w:w="80"/>
-              <w:left w:type="dxa" w:w="120"/>
-              <w:bottom w:type="dxa" w:w="80"/>
-              <w:right w:type="dxa" w:w="120"/>
-            </w:tcMar>
-          </w:tcPr>
-          <w:p>
-            <w:r>
-              <w:rPr>
-                <w:b w:val="false"/>
-                <w:bCs w:val="false"/>
-                <w:sz w:val="18"/>
-                <w:szCs w:val="18"/>
-              </w:rPr>
-              <w:t xml:space="preserve">LR-060(A)</w:t>
-            </w:r>
-          </w:p>
-        </w:tc>
-        <w:tc>
-          <w:tcPr>
-            <w:tcW w:type="dxa" w:w="5760"/>
-            <w:tcBorders>
-              <w:top w:val="single" w:color="CCCCCC" w:sz="1"/>
-              <w:left w:val="single" w:color="CCCCCC" w:sz="1"/>
-              <w:bottom w:val="single" w:color="CCCCCC" w:sz="1"/>
-              <w:right w:val="single" w:color="CCCCCC" w:sz="1"/>
-            </w:tcBorders>
-            <w:shd w:fill="FFFFFF" w:val="clear"/>
-            <w:tcMar>
-              <w:top w:type="dxa" w:w="80"/>
-              <w:left w:type="dxa" w:w="120"/>
-              <w:bottom w:type="dxa" w:w="80"/>
-              <w:right w:type="dxa" w:w="120"/>
-            </w:tcMar>
-          </w:tcPr>
-          <w:p>
-            <w:r>
-              <w:rPr>
-                <w:b w:val="false"/>
-                <w:bCs w:val="false"/>
-                <w:sz w:val="18"/>
-                <w:szCs w:val="18"/>
-              </w:rPr>
-              <w:t xml:space="preserve">One-way information flow is absolute. System 1 reads only external sources. System 2 reads System 1 outputs + its own Tier C sources. System 3 reads everything. No reverse flow. No cross-system contamination.</w:t>
-            </w:r>
-          </w:p>
-        </w:tc>
-        <w:tc>
-          <w:tcPr>
-            <w:tcW w:type="dxa" w:w="2160"/>
-            <w:tcBorders>
-              <w:top w:val="single" w:color="CCCCCC" w:sz="1"/>
-              <w:left w:val="single" w:color="CCCCCC" w:sz="1"/>
-              <w:bottom w:val="single" w:color="CCCCCC" w:sz="1"/>
-              <w:right w:val="single" w:color="CCCCCC" w:sz="1"/>
-            </w:tcBorders>
-            <w:shd w:fill="FFFFFF" w:val="clear"/>
-            <w:tcMar>
-              <w:top w:type="dxa" w:w="80"/>
-              <w:left w:type="dxa" w:w="120"/>
-              <w:bottom w:type="dxa" w:w="80"/>
-              <w:right w:type="dxa" w:w="120"/>
-            </w:tcMar>
-          </w:tcPr>
-          <w:p>
-            <w:r>
-              <w:rPr>
-                <w:b w:val="false"/>
-                <w:bCs w:val="false"/>
-                <w:sz w:val="18"/>
-                <w:szCs w:val="18"/>
-              </w:rPr>
-              <w:t xml:space="preserve">LENS-008</w:t>
-            </w:r>
-          </w:p>
-        </w:tc>
-      </w:tr>
-      <w:tr>
-        <w:trPr>
-          <w:tblHeader w:val="false"/>
-        </w:trPr>
-        <w:tc>
-          <w:tcPr>
-            <w:tcW w:type="dxa" w:w="1440"/>
-            <w:tcBorders>
-              <w:top w:val="single" w:color="CCCCCC" w:sz="1"/>
-              <w:left w:val="single" w:color="CCCCCC" w:sz="1"/>
-              <w:bottom w:val="single" w:color="CCCCCC" w:sz="1"/>
-              <w:right w:val="single" w:color="CCCCCC" w:sz="1"/>
-            </w:tcBorders>
-            <w:shd w:fill="FFFFFF" w:val="clear"/>
-            <w:tcMar>
-              <w:top w:type="dxa" w:w="80"/>
-              <w:left w:type="dxa" w:w="120"/>
-              <w:bottom w:type="dxa" w:w="80"/>
-              <w:right w:type="dxa" w:w="120"/>
-            </w:tcMar>
-          </w:tcPr>
-          <w:p>
-            <w:r>
-              <w:rPr>
-                <w:b w:val="false"/>
-                <w:bCs w:val="false"/>
-                <w:sz w:val="18"/>
-                <w:szCs w:val="18"/>
-              </w:rPr>
-              <w:t xml:space="preserve">LR-061(A)</w:t>
-            </w:r>
-          </w:p>
-        </w:tc>
-        <w:tc>
-          <w:tcPr>
-            <w:tcW w:type="dxa" w:w="5760"/>
-            <w:tcBorders>
-              <w:top w:val="single" w:color="CCCCCC" w:sz="1"/>
-              <w:left w:val="single" w:color="CCCCCC" w:sz="1"/>
-              <w:bottom w:val="single" w:color="CCCCCC" w:sz="1"/>
-              <w:right w:val="single" w:color="CCCCCC" w:sz="1"/>
-            </w:tcBorders>
-            <w:shd w:fill="FFFFFF" w:val="clear"/>
-            <w:tcMar>
-              <w:top w:type="dxa" w:w="80"/>
-              <w:left w:type="dxa" w:w="120"/>
-              <w:bottom w:type="dxa" w:w="80"/>
-              <w:right w:type="dxa" w:w="120"/>
-            </w:tcMar>
-          </w:tcPr>
-          <w:p>
-            <w:r>
-              <w:rPr>
-                <w:b w:val="false"/>
-                <w:bCs w:val="false"/>
-                <w:sz w:val="18"/>
-                <w:szCs w:val="18"/>
-              </w:rPr>
-              <w:t xml:space="preserve">Resilient scoring (source diversity, permanence weighting, consensus anomaly detection) belongs to System 2 (S2-B Coordination Analyzer). It is applied as corrections to System 1 output, NOT as changes to fetch_text.py.</w:t>
-            </w:r>
-          </w:p>
-        </w:tc>
-        <w:tc>
-          <w:tcPr>
-            <w:tcW w:type="dxa" w:w="2160"/>
-            <w:tcBorders>
-              <w:top w:val="single" w:color="CCCCCC" w:sz="1"/>
-              <w:left w:val="single" w:color="CCCCCC" w:sz="1"/>
-              <w:bottom w:val="single" w:color="CCCCCC" w:sz="1"/>
-              <w:right w:val="single" w:color="CCCCCC" w:sz="1"/>
-            </w:tcBorders>
-            <w:shd w:fill="FFFFFF" w:val="clear"/>
-            <w:tcMar>
-              <w:top w:type="dxa" w:w="80"/>
-              <w:left w:type="dxa" w:w="120"/>
-              <w:bottom w:type="dxa" w:w="80"/>
-              <w:right w:type="dxa" w:w="120"/>
-            </w:tcMar>
-          </w:tcPr>
-          <w:p>
-            <w:r>
-              <w:rPr>
-                <w:b w:val="false"/>
-                <w:bCs w:val="false"/>
-                <w:sz w:val="18"/>
-                <w:szCs w:val="18"/>
-              </w:rPr>
-              <w:t xml:space="preserve">LENS-010</w:t>
-            </w:r>
-          </w:p>
-        </w:tc>
-      </w:tr>
-      <w:tr>
-        <w:trPr>
-          <w:tblHeader w:val="false"/>
-        </w:trPr>
-        <w:tc>
-          <w:tcPr>
-            <w:tcW w:type="dxa" w:w="1440"/>
-            <w:tcBorders>
-              <w:top w:val="single" w:color="CCCCCC" w:sz="1"/>
-              <w:left w:val="single" w:color="CCCCCC" w:sz="1"/>
-              <w:bottom w:val="single" w:color="CCCCCC" w:sz="1"/>
-              <w:right w:val="single" w:color="CCCCCC" w:sz="1"/>
-            </w:tcBorders>
-            <w:shd w:fill="FFFFFF" w:val="clear"/>
-            <w:tcMar>
-              <w:top w:type="dxa" w:w="80"/>
-              <w:left w:type="dxa" w:w="120"/>
-              <w:bottom w:type="dxa" w:w="80"/>
-              <w:right w:type="dxa" w:w="120"/>
-            </w:tcMar>
-          </w:tcPr>
-          <w:p>
-            <w:r>
-              <w:rPr>
-                <w:b w:val="false"/>
-                <w:bCs w:val="false"/>
-                <w:sz w:val="18"/>
-                <w:szCs w:val="18"/>
-              </w:rPr>
-              <w:t xml:space="preserve">LR-062(A)</w:t>
-            </w:r>
-          </w:p>
-        </w:tc>
-        <w:tc>
-          <w:tcPr>
-            <w:tcW w:type="dxa" w:w="5760"/>
-            <w:tcBorders>
-              <w:top w:val="single" w:color="CCCCCC" w:sz="1"/>
-              <w:left w:val="single" w:color="CCCCCC" w:sz="1"/>
-              <w:bottom w:val="single" w:color="CCCCCC" w:sz="1"/>
-              <w:right w:val="single" w:color="CCCCCC" w:sz="1"/>
-            </w:tcBorders>
-            <w:shd w:fill="FFFFFF" w:val="clear"/>
-            <w:tcMar>
-              <w:top w:type="dxa" w:w="80"/>
-              <w:left w:type="dxa" w:w="120"/>
-              <w:bottom w:type="dxa" w:w="80"/>
-              <w:right w:type="dxa" w:w="120"/>
-            </w:tcMar>
-          </w:tcPr>
-          <w:p>
-            <w:r>
-              <w:rPr>
-                <w:b w:val="false"/>
-                <w:bCs w:val="false"/>
-                <w:sz w:val="18"/>
-                <w:szCs w:val="18"/>
-              </w:rPr>
-              <w:t xml:space="preserve">System 1 metadata tag is the ONLY permitted addition: system="S1", protected=false, injection_assumed=true. Nothing else.</w:t>
-            </w:r>
-          </w:p>
-        </w:tc>
-        <w:tc>
-          <w:tcPr>
-            <w:tcW w:type="dxa" w:w="2160"/>
-            <w:tcBorders>
-              <w:top w:val="single" w:color="CCCCCC" w:sz="1"/>
-              <w:left w:val="single" w:color="CCCCCC" w:sz="1"/>
-              <w:bottom w:val="single" w:color="CCCCCC" w:sz="1"/>
-              <w:right w:val="single" w:color="CCCCCC" w:sz="1"/>
-            </w:tcBorders>
-            <w:shd w:fill="FFFFFF" w:val="clear"/>
-            <w:tcMar>
-              <w:top w:type="dxa" w:w="80"/>
-              <w:left w:type="dxa" w:w="120"/>
-              <w:bottom w:type="dxa" w:w="80"/>
-              <w:right w:type="dxa" w:w="120"/>
-            </w:tcMar>
-          </w:tcPr>
-          <w:p>
-            <w:r>
-              <w:rPr>
-                <w:b w:val="false"/>
-                <w:bCs w:val="false"/>
-                <w:sz w:val="18"/>
-                <w:szCs w:val="18"/>
-              </w:rPr>
-              <w:t xml:space="preserve">LENS-008</w:t>
-            </w:r>
-          </w:p>
-        </w:tc>
-      </w:tr>
-      <w:tr>
-        <w:trPr>
-          <w:tblHeader w:val="false"/>
-        </w:trPr>
-        <w:tc>
-          <w:tcPr>
-            <w:tcW w:type="dxa" w:w="1440"/>
-            <w:tcBorders>
-              <w:top w:val="single" w:color="CCCCCC" w:sz="1"/>
-              <w:left w:val="single" w:color="CCCCCC" w:sz="1"/>
-              <w:bottom w:val="single" w:color="CCCCCC" w:sz="1"/>
-              <w:right w:val="single" w:color="CCCCCC" w:sz="1"/>
-            </w:tcBorders>
-            <w:shd w:fill="FFFFFF" w:val="clear"/>
-            <w:tcMar>
-              <w:top w:type="dxa" w:w="80"/>
-              <w:left w:type="dxa" w:w="120"/>
-              <w:bottom w:type="dxa" w:w="80"/>
-              <w:right w:type="dxa" w:w="120"/>
-            </w:tcMar>
-          </w:tcPr>
-          <w:p>
-            <w:r>
-              <w:rPr>
-                <w:b w:val="false"/>
-                <w:bCs w:val="false"/>
-                <w:sz w:val="18"/>
-                <w:szCs w:val="18"/>
-              </w:rPr>
-              <w:t xml:space="preserve">LR-063(A)</w:t>
-            </w:r>
-          </w:p>
-        </w:tc>
-        <w:tc>
-          <w:tcPr>
-            <w:tcW w:type="dxa" w:w="5760"/>
-            <w:tcBorders>
-              <w:top w:val="single" w:color="CCCCCC" w:sz="1"/>
-              <w:left w:val="single" w:color="CCCCCC" w:sz="1"/>
-              <w:bottom w:val="single" w:color="CCCCCC" w:sz="1"/>
-              <w:right w:val="single" w:color="CCCCCC" w:sz="1"/>
-            </w:tcBorders>
-            <w:shd w:fill="FFFFFF" w:val="clear"/>
-            <w:tcMar>
-              <w:top w:type="dxa" w:w="80"/>
-              <w:left w:type="dxa" w:w="120"/>
-              <w:bottom w:type="dxa" w:w="80"/>
-              <w:right w:type="dxa" w:w="120"/>
-            </w:tcMar>
-          </w:tcPr>
-          <w:p>
-            <w:r>
-              <w:rPr>
-                <w:b w:val="false"/>
-                <w:bCs w:val="false"/>
-                <w:sz w:val="18"/>
-                <w:szCs w:val="18"/>
-              </w:rPr>
-              <w:t xml:space="preserve">The "where the problem appears" is not the same as "where the fix belongs." System 1 defects are intentional. System 2 applies the corrections. Never conflate.</w:t>
-            </w:r>
-          </w:p>
-        </w:tc>
-        <w:tc>
-          <w:tcPr>
-            <w:tcW w:type="dxa" w:w="2160"/>
-            <w:tcBorders>
-              <w:top w:val="single" w:color="CCCCCC" w:sz="1"/>
-              <w:left w:val="single" w:color="CCCCCC" w:sz="1"/>
-              <w:bottom w:val="single" w:color="CCCCCC" w:sz="1"/>
-              <w:right w:val="single" w:color="CCCCCC" w:sz="1"/>
-            </w:tcBorders>
-            <w:shd w:fill="FFFFFF" w:val="clear"/>
-            <w:tcMar>
-              <w:top w:type="dxa" w:w="80"/>
-              <w:left w:type="dxa" w:w="120"/>
-              <w:bottom w:type="dxa" w:w="80"/>
-              <w:right w:type="dxa" w:w="120"/>
-            </w:tcMar>
-          </w:tcPr>
-          <w:p>
-            <w:r>
-              <w:rPr>
-                <w:b w:val="false"/>
-                <w:bCs w:val="false"/>
-                <w:sz w:val="18"/>
-                <w:szCs w:val="18"/>
-              </w:rPr>
-              <w:t xml:space="preserve">LENS-010</w:t>
-            </w:r>
-          </w:p>
-        </w:tc>
-      </w:tr>
-    </w:tbl>
-    <w:p>
-      <w:r>
-        <w:t xml:space="preserve"/>
-      </w:r>
-    </w:p>
-    <w:p>
-      <w:pPr>
         <w:pBdr>
           <w:bottom w:val="single" w:color="2E75B6" w:sz="4" w:space="1"/>
         </w:pBdr>
@@ -7061,19 +7042,7 @@
           <w:sz w:val="20"/>
           <w:szCs w:val="20"/>
         </w:rPr>
-        <w:t xml:space="preserve">End of Rules Registry  |  63 rules total  |  Updated: LENS-010</w:t>
-      </w:r>
-    </w:p>
-    <w:p>
-      <w:r>
-        <w:rPr>
-          <w:b/>
-          <w:bCs/>
-          <w:color w:val="8B0000"/>
-          <w:sz w:val="20"/>
-          <w:szCs w:val="20"/>
-        </w:rPr>
-        <w:t xml:space="preserve">LR-058 through LR-063: Three-System Architecture Rules — permanent, non-overridable.</w:t>
+        <w:t xml:space="preserve">End of Rules Registry  |  64 rules total  |  Updated: LENS-010</w:t>
       </w:r>
     </w:p>
     <w:sectPr>
@@ -7256,18 +7225,6 @@
       <w:start w:val="1"/>
       <w:numFmt w:val="bullet"/>
       <w:lvlText w:val="•"/>
-      <w:lvlJc w:val="left"/>
-      <w:pPr>
-        <w:ind w:left="720" w:hanging="360"/>
-      </w:pPr>
-    </w:lvl>
-  </w:abstractNum>
-  <w:abstractNum w:abstractNumId="3" w15:restartNumberingAfterBreak="0">
-    <w:multiLevelType w:val="hybridMultilevel"/>
-    <w:lvl w:ilvl="0" w15:tentative="1">
-      <w:start w:val="1"/>
-      <w:numFmt w:val="decimal"/>
-      <w:lvlText w:val="%1."/>
       <w:lvlJc w:val="left"/>
       <w:pPr>
         <w:ind w:left="720" w:hanging="360"/>

</xml_diff>

<commit_message>
rules: LR-066(P) — every flight must have enough pre-flight LENS-010
</commit_message>
<xml_diff>
--- a/lens-DOC-002_rules.docx
+++ b/lens-DOC-002_rules.docx
@@ -7,7 +7,7 @@
         <w:pStyle w:val="Heading1"/>
       </w:pPr>
       <w:r>
-        <w:t xml:space="preserve">Project Lens — Rules Registry</w:t>
+        <w:t xml:space="preserve">Project Lens — LR-066(P): Pre-flight Rule</w:t>
       </w:r>
     </w:p>
     <w:p>
@@ -19,7 +19,30 @@
           <w:sz w:val="20"/>
           <w:szCs w:val="20"/>
         </w:rPr>
-        <w:t xml:space="preserve">Document: lens-DOC-002_rules  |  Updated: LENS-010  |  Total Rules: 65</w:t>
+        <w:t xml:space="preserve">Document: lens-DOC-002_rules  |  Updated: LENS-010  |  Rule: LR-066(P)</w:t>
+      </w:r>
+    </w:p>
+    <w:p>
+      <w:pPr>
+        <w:pBdr>
+          <w:bottom w:val="single" w:color="2E75B6" w:sz="4" w:space="1"/>
+        </w:pBdr>
+      </w:pPr>
+      <w:r>
+        <w:t xml:space="preserve"/>
+      </w:r>
+    </w:p>
+    <w:p>
+      <w:r>
+        <w:t xml:space="preserve"/>
+      </w:r>
+    </w:p>
+    <w:p>
+      <w:pPr>
+        <w:pStyle w:val="Heading2"/>
+      </w:pPr>
+      <w:r>
+        <w:t xml:space="preserve">LR-066(P): Every Flight Must Have Enough Pre-flight</w:t>
       </w:r>
     </w:p>
     <w:p>
@@ -31,30 +54,63 @@
           <w:sz w:val="20"/>
           <w:szCs w:val="20"/>
         </w:rPr>
-        <w:t xml:space="preserve">LENS-010 additions: LR-058 to LR-065</w:t>
-      </w:r>
-    </w:p>
-    <w:p>
-      <w:pPr>
-        <w:pBdr>
-          <w:bottom w:val="single" w:color="2E75B6" w:sz="4" w:space="1"/>
-        </w:pBdr>
-      </w:pPr>
-      <w:r>
-        <w:t xml:space="preserve"/>
-      </w:r>
-    </w:p>
-    <w:p>
-      <w:r>
-        <w:t xml:space="preserve"/>
-      </w:r>
-    </w:p>
-    <w:p>
-      <w:pPr>
-        <w:pStyle w:val="Heading2"/>
-      </w:pPr>
-      <w:r>
-        <w:t xml:space="preserve">NEW — LR-065(S): API Key Verification + Account Isolation</w:t>
+        <w:t xml:space="preserve">Added: LENS-010 | Type: Process</w:t>
+      </w:r>
+    </w:p>
+    <w:p>
+      <w:r>
+        <w:t xml:space="preserve"/>
+      </w:r>
+    </w:p>
+    <w:p>
+      <w:r>
+        <w:rPr>
+          <w:b/>
+          <w:bCs/>
+          <w:color w:val="2E75B6"/>
+          <w:sz w:val="20"/>
+          <w:szCs w:val="20"/>
+        </w:rPr>
+        <w:t xml:space="preserve">Origin: "Every flight must have enough pre-flight." — Bro Alpha, Apr 15 2026</w:t>
+      </w:r>
+    </w:p>
+    <w:p>
+      <w:r>
+        <w:t xml:space="preserve"/>
+      </w:r>
+    </w:p>
+    <w:p>
+      <w:r>
+        <w:rPr>
+          <w:b/>
+          <w:bCs/>
+          <w:color w:val="1F3864"/>
+          <w:sz w:val="20"/>
+          <w:szCs w:val="20"/>
+        </w:rPr>
+        <w:t xml:space="preserve">THE RULE:</w:t>
+      </w:r>
+    </w:p>
+    <w:p>
+      <w:r>
+        <w:t xml:space="preserve"/>
+      </w:r>
+    </w:p>
+    <w:p>
+      <w:r>
+        <w:rPr>
+          <w:b w:val="false"/>
+          <w:bCs w:val="false"/>
+          <w:color w:val="444444"/>
+          <w:sz w:val="20"/>
+          <w:szCs w:val="20"/>
+        </w:rPr>
+        <w:t xml:space="preserve">Every system that makes API calls must perform a quota pre-flight check before running. If remaining quota is less than estimated need — skip this cycle cleanly, log the reason, and exit(0). Never start a run that is predictably going to fail. Never burn retry delays on a predictably empty budget.</w:t>
+      </w:r>
+    </w:p>
+    <w:p>
+      <w:r>
+        <w:t xml:space="preserve"/>
       </w:r>
     </w:p>
     <w:p>
@@ -66,75 +122,7 @@
           <w:sz w:val="20"/>
           <w:szCs w:val="20"/>
         </w:rPr>
-        <w:t xml:space="preserve">Added: LENS-010 | Type: (S)ecurity</w:t>
-      </w:r>
-    </w:p>
-    <w:p>
-      <w:r>
-        <w:t xml:space="preserve"/>
-      </w:r>
-    </w:p>
-    <w:p>
-      <w:r>
-        <w:rPr>
-          <w:b/>
-          <w:bCs/>
-          <w:color w:val="1F3864"/>
-          <w:sz w:val="20"/>
-          <w:szCs w:val="20"/>
-        </w:rPr>
-        <w:t xml:space="preserve">THE RULE — Two parts:</w:t>
-      </w:r>
-    </w:p>
-    <w:p>
-      <w:r>
-        <w:t xml:space="preserve"/>
-      </w:r>
-    </w:p>
-    <w:p>
-      <w:r>
-        <w:rPr>
-          <w:b w:val="false"/>
-          <w:bCs w:val="false"/>
-          <w:color w:val="444444"/>
-          <w:sz w:val="20"/>
-          <w:szCs w:val="20"/>
-        </w:rPr>
-        <w:t xml:space="preserve">Part 1 — Key Display Limit: When showing or logging any API key for verification, show FIRST 9 CHARACTERS ONLY. No more. Format: key[:9]. Example: gsk_J2O3X. This applies to all providers.</w:t>
-      </w:r>
-    </w:p>
-    <w:p>
-      <w:r>
-        <w:t xml:space="preserve"/>
-      </w:r>
-    </w:p>
-    <w:p>
-      <w:r>
-        <w:rPr>
-          <w:b w:val="false"/>
-          <w:bCs w:val="false"/>
-          <w:color w:val="444444"/>
-          <w:sz w:val="20"/>
-          <w:szCs w:val="20"/>
-        </w:rPr>
-        <w:t xml:space="preserve">Part 2 — Account Isolation: Each system must use API keys from COMPLETELY SEPARATE PROVIDER ACCOUNTS — not just separate keys from the same account.</w:t>
-      </w:r>
-    </w:p>
-    <w:p>
-      <w:r>
-        <w:t xml:space="preserve"/>
-      </w:r>
-    </w:p>
-    <w:p>
-      <w:r>
-        <w:rPr>
-          <w:b/>
-          <w:bCs/>
-          <w:color w:val="8B0000"/>
-          <w:sz w:val="20"/>
-          <w:szCs w:val="20"/>
-        </w:rPr>
-        <w:t xml:space="preserve">WHY ACCOUNT ISOLATION IS REQUIRED:</w:t>
+        <w:t xml:space="preserve">WHY THIS EXISTS:</w:t>
       </w:r>
     </w:p>
     <w:p>
@@ -146,7 +134,7 @@
         </w:numPr>
       </w:pPr>
       <w:r>
-        <w:t xml:space="preserve">Multiple keys from the same Groq account share the same daily token pool (TPD: 100K/day)</w:t>
+        <w:t xml:space="preserve">Run #18 (Apr 15 2026): System 1 ran perfectly. 4/4 lenses. Quality 8.7/7.0/8.7/8.1.</w:t>
       </w:r>
     </w:p>
     <w:p>
@@ -158,7 +146,7 @@
         </w:numPr>
       </w:pPr>
       <w:r>
-        <w:t xml:space="preserve">System 1 burns ~96K tokens per day on production runs</w:t>
+        <w:t xml:space="preserve">System 1 burned 96,378 of 100,000 daily tokens.</w:t>
       </w:r>
     </w:p>
     <w:p>
@@ -170,7 +158,7 @@
         </w:numPr>
       </w:pPr>
       <w:r>
-        <w:t xml:space="preserve">If GROQ_S2_API_KEY is from the same account as GROQ_API_KEY — S2-A gets 4K tokens left</w:t>
+        <w:t xml:space="preserve">System 2 started with 3,622 tokens remaining — not enough for one S2-A call.</w:t>
       </w:r>
     </w:p>
     <w:p>
@@ -182,7 +170,7 @@
         </w:numPr>
       </w:pPr>
       <w:r>
-        <w:t xml:space="preserve">S2-A fails with 429 TPD error every production run — not a rate limit, a starvation</w:t>
+        <w:t xml:space="preserve">S2-A failed with 429 TPD. Retry logic fired twice. 40+ seconds wasted on a doomed run.</w:t>
       </w:r>
     </w:p>
     <w:p>
@@ -194,7 +182,7 @@
         </w:numPr>
       </w:pPr>
       <w:r>
-        <w:t xml:space="preserve">Error evidence: same org_ID appears in 429 message across different keys = same account</w:t>
+        <w:t xml:space="preserve">Root cause: no pre-flight check on System 2 or System 3 quota before flying.</w:t>
       </w:r>
     </w:p>
     <w:p>
@@ -211,7 +199,7 @@
           <w:sz w:val="20"/>
           <w:szCs w:val="20"/>
         </w:rPr>
-        <w:t xml:space="preserve">VERIFICATION METHOD:</w:t>
+        <w:t xml:space="preserve">WHAT PRE-FLIGHT MUST CHECK:</w:t>
       </w:r>
     </w:p>
     <w:tbl>
@@ -237,7 +225,7 @@
         </w:trPr>
         <w:tc>
           <w:tcPr>
-            <w:tcW w:type="dxa" w:w="NaNck"/>
+            <w:tcW w:type="dxa" w:w="NaNed"/>
             <w:tcBorders>
               <w:top w:val="single" w:color="CCCCCC" w:sz="1"/>
               <w:left w:val="single" w:color="CCCCCC" w:sz="1"/>
@@ -260,7 +248,7 @@
                 <w:sz w:val="18"/>
                 <w:szCs w:val="18"/>
               </w:rPr>
-              <w:t xml:space="preserve">Provider</w:t>
+              <w:t xml:space="preserve">System</w:t>
             </w:r>
           </w:p>
         </w:tc>
@@ -296,18 +284,18 @@
       </w:tr>
       <w:tr>
         <w:trPr>
-          <w:tblHeader w:val="3120,3120,3120"/>
+          <w:tblHeader w:val="false"/>
         </w:trPr>
         <w:tc>
           <w:tcPr>
-            <w:tcW w:type="dxa" w:w="NaNX)"/>
+            <w:tcW w:type="dxa" w:w="NaNpy"/>
             <w:tcBorders>
               <w:top w:val="single" w:color="CCCCCC" w:sz="1"/>
               <w:left w:val="single" w:color="CCCCCC" w:sz="1"/>
               <w:bottom w:val="single" w:color="CCCCCC" w:sz="1"/>
               <w:right w:val="single" w:color="CCCCCC" w:sz="1"/>
             </w:tcBorders>
-            <w:shd w:fill="D5E8F0" w:val="clear"/>
+            <w:shd w:fill="FFFFFF" w:val="clear"/>
             <w:tcMar>
               <w:top w:type="dxa" w:w="80"/>
               <w:left w:type="dxa" w:w="120"/>
@@ -318,30 +306,25 @@
           <w:p>
             <w:r>
               <w:rPr>
-                <w:b w:val="3120,3120,3120"/>
-                <w:bCs w:val="3120,3120,3120"/>
+                <w:b w:val="false"/>
+                <w:bCs w:val="false"/>
                 <w:sz w:val="18"/>
                 <w:szCs w:val="18"/>
               </w:rPr>
-              <w:t xml:space="preserve">Groq</w:t>
+              <w:t xml:space="preserve">System 1</w:t>
             </w:r>
           </w:p>
         </w:tc>
-      </w:tr>
-      <w:tr>
-        <w:trPr>
-          <w:tblHeader w:val="3120,3120,3120"/>
-        </w:trPr>
         <w:tc>
           <w:tcPr>
-            <w:tcW w:type="dxa" w:w="NaNes"/>
+            <w:tcW w:type="dxa" w:w="3120"/>
             <w:tcBorders>
               <w:top w:val="single" w:color="CCCCCC" w:sz="1"/>
               <w:left w:val="single" w:color="CCCCCC" w:sz="1"/>
               <w:bottom w:val="single" w:color="CCCCCC" w:sz="1"/>
               <w:right w:val="single" w:color="CCCCCC" w:sz="1"/>
             </w:tcBorders>
-            <w:shd w:fill="D5E8F0" w:val="clear"/>
+            <w:shd w:fill="FFFFFF" w:val="clear"/>
             <w:tcMar>
               <w:top w:type="dxa" w:w="80"/>
               <w:left w:type="dxa" w:w="120"/>
@@ -352,30 +335,30 @@
           <w:p>
             <w:r>
               <w:rPr>
-                <w:b w:val="3120,3120,3120"/>
-                <w:bCs w:val="3120,3120,3120"/>
+                <w:b w:val="false"/>
+                <w:bCs w:val="false"/>
                 <w:sz w:val="18"/>
                 <w:szCs w:val="18"/>
               </w:rPr>
-              <w:t xml:space="preserve">Groq (definitive)</w:t>
+              <w:t xml:space="default"/>
             </w:r>
           </w:p>
         </w:tc>
       </w:tr>
       <w:tr>
         <w:trPr>
-          <w:tblHeader w:val="3120,3120,3120"/>
+          <w:tblHeader w:val="false"/>
         </w:trPr>
         <w:tc>
           <w:tcPr>
-            <w:tcW w:type="dxa" w:w="NaNta"/>
+            <w:tcW w:type="dxa" w:w="NaN 1"/>
             <w:tcBorders>
               <w:top w:val="single" w:color="CCCCCC" w:sz="1"/>
               <w:left w:val="single" w:color="CCCCCC" w:sz="1"/>
               <w:bottom w:val="single" w:color="CCCCCC" w:sz="1"/>
               <w:right w:val="single" w:color="CCCCCC" w:sz="1"/>
             </w:tcBorders>
-            <w:shd w:fill="D5E8F0" w:val="clear"/>
+            <w:shd w:fill="FFFFFF" w:val="clear"/>
             <w:tcMar>
               <w:top w:type="dxa" w:w="80"/>
               <w:left w:type="dxa" w:w="120"/>
@@ -386,30 +369,25 @@
           <w:p>
             <w:r>
               <w:rPr>
-                <w:b w:val="3120,3120,3120"/>
-                <w:bCs w:val="3120,3120,3120"/>
+                <w:b w:val="false"/>
+                <w:bCs w:val="false"/>
                 <w:sz w:val="18"/>
                 <w:szCs w:val="18"/>
               </w:rPr>
-              <w:t xml:space="preserve">Gemini</w:t>
+              <w:t xml:space="preserve">System 2</w:t>
             </w:r>
           </w:p>
         </w:tc>
-      </w:tr>
-      <w:tr>
-        <w:trPr>
-          <w:tblHeader w:val="3120,3120,3120"/>
-        </w:trPr>
         <w:tc>
           <w:tcPr>
-            <w:tcW w:type="dxa" w:w="NaNta"/>
+            <w:tcW w:type="dxa" w:w="3120"/>
             <w:tcBorders>
               <w:top w:val="single" w:color="CCCCCC" w:sz="1"/>
               <w:left w:val="single" w:color="CCCCCC" w:sz="1"/>
               <w:bottom w:val="single" w:color="CCCCCC" w:sz="1"/>
               <w:right w:val="single" w:color="CCCCCC" w:sz="1"/>
             </w:tcBorders>
-            <w:shd w:fill="D5E8F0" w:val="clear"/>
+            <w:shd w:fill="FFFFFF" w:val="clear"/>
             <w:tcMar>
               <w:top w:type="dxa" w:w="80"/>
               <w:left w:type="dxa" w:w="120"/>
@@ -420,30 +398,30 @@
           <w:p>
             <w:r>
               <w:rPr>
-                <w:b w:val="3120,3120,3120"/>
-                <w:bCs w:val="3120,3120,3120"/>
+                <w:b w:val="false"/>
+                <w:bCs w:val="false"/>
                 <w:sz w:val="18"/>
                 <w:szCs w:val="18"/>
               </w:rPr>
-              <w:t xml:space="preserve">Cerebras</w:t>
+              <w:t xml:space="default"/>
             </w:r>
           </w:p>
         </w:tc>
       </w:tr>
       <w:tr>
         <w:trPr>
-          <w:tblHeader w:val="3120,3120,3120"/>
+          <w:tblHeader w:val="false"/>
         </w:trPr>
         <w:tc>
           <w:tcPr>
-            <w:tcW w:type="dxa" w:w="NaNta"/>
+            <w:tcW w:type="dxa" w:w="NaN 1"/>
             <w:tcBorders>
               <w:top w:val="single" w:color="CCCCCC" w:sz="1"/>
               <w:left w:val="single" w:color="CCCCCC" w:sz="1"/>
               <w:bottom w:val="single" w:color="CCCCCC" w:sz="1"/>
               <w:right w:val="single" w:color="CCCCCC" w:sz="1"/>
             </w:tcBorders>
-            <w:shd w:fill="D5E8F0" w:val="clear"/>
+            <w:shd w:fill="FFFFFF" w:val="clear"/>
             <w:tcMar>
               <w:top w:type="dxa" w:w="80"/>
               <w:left w:type="dxa" w:w="120"/>
@@ -454,65 +432,25 @@
           <w:p>
             <w:r>
               <w:rPr>
-                <w:b w:val="3120,3120,3120"/>
-                <w:bCs w:val="3120,3120,3120"/>
+                <w:b w:val="false"/>
+                <w:bCs w:val="false"/>
                 <w:sz w:val="18"/>
                 <w:szCs w:val="18"/>
               </w:rPr>
-              <w:t xml:space="preserve">Mistral</w:t>
+              <w:t xml:space="preserve">System 3</w:t>
             </w:r>
           </w:p>
         </w:tc>
-      </w:tr>
-    </w:tbl>
-    <w:p>
-      <w:r>
-        <w:t xml:space="preserve"/>
-      </w:r>
-    </w:p>
-    <w:p>
-      <w:r>
-        <w:rPr>
-          <w:b/>
-          <w:bCs/>
-          <w:color w:val="1F3864"/>
-          <w:sz w:val="20"/>
-          <w:szCs w:val="20"/>
-        </w:rPr>
-        <w:t xml:space="preserve">REQUIRED ACCOUNT STRUCTURE:</w:t>
-      </w:r>
-    </w:p>
-    <w:tbl>
-      <w:tblPr>
-        <w:tblW w:type="dxa" w:w="9360"/>
-        <w:tblBorders>
-          <w:top w:val="single" w:color="auto" w:sz="4"/>
-          <w:left w:val="single" w:color="auto" w:sz="4"/>
-          <w:bottom w:val="single" w:color="auto" w:sz="4"/>
-          <w:right w:val="single" w:color="auto" w:sz="4"/>
-          <w:insideH w:val="single" w:color="auto" w:sz="4"/>
-          <w:insideV w:val="single" w:color="auto" w:sz="4"/>
-        </w:tblBorders>
-      </w:tblPr>
-      <w:tblGrid>
-        <w:gridCol w:w="2340"/>
-        <w:gridCol w:w="2340"/>
-        <w:gridCol w:w="4680"/>
-      </w:tblGrid>
-      <w:tr>
-        <w:trPr>
-          <w:tblHeader/>
-        </w:trPr>
         <w:tc>
           <w:tcPr>
-            <w:tcW w:type="dxa" w:w="NaNem"/>
+            <w:tcW w:type="dxa" w:w="3120"/>
             <w:tcBorders>
               <w:top w:val="single" w:color="CCCCCC" w:sz="1"/>
               <w:left w:val="single" w:color="CCCCCC" w:sz="1"/>
               <w:bottom w:val="single" w:color="CCCCCC" w:sz="1"/>
               <w:right w:val="single" w:color="CCCCCC" w:sz="1"/>
             </w:tcBorders>
-            <w:shd w:fill="D5E8F0" w:val="clear"/>
+            <w:shd w:fill="FFFFFF" w:val="clear"/>
             <w:tcMar>
               <w:top w:type="dxa" w:w="80"/>
               <w:left w:type="dxa" w:w="120"/>
@@ -523,37 +461,8 @@
           <w:p>
             <w:r>
               <w:rPr>
-                <w:b/>
-                <w:bCs/>
-                <w:sz w:val="18"/>
-                <w:szCs w:val="18"/>
-              </w:rPr>
-              <w:t xml:space="preserve">Key</w:t>
-            </w:r>
-          </w:p>
-        </w:tc>
-        <w:tc>
-          <w:tcPr>
-            <w:tcW w:type="dxa" w:w="2340"/>
-            <w:tcBorders>
-              <w:top w:val="single" w:color="CCCCCC" w:sz="1"/>
-              <w:left w:val="single" w:color="CCCCCC" w:sz="1"/>
-              <w:bottom w:val="single" w:color="CCCCCC" w:sz="1"/>
-              <w:right w:val="single" w:color="CCCCCC" w:sz="1"/>
-            </w:tcBorders>
-            <w:shd w:fill="D5E8F0" w:val="clear"/>
-            <w:tcMar>
-              <w:top w:type="dxa" w:w="80"/>
-              <w:left w:type="dxa" w:w="120"/>
-              <w:bottom w:type="dxa" w:w="80"/>
-              <w:right w:type="dxa" w:w="120"/>
-            </w:tcMar>
-          </w:tcPr>
-          <w:p>
-            <w:r>
-              <w:rPr>
-                <w:b/>
-                <w:bCs/>
+                <w:b w:val="false"/>
+                <w:bCs w:val="false"/>
                 <w:sz w:val="18"/>
                 <w:szCs w:val="18"/>
               </w:rPr>
@@ -562,176 +471,6 @@
           </w:p>
         </w:tc>
       </w:tr>
-      <w:tr>
-        <w:trPr>
-          <w:tblHeader w:val="2340,2340,4680"/>
-        </w:trPr>
-        <w:tc>
-          <w:tcPr>
-            <w:tcW w:type="dxa" w:w="NaNr)"/>
-            <w:tcBorders>
-              <w:top w:val="single" w:color="CCCCCC" w:sz="1"/>
-              <w:left w:val="single" w:color="CCCCCC" w:sz="1"/>
-              <w:bottom w:val="single" w:color="CCCCCC" w:sz="1"/>
-              <w:right w:val="single" w:color="CCCCCC" w:sz="1"/>
-            </w:tcBorders>
-            <w:shd w:fill="D5E8F0" w:val="clear"/>
-            <w:tcMar>
-              <w:top w:type="dxa" w:w="80"/>
-              <w:left w:type="dxa" w:w="120"/>
-              <w:bottom w:type="dxa" w:w="80"/>
-              <w:right w:type="dxa" w:w="120"/>
-            </w:tcMar>
-          </w:tcPr>
-          <w:p>
-            <w:r>
-              <w:rPr>
-                <w:b w:val="2340,2340,4680"/>
-                <w:bCs w:val="2340,2340,4680"/>
-                <w:sz w:val="18"/>
-                <w:szCs w:val="18"/>
-              </w:rPr>
-              <w:t xml:space="preserve">GROQ_API_KEY</w:t>
-            </w:r>
-          </w:p>
-        </w:tc>
-      </w:tr>
-      <w:tr>
-        <w:trPr>
-          <w:tblHeader w:val="2340,2340,4680"/>
-        </w:trPr>
-        <w:tc>
-          <w:tcPr>
-            <w:tcW w:type="dxa" w:w="NaND)"/>
-            <w:tcBorders>
-              <w:top w:val="single" w:color="CCCCCC" w:sz="1"/>
-              <w:left w:val="single" w:color="CCCCCC" w:sz="1"/>
-              <w:bottom w:val="single" w:color="CCCCCC" w:sz="1"/>
-              <w:right w:val="single" w:color="CCCCCC" w:sz="1"/>
-            </w:tcBorders>
-            <w:shd w:fill="D5E8F0" w:val="clear"/>
-            <w:tcMar>
-              <w:top w:type="dxa" w:w="80"/>
-              <w:left w:type="dxa" w:w="120"/>
-              <w:bottom w:type="dxa" w:w="80"/>
-              <w:right w:type="dxa" w:w="120"/>
-            </w:tcMar>
-          </w:tcPr>
-          <w:p>
-            <w:r>
-              <w:rPr>
-                <w:b w:val="2340,2340,4680"/>
-                <w:bCs w:val="2340,2340,4680"/>
-                <w:sz w:val="18"/>
-                <w:szCs w:val="18"/>
-              </w:rPr>
-              <w:t xml:space="preserve">GROQ_S2_API_KEY</w:t>
-            </w:r>
-          </w:p>
-        </w:tc>
-      </w:tr>
-      <w:tr>
-        <w:trPr>
-          <w:tblHeader w:val="2340,2340,4680"/>
-        </w:trPr>
-        <w:tc>
-          <w:tcPr>
-            <w:tcW w:type="dxa" w:w="NaNE)"/>
-            <w:tcBorders>
-              <w:top w:val="single" w:color="CCCCCC" w:sz="1"/>
-              <w:left w:val="single" w:color="CCCCCC" w:sz="1"/>
-              <w:bottom w:val="single" w:color="CCCCCC" w:sz="1"/>
-              <w:right w:val="single" w:color="CCCCCC" w:sz="1"/>
-            </w:tcBorders>
-            <w:shd w:fill="D5E8F0" w:val="clear"/>
-            <w:tcMar>
-              <w:top w:type="dxa" w:w="80"/>
-              <w:left w:type="dxa" w:w="120"/>
-              <w:bottom w:type="dxa" w:w="80"/>
-              <w:right w:type="dxa" w:w="120"/>
-            </w:tcMar>
-          </w:tcPr>
-          <w:p>
-            <w:r>
-              <w:rPr>
-                <w:b w:val="2340,2340,4680"/>
-                <w:bCs w:val="2340,2340,4680"/>
-                <w:sz w:val="18"/>
-                <w:szCs w:val="18"/>
-              </w:rPr>
-              <w:t xml:space="preserve">GROQ_S2E_API_KEY</w:t>
-            </w:r>
-          </w:p>
-        </w:tc>
-      </w:tr>
-      <w:tr>
-        <w:trPr>
-          <w:tblHeader w:val="2340,2340,4680"/>
-        </w:trPr>
-        <w:tc>
-          <w:tcPr>
-            <w:tcW w:type="dxa" w:w="NaNst"/>
-            <w:tcBorders>
-              <w:top w:val="single" w:color="CCCCCC" w:sz="1"/>
-              <w:left w:val="single" w:color="CCCCCC" w:sz="1"/>
-              <w:bottom w:val="single" w:color="CCCCCC" w:sz="1"/>
-              <w:right w:val="single" w:color="CCCCCC" w:sz="1"/>
-            </w:tcBorders>
-            <w:shd w:fill="D5E8F0" w:val="clear"/>
-            <w:tcMar>
-              <w:top w:type="dxa" w:w="80"/>
-              <w:left w:type="dxa" w:w="120"/>
-              <w:bottom w:type="dxa" w:w="80"/>
-              <w:right w:type="dxa" w:w="120"/>
-            </w:tcMar>
-          </w:tcPr>
-          <w:p>
-            <w:r>
-              <w:rPr>
-                <w:b w:val="2340,2340,4680"/>
-                <w:bCs w:val="2340,2340,4680"/>
-                <w:sz w:val="18"/>
-                <w:szCs w:val="18"/>
-              </w:rPr>
-              <w:t xml:space="preserve">GROQ_MANAGER_API_KEY</w:t>
-            </w:r>
-          </w:p>
-        </w:tc>
-      </w:tr>
-      <w:tr>
-        <w:trPr>
-          <w:tblHeader w:val="2340,2340,4680"/>
-        </w:trPr>
-        <w:tc>
-          <w:tcPr>
-            <w:tcW w:type="dxa" w:w="NaNA)"/>
-            <w:tcBorders>
-              <w:top w:val="single" w:color="CCCCCC" w:sz="1"/>
-              <w:left w:val="single" w:color="CCCCCC" w:sz="1"/>
-              <w:bottom w:val="single" w:color="CCCCCC" w:sz="1"/>
-              <w:right w:val="single" w:color="CCCCCC" w:sz="1"/>
-            </w:tcBorders>
-            <w:shd w:fill="D5E8F0" w:val="clear"/>
-            <w:tcMar>
-              <w:top w:type="dxa" w:w="80"/>
-              <w:left w:type="dxa" w:w="120"/>
-              <w:bottom w:type="dxa" w:w="80"/>
-              <w:right w:type="dxa" w:w="120"/>
-            </w:tcMar>
-          </w:tcPr>
-          <w:p>
-            <w:r>
-              <w:rPr>
-                <w:b w:val="2340,2340,4680"/>
-                <w:bCs w:val="2340,2340,4680"/>
-                <w:sz w:val="18"/>
-                <w:szCs w:val="18"/>
-              </w:rPr>
-              <w:t xml:space="preserve">GROQ_S3_API_KEY</w:t>
-            </w:r>
-          </w:p>
-        </w:tc>
-      </w:tr>
     </w:tbl>
     <w:p>
       <w:r>
@@ -743,11 +482,88 @@
         <w:rPr>
           <w:b/>
           <w:bCs/>
-          <w:color w:val="8B0000"/>
-          <w:sz w:val="20"/>
-          <w:szCs w:val="20"/>
-        </w:rPr>
-        <w:t xml:space="preserve">LENS-010 STATUS: GROQ_S2_API_KEY account isolation unconfirmed. Run #18 (Apr 15) showed S2-A failing with same org_ID as System 1 key. Action required before LENS-011: verify all Groq keys are from separate accounts.</w:t>
+          <w:color w:val="1F3864"/>
+          <w:sz w:val="20"/>
+          <w:szCs w:val="20"/>
+        </w:rPr>
+        <w:t xml:space="preserve">HOW TO IMPLEMENT:</w:t>
+      </w:r>
+    </w:p>
+    <w:p>
+      <w:pPr>
+        <w:pStyle w:val="ListParagraph"/>
+        <w:numPr>
+          <w:ilvl w:val="0"/>
+          <w:numId w:val="2"/>
+        </w:numPr>
+      </w:pPr>
+      <w:r>
+        <w:t xml:space="preserve">Make a 1-token test call to the provider API</w:t>
+      </w:r>
+    </w:p>
+    <w:p>
+      <w:pPr>
+        <w:pStyle w:val="ListParagraph"/>
+        <w:numPr>
+          <w:ilvl w:val="0"/>
+          <w:numId w:val="2"/>
+        </w:numPr>
+      </w:pPr>
+      <w:r>
+        <w:t xml:space="preserve">Read x-ratelimit-remaining-tokens header from the response</w:t>
+      </w:r>
+    </w:p>
+    <w:p>
+      <w:pPr>
+        <w:pStyle w:val="ListParagraph"/>
+        <w:numPr>
+          <w:ilvl w:val="0"/>
+          <w:numId w:val="2"/>
+        </w:numPr>
+      </w:pPr>
+      <w:r>
+        <w:t xml:space="preserve">If remaining is less than minimum_needed — log and exit(0) cleanly</w:t>
+      </w:r>
+    </w:p>
+    <w:p>
+      <w:pPr>
+        <w:pStyle w:val="ListParagraph"/>
+        <w:numPr>
+          <w:ilvl w:val="0"/>
+          <w:numId w:val="2"/>
+        </w:numPr>
+      </w:pPr>
+      <w:r>
+        <w:t xml:space="preserve">If remaining is enough — proceed with full run</w:t>
+      </w:r>
+    </w:p>
+    <w:p>
+      <w:r>
+        <w:t xml:space="preserve"/>
+      </w:r>
+    </w:p>
+    <w:p>
+      <w:r>
+        <w:rPr>
+          <w:b/>
+          <w:bCs/>
+          <w:color w:val="1F3864"/>
+          <w:sz w:val="20"/>
+          <w:szCs w:val="20"/>
+        </w:rPr>
+        <w:t xml:space="preserve">CLEAN SKIP vs FAILURE:</w:t>
+      </w:r>
+    </w:p>
+    <w:p>
+      <w:r>
+        <w:rPr>
+          <w:b w:val="false"/>
+          <w:bCs w:val="false"/>
+          <w:color w:val="444444"/>
+          <w:sz w:val="20"/>
+          <w:szCs w:val="20"/>
+        </w:rPr>
+        <w:t xml:space="preserve">A pre-flight skip is NOT a failure. It is the system working correctly. exit(0) not exit(1). GitHub Actions marks it green. Log message: "Pre-flight: insufficient TPD remaining. Skipping this cycle. Next window in X hours."</w:t>
       </w:r>
     </w:p>
     <w:p>
@@ -779,7 +595,19 @@
           <w:sz w:val="20"/>
           <w:szCs w:val="20"/>
         </w:rPr>
-        <w:t xml:space="preserve">End of LR-065(S) | This rule is permanent and non-overridable.</w:t>
+        <w:t xml:space="preserve">LR-066(P) is permanent. Applies to all future systems built on Project Lens.</w:t>
+      </w:r>
+    </w:p>
+    <w:p>
+      <w:r>
+        <w:rPr>
+          <w:b/>
+          <w:bCs/>
+          <w:color w:val="2E75B6"/>
+          <w:sz w:val="20"/>
+          <w:szCs w:val="20"/>
+        </w:rPr>
+        <w:t xml:space="preserve">Origin: "Every flight must have enough pre-flight." — Bro Alpha, Apr 15 2026</w:t>
       </w:r>
     </w:p>
     <w:sectPr>
@@ -961,7 +789,7 @@
     <w:lvl w:ilvl="0" w15:tentative="1">
       <w:start w:val="1"/>
       <w:numFmt w:val="bullet"/>
-      <w:lvlText w:val="•"/>
+      <w:lvlText w:val="bullet"/>
       <w:lvlJc w:val="left"/>
       <w:pPr>
         <w:ind w:left="720" w:hanging="360"/>

</xml_diff>